<commit_message>
Add GitHub Actions workflow
</commit_message>
<xml_diff>
--- a/reports/AI-Driven Retail Demand Forecasting and Smart Inventory Optimization.docx
+++ b/reports/AI-Driven Retail Demand Forecasting and Smart Inventory Optimization.docx
@@ -170,8 +170,8 @@
         <w:jc w:val="center"/>
         <w:rPr>
           <w:rFonts w:ascii="Times New Roman" w:hAnsi="Times New Roman" w:cs="Times New Roman"/>
-          <w:sz w:val="44"/>
-          <w:szCs w:val="44"/>
+          <w:sz w:val="36"/>
+          <w:szCs w:val="36"/>
         </w:rPr>
       </w:pPr>
     </w:p>
@@ -180,8 +180,8 @@
         <w:jc w:val="center"/>
         <w:rPr>
           <w:rFonts w:ascii="Times New Roman" w:hAnsi="Times New Roman" w:cs="Times New Roman"/>
-          <w:sz w:val="44"/>
-          <w:szCs w:val="44"/>
+          <w:sz w:val="36"/>
+          <w:szCs w:val="36"/>
         </w:rPr>
       </w:pPr>
     </w:p>
@@ -190,8 +190,18 @@
         <w:jc w:val="center"/>
         <w:rPr>
           <w:rFonts w:ascii="Times New Roman" w:hAnsi="Times New Roman" w:cs="Times New Roman"/>
-          <w:sz w:val="44"/>
-          <w:szCs w:val="44"/>
+          <w:sz w:val="36"/>
+          <w:szCs w:val="36"/>
+        </w:rPr>
+      </w:pPr>
+    </w:p>
+    <w:p>
+      <w:pPr>
+        <w:jc w:val="center"/>
+        <w:rPr>
+          <w:rFonts w:ascii="Times New Roman" w:hAnsi="Times New Roman" w:cs="Times New Roman"/>
+          <w:sz w:val="36"/>
+          <w:szCs w:val="36"/>
         </w:rPr>
       </w:pPr>
     </w:p>
@@ -221,16 +231,16 @@
         <w:rPr>
           <w:rFonts w:ascii="Times New Roman" w:hAnsi="Times New Roman" w:cs="Times New Roman"/>
           <w:color w:val="auto"/>
-          <w:sz w:val="30"/>
-          <w:szCs w:val="30"/>
+          <w:sz w:val="32"/>
+          <w:szCs w:val="32"/>
         </w:rPr>
       </w:pPr>
       <w:r>
         <w:rPr>
           <w:rFonts w:ascii="Times New Roman" w:hAnsi="Times New Roman" w:cs="Times New Roman"/>
           <w:color w:val="auto"/>
-          <w:sz w:val="30"/>
-          <w:szCs w:val="30"/>
+          <w:sz w:val="32"/>
+          <w:szCs w:val="32"/>
         </w:rPr>
         <w:lastRenderedPageBreak/>
         <w:t>1. Introduction and Aim of the Project</w:t>
@@ -238,66 +248,61 @@
     </w:p>
     <w:p>
       <w:pPr>
-        <w:rPr>
-          <w:rFonts w:ascii="Times New Roman" w:hAnsi="Times New Roman" w:cs="Times New Roman"/>
-          <w:sz w:val="24"/>
-          <w:szCs w:val="24"/>
-        </w:rPr>
-      </w:pPr>
-      <w:r>
-        <w:rPr>
-          <w:rFonts w:ascii="Times New Roman" w:hAnsi="Times New Roman" w:cs="Times New Roman"/>
-          <w:sz w:val="24"/>
-          <w:szCs w:val="24"/>
-        </w:rPr>
-        <w:t>Machine learning models are often developed and evaluated in controlled environments, but real-world business systems continuously evolve due to operational changes, seasonal trends, customer behavior, and external business factors. In retail environments, product demand changes frequently depending on promotions, holidays, weather conditions, and inventory availability. Therefore, machine learning systems must not only generate predictions but also support continuous monitoring, retraining, deployment, and operational reliability.</w:t>
-      </w:r>
-      <w:r>
-        <w:rPr>
-          <w:rFonts w:ascii="Times New Roman" w:hAnsi="Times New Roman" w:cs="Times New Roman"/>
-          <w:sz w:val="24"/>
-          <w:szCs w:val="24"/>
-        </w:rPr>
-        <w:br/>
-      </w:r>
-      <w:r>
-        <w:rPr>
-          <w:rFonts w:ascii="Times New Roman" w:hAnsi="Times New Roman" w:cs="Times New Roman"/>
-          <w:sz w:val="24"/>
-          <w:szCs w:val="24"/>
-        </w:rPr>
-        <w:br/>
-        <w:t>This project follows core MLOps principles, focusing not only on model development but also on deployment, monitoring, reproducibility, and prod</w:t>
-      </w:r>
-      <w:r>
-        <w:rPr>
-          <w:rFonts w:ascii="Times New Roman" w:hAnsi="Times New Roman" w:cs="Times New Roman"/>
-          <w:sz w:val="24"/>
-          <w:szCs w:val="24"/>
-        </w:rPr>
-        <w:t>uction-oriented system design.</w:t>
+        <w:spacing w:before="100" w:beforeAutospacing="1" w:after="100" w:afterAutospacing="1" w:line="240" w:lineRule="auto"/>
+        <w:jc w:val="both"/>
+        <w:rPr>
+          <w:rFonts w:ascii="Times New Roman" w:eastAsia="Times New Roman" w:hAnsi="Times New Roman" w:cs="Times New Roman"/>
+          <w:sz w:val="24"/>
+          <w:szCs w:val="24"/>
+        </w:rPr>
+      </w:pPr>
+      <w:r>
+        <w:rPr>
+          <w:rFonts w:ascii="Times New Roman" w:hAnsi="Times New Roman" w:cs="Times New Roman"/>
+          <w:sz w:val="24"/>
+          <w:szCs w:val="24"/>
+        </w:rPr>
+        <w:t>Retail businesses often face difficulties in managing inventory because customer demand changes frequently due to seasonal trends, promotions, holidays, and customer purchasing behavior. In retail environments, inaccurate demand forecasting can lead to overstocking, higher operational costs, and unnecessary food waste</w:t>
       </w:r>
     </w:p>
     <w:p>
       <w:pPr>
-        <w:rPr>
-          <w:rFonts w:ascii="Times New Roman" w:hAnsi="Times New Roman" w:cs="Times New Roman"/>
-          <w:sz w:val="24"/>
-          <w:szCs w:val="24"/>
-        </w:rPr>
-      </w:pPr>
-      <w:r>
-        <w:rPr>
-          <w:rFonts w:ascii="Times New Roman" w:hAnsi="Times New Roman" w:cs="Times New Roman"/>
-          <w:sz w:val="24"/>
-          <w:szCs w:val="24"/>
-        </w:rPr>
-        <w:t xml:space="preserve">The aim of this project is to design and implement an AI-driven </w:t>
+        <w:spacing w:before="100" w:beforeAutospacing="1" w:after="100" w:afterAutospacing="1" w:line="240" w:lineRule="auto"/>
+        <w:jc w:val="both"/>
+        <w:rPr>
+          <w:rFonts w:ascii="Times New Roman" w:eastAsia="Times New Roman" w:hAnsi="Times New Roman" w:cs="Times New Roman"/>
+          <w:sz w:val="24"/>
+          <w:szCs w:val="24"/>
+        </w:rPr>
+      </w:pPr>
+      <w:r>
+        <w:rPr>
+          <w:rFonts w:ascii="Times New Roman" w:eastAsia="Times New Roman" w:hAnsi="Times New Roman" w:cs="Times New Roman"/>
+          <w:sz w:val="24"/>
+          <w:szCs w:val="24"/>
+        </w:rPr>
+        <w:t xml:space="preserve">This project presents a </w:t>
+      </w:r>
+      <w:r>
+        <w:rPr>
+          <w:rFonts w:ascii="Times New Roman" w:eastAsia="Times New Roman" w:hAnsi="Times New Roman" w:cs="Times New Roman"/>
+          <w:sz w:val="24"/>
+          <w:szCs w:val="24"/>
+        </w:rPr>
+        <w:t>real-world</w:t>
+      </w:r>
+      <w:r>
+        <w:rPr>
+          <w:rFonts w:ascii="Times New Roman" w:eastAsia="Times New Roman" w:hAnsi="Times New Roman" w:cs="Times New Roman"/>
+          <w:sz w:val="24"/>
+          <w:szCs w:val="24"/>
+        </w:rPr>
+        <w:t xml:space="preserve"> </w:t>
       </w:r>
       <w:proofErr w:type="spellStart"/>
       <w:r>
         <w:rPr>
-          <w:rFonts w:ascii="Times New Roman" w:hAnsi="Times New Roman" w:cs="Times New Roman"/>
+          <w:rFonts w:ascii="Times New Roman" w:eastAsia="Times New Roman" w:hAnsi="Times New Roman" w:cs="Times New Roman"/>
           <w:sz w:val="24"/>
           <w:szCs w:val="24"/>
         </w:rPr>
@@ -306,89 +311,251 @@
       <w:proofErr w:type="spellEnd"/>
       <w:r>
         <w:rPr>
-          <w:rFonts w:ascii="Times New Roman" w:hAnsi="Times New Roman" w:cs="Times New Roman"/>
-          <w:sz w:val="24"/>
-          <w:szCs w:val="24"/>
-        </w:rPr>
-        <w:t xml:space="preserve"> system for retail demand forecasting and smart inventory optimization in retail environments.</w:t>
+          <w:rFonts w:ascii="Times New Roman" w:eastAsia="Times New Roman" w:hAnsi="Times New Roman" w:cs="Times New Roman"/>
+          <w:sz w:val="24"/>
+          <w:szCs w:val="24"/>
+        </w:rPr>
+        <w:t xml:space="preserve"> pipeline for retail demand forecasting and smart inventory optimization. The system combines historical Walmart retail sales data with API-based ingestion, preprocessing, feature engineering, machine learning-based forecasting, monitoring, drift detection, retraining, deployment, and dashboard </w:t>
+      </w:r>
+      <w:r>
+        <w:rPr>
+          <w:rFonts w:ascii="Times New Roman" w:eastAsia="Times New Roman" w:hAnsi="Times New Roman" w:cs="Times New Roman"/>
+          <w:sz w:val="24"/>
+          <w:szCs w:val="24"/>
+        </w:rPr>
+        <w:t xml:space="preserve">visualization </w:t>
+      </w:r>
+      <w:r>
+        <w:rPr>
+          <w:rFonts w:ascii="Times New Roman" w:hAnsi="Times New Roman" w:cs="Times New Roman"/>
+          <w:sz w:val="24"/>
+          <w:szCs w:val="24"/>
+        </w:rPr>
+        <w:t>within a single pipeline</w:t>
+      </w:r>
+      <w:r>
+        <w:rPr>
+          <w:rFonts w:ascii="Times New Roman" w:eastAsia="Times New Roman" w:hAnsi="Times New Roman" w:cs="Times New Roman"/>
+          <w:sz w:val="24"/>
+          <w:szCs w:val="24"/>
+        </w:rPr>
+        <w:t>.</w:t>
       </w:r>
     </w:p>
     <w:p>
       <w:pPr>
-        <w:pStyle w:val="NormalWeb"/>
-      </w:pPr>
-      <w:r>
-        <w:t xml:space="preserve">This project also connects inventory optimization with societal well-being. In retail businesses, inaccurate demand forecasting can lead to overstocking, product expiry, and avoidable food waste. By predicting demand more accurately and identifying high waste-risk inventory situations, the system can support better stock planning, reduce unnecessary surplus, and help retailers make more responsible inventory decisions. Although the waste-related variables in this project are simulated for demonstration purposes, the implemented workflow shows how machine learning and </w:t>
-      </w:r>
-      <w:proofErr w:type="spellStart"/>
-      <w:r>
-        <w:t>MLOps</w:t>
-      </w:r>
-      <w:proofErr w:type="spellEnd"/>
-      <w:r>
-        <w:t xml:space="preserve"> practices can be used to support food waste reduction in real retail environments.</w:t>
-      </w:r>
-      <w:r>
-        <w:br/>
-      </w:r>
-      <w:r>
-        <w:br/>
-        <w:t>The project focuses on predicting future product demand using historical retail sales data and identifying situations where excess inventory may increase the risk of food waste. In real retail operations, supermarkets often experience inventory loss due to overstocking, inaccurate demand forecasting, short product shelf life, and changing customer purchasing behavior.</w:t>
-      </w:r>
-      <w:r>
-        <w:br/>
-      </w:r>
-      <w:r>
-        <w:br/>
-        <w:t>To address this problem, the project combines historical Walmart retail sales data with a production-like API-based data pipeline. The system continuously receives sales events through APIs, preprocesses incoming data, performs feature engineering, trains machine learning models, generates demand predictions, calculates waste risk levels, and supports monitoring and retraining.</w:t>
-      </w:r>
-      <w:r>
-        <w:br/>
-      </w:r>
-      <w:r>
-        <w:br/>
-        <w:t xml:space="preserve">Additionally, </w:t>
-      </w:r>
-      <w:r>
-        <w:t>t</w:t>
-      </w:r>
-      <w:r>
-        <w:t>his project was designed as a production-oriented MLOps implementation rather than a notebook-only machine learning experiment. Therefore, the system includes API-based data ingestion, database storage, preprocessing automation, model training, prediction serving, logging, drift detection, retraining, artifact storage, and dashboard visualization.</w:t>
+        <w:spacing w:before="100" w:beforeAutospacing="1" w:after="100" w:afterAutospacing="1" w:line="240" w:lineRule="auto"/>
+        <w:jc w:val="both"/>
+        <w:rPr>
+          <w:rFonts w:ascii="Times New Roman" w:eastAsia="Times New Roman" w:hAnsi="Times New Roman" w:cs="Times New Roman"/>
+          <w:sz w:val="24"/>
+          <w:szCs w:val="24"/>
+        </w:rPr>
+      </w:pPr>
+      <w:r>
+        <w:rPr>
+          <w:rFonts w:ascii="Times New Roman" w:hAnsi="Times New Roman" w:cs="Times New Roman"/>
+          <w:sz w:val="24"/>
+          <w:szCs w:val="24"/>
+        </w:rPr>
+        <w:t>In this project, retail inventory events were continuously sent through APIs and processed inside the pipeline to simulate a real-world retail setup.</w:t>
+      </w:r>
+      <w:r>
+        <w:rPr>
+          <w:rFonts w:ascii="Times New Roman" w:hAnsi="Times New Roman" w:cs="Times New Roman"/>
+          <w:sz w:val="24"/>
+          <w:szCs w:val="24"/>
+        </w:rPr>
+        <w:t xml:space="preserve"> </w:t>
+      </w:r>
+      <w:proofErr w:type="gramStart"/>
+      <w:r>
+        <w:rPr>
+          <w:rFonts w:ascii="Times New Roman" w:eastAsia="Times New Roman" w:hAnsi="Times New Roman" w:cs="Times New Roman"/>
+          <w:sz w:val="24"/>
+          <w:szCs w:val="24"/>
+        </w:rPr>
+        <w:t>The</w:t>
+      </w:r>
+      <w:proofErr w:type="gramEnd"/>
+      <w:r>
+        <w:rPr>
+          <w:rFonts w:ascii="Times New Roman" w:eastAsia="Times New Roman" w:hAnsi="Times New Roman" w:cs="Times New Roman"/>
+          <w:sz w:val="24"/>
+          <w:szCs w:val="24"/>
+        </w:rPr>
+        <w:t xml:space="preserve"> project also demonstrates how inventor</w:t>
+      </w:r>
+      <w:bookmarkStart w:id="0" w:name="_GoBack"/>
+      <w:bookmarkEnd w:id="0"/>
+      <w:r>
+        <w:rPr>
+          <w:rFonts w:ascii="Times New Roman" w:eastAsia="Times New Roman" w:hAnsi="Times New Roman" w:cs="Times New Roman"/>
+          <w:sz w:val="24"/>
+          <w:szCs w:val="24"/>
+        </w:rPr>
+        <w:t>y optimization and demand forecasting may support better stock planning and help reduce potential overstock-related food waste.</w:t>
       </w:r>
     </w:p>
     <w:p>
       <w:pPr>
-        <w:rPr>
-          <w:rFonts w:ascii="Times New Roman" w:hAnsi="Times New Roman" w:cs="Times New Roman"/>
-          <w:sz w:val="24"/>
-          <w:szCs w:val="24"/>
-        </w:rPr>
-      </w:pPr>
-      <w:r>
-        <w:rPr>
-          <w:rFonts w:ascii="Times New Roman" w:hAnsi="Times New Roman" w:cs="Times New Roman"/>
-          <w:sz w:val="24"/>
-          <w:szCs w:val="24"/>
-        </w:rPr>
-        <w:br w:type="page"/>
+        <w:spacing w:before="100" w:beforeAutospacing="1" w:after="100" w:afterAutospacing="1" w:line="240" w:lineRule="auto"/>
+        <w:jc w:val="both"/>
+        <w:rPr>
+          <w:rFonts w:ascii="Times New Roman" w:eastAsia="Times New Roman" w:hAnsi="Times New Roman" w:cs="Times New Roman"/>
+          <w:sz w:val="24"/>
+          <w:szCs w:val="24"/>
+        </w:rPr>
+      </w:pPr>
+      <w:r>
+        <w:rPr>
+          <w:rFonts w:ascii="Times New Roman" w:eastAsia="Times New Roman" w:hAnsi="Times New Roman" w:cs="Times New Roman"/>
+          <w:sz w:val="24"/>
+          <w:szCs w:val="24"/>
+        </w:rPr>
+        <w:t xml:space="preserve">Since the Walmart dataset does not contain real food expiry or waste-related attributes, additional inventory-related variables such as </w:t>
+      </w:r>
+      <w:proofErr w:type="spellStart"/>
+      <w:r>
+        <w:rPr>
+          <w:rFonts w:ascii="Times New Roman" w:eastAsia="Times New Roman" w:hAnsi="Times New Roman" w:cs="Times New Roman"/>
+          <w:sz w:val="24"/>
+          <w:szCs w:val="24"/>
+        </w:rPr>
+        <w:t>current_stock</w:t>
+      </w:r>
+      <w:proofErr w:type="spellEnd"/>
+      <w:r>
+        <w:rPr>
+          <w:rFonts w:ascii="Times New Roman" w:eastAsia="Times New Roman" w:hAnsi="Times New Roman" w:cs="Times New Roman"/>
+          <w:sz w:val="24"/>
+          <w:szCs w:val="24"/>
+        </w:rPr>
+        <w:t xml:space="preserve">, </w:t>
+      </w:r>
+      <w:proofErr w:type="spellStart"/>
+      <w:r>
+        <w:rPr>
+          <w:rFonts w:ascii="Times New Roman" w:eastAsia="Times New Roman" w:hAnsi="Times New Roman" w:cs="Times New Roman"/>
+          <w:sz w:val="24"/>
+          <w:szCs w:val="24"/>
+        </w:rPr>
+        <w:t>expiry_days</w:t>
+      </w:r>
+      <w:proofErr w:type="spellEnd"/>
+      <w:r>
+        <w:rPr>
+          <w:rFonts w:ascii="Times New Roman" w:eastAsia="Times New Roman" w:hAnsi="Times New Roman" w:cs="Times New Roman"/>
+          <w:sz w:val="24"/>
+          <w:szCs w:val="24"/>
+        </w:rPr>
+        <w:t xml:space="preserve">, and </w:t>
+      </w:r>
+      <w:proofErr w:type="spellStart"/>
+      <w:r>
+        <w:rPr>
+          <w:rFonts w:ascii="Times New Roman" w:eastAsia="Times New Roman" w:hAnsi="Times New Roman" w:cs="Times New Roman"/>
+          <w:sz w:val="24"/>
+          <w:szCs w:val="24"/>
+        </w:rPr>
+        <w:t>waste_quantity</w:t>
+      </w:r>
+      <w:proofErr w:type="spellEnd"/>
+      <w:r>
+        <w:rPr>
+          <w:rFonts w:ascii="Times New Roman" w:eastAsia="Times New Roman" w:hAnsi="Times New Roman" w:cs="Times New Roman"/>
+          <w:sz w:val="24"/>
+          <w:szCs w:val="24"/>
+        </w:rPr>
+        <w:t xml:space="preserve"> were synthetically generated for demonstration purposes. These engineered features were used to simulate operational inventory optimization and waste-risk monitoring scenarios within a </w:t>
+      </w:r>
+      <w:r>
+        <w:rPr>
+          <w:rFonts w:ascii="Times New Roman" w:eastAsia="Times New Roman" w:hAnsi="Times New Roman" w:cs="Times New Roman"/>
+          <w:sz w:val="24"/>
+          <w:szCs w:val="24"/>
+        </w:rPr>
+        <w:t>practical</w:t>
+      </w:r>
+      <w:r>
+        <w:rPr>
+          <w:rFonts w:ascii="Times New Roman" w:eastAsia="Times New Roman" w:hAnsi="Times New Roman" w:cs="Times New Roman"/>
+          <w:sz w:val="24"/>
+          <w:szCs w:val="24"/>
+        </w:rPr>
+        <w:t xml:space="preserve"> </w:t>
+      </w:r>
+      <w:proofErr w:type="spellStart"/>
+      <w:r>
+        <w:rPr>
+          <w:rFonts w:ascii="Times New Roman" w:eastAsia="Times New Roman" w:hAnsi="Times New Roman" w:cs="Times New Roman"/>
+          <w:sz w:val="24"/>
+          <w:szCs w:val="24"/>
+        </w:rPr>
+        <w:t>MLOps</w:t>
+      </w:r>
+      <w:proofErr w:type="spellEnd"/>
+      <w:r>
+        <w:rPr>
+          <w:rFonts w:ascii="Times New Roman" w:eastAsia="Times New Roman" w:hAnsi="Times New Roman" w:cs="Times New Roman"/>
+          <w:sz w:val="24"/>
+          <w:szCs w:val="24"/>
+        </w:rPr>
+        <w:t xml:space="preserve"> environment.</w:t>
       </w:r>
     </w:p>
     <w:p>
       <w:pPr>
+        <w:spacing w:before="100" w:beforeAutospacing="1" w:after="100" w:afterAutospacing="1" w:line="240" w:lineRule="auto"/>
+        <w:jc w:val="both"/>
+        <w:rPr>
+          <w:rFonts w:ascii="Times New Roman" w:eastAsia="Times New Roman" w:hAnsi="Times New Roman" w:cs="Times New Roman"/>
+          <w:sz w:val="24"/>
+          <w:szCs w:val="24"/>
+        </w:rPr>
+      </w:pPr>
+      <w:r>
+        <w:rPr>
+          <w:rFonts w:ascii="Times New Roman" w:hAnsi="Times New Roman" w:cs="Times New Roman"/>
+          <w:sz w:val="24"/>
+          <w:szCs w:val="24"/>
+        </w:rPr>
+        <w:t>The system aims to support retail decision-making by improving stock planning efficiency, reducing overstock risk, and supporting operational sustainability through waste-risk monitoring.</w:t>
+      </w:r>
+    </w:p>
+    <w:p>
+      <w:pPr>
+        <w:rPr>
+          <w:rFonts w:ascii="Times New Roman" w:hAnsi="Times New Roman" w:cs="Times New Roman"/>
+          <w:sz w:val="24"/>
+          <w:szCs w:val="24"/>
+        </w:rPr>
+      </w:pPr>
+      <w:r>
+        <w:rPr>
+          <w:rFonts w:ascii="Times New Roman" w:hAnsi="Times New Roman" w:cs="Times New Roman"/>
+          <w:sz w:val="24"/>
+          <w:szCs w:val="24"/>
+        </w:rPr>
+        <w:br w:type="page"/>
+      </w:r>
+    </w:p>
+    <w:p>
+      <w:pPr>
         <w:pStyle w:val="Heading2"/>
         <w:rPr>
           <w:rFonts w:ascii="Times New Roman" w:hAnsi="Times New Roman" w:cs="Times New Roman"/>
           <w:color w:val="auto"/>
-          <w:sz w:val="30"/>
-          <w:szCs w:val="30"/>
+          <w:sz w:val="32"/>
+          <w:szCs w:val="32"/>
         </w:rPr>
       </w:pPr>
       <w:r>
         <w:rPr>
           <w:rFonts w:ascii="Times New Roman" w:hAnsi="Times New Roman" w:cs="Times New Roman"/>
           <w:color w:val="auto"/>
-          <w:sz w:val="30"/>
-          <w:szCs w:val="30"/>
+          <w:sz w:val="32"/>
+          <w:szCs w:val="32"/>
         </w:rPr>
         <w:lastRenderedPageBreak/>
         <w:t>2. Pipeline Diagram</w:t>
@@ -405,118 +572,32 @@
         <w:jc w:val="center"/>
         <w:rPr>
           <w:rFonts w:ascii="Times New Roman" w:hAnsi="Times New Roman" w:cs="Times New Roman"/>
-          <w:sz w:val="30"/>
-          <w:szCs w:val="30"/>
-        </w:rPr>
-      </w:pPr>
-      <w:r>
-        <w:rPr>
-          <w:rFonts w:ascii="Times New Roman" w:hAnsi="Times New Roman" w:cs="Times New Roman"/>
-          <w:sz w:val="30"/>
-          <w:szCs w:val="30"/>
-        </w:rPr>
-        <w:t>External Retail System (Simulated)</w:t>
-      </w:r>
-      <w:r>
-        <w:rPr>
-          <w:rFonts w:ascii="Times New Roman" w:hAnsi="Times New Roman" w:cs="Times New Roman"/>
-          <w:sz w:val="30"/>
-          <w:szCs w:val="30"/>
+          <w:sz w:val="24"/>
+          <w:szCs w:val="24"/>
+        </w:rPr>
+      </w:pPr>
+      <w:r>
+        <w:rPr>
+          <w:rFonts w:ascii="Times New Roman" w:hAnsi="Times New Roman" w:cs="Times New Roman"/>
+          <w:sz w:val="24"/>
+          <w:szCs w:val="24"/>
+        </w:rPr>
+        <w:t>Historical Walmart Dataset</w:t>
+      </w:r>
+      <w:r>
+        <w:rPr>
+          <w:rFonts w:ascii="Times New Roman" w:hAnsi="Times New Roman" w:cs="Times New Roman"/>
+          <w:sz w:val="24"/>
+          <w:szCs w:val="24"/>
         </w:rPr>
         <w:br/>
-        <w:t xml:space="preserve">        ↓ POST /sales-event</w:t>
-      </w:r>
-      <w:r>
-        <w:rPr>
-          <w:rFonts w:ascii="Times New Roman" w:hAnsi="Times New Roman" w:cs="Times New Roman"/>
-          <w:sz w:val="30"/>
-          <w:szCs w:val="30"/>
-        </w:rPr>
-        <w:br/>
-        <w:t>FastAPI Ingestion API</w:t>
-      </w:r>
-      <w:r>
-        <w:rPr>
-          <w:rFonts w:ascii="Times New Roman" w:hAnsi="Times New Roman" w:cs="Times New Roman"/>
-          <w:sz w:val="30"/>
-          <w:szCs w:val="30"/>
-        </w:rPr>
-        <w:br/>
-        <w:t xml:space="preserve">        ↓</w:t>
-      </w:r>
-      <w:r>
-        <w:rPr>
-          <w:rFonts w:ascii="Times New Roman" w:hAnsi="Times New Roman" w:cs="Times New Roman"/>
-          <w:sz w:val="30"/>
-          <w:szCs w:val="30"/>
-        </w:rPr>
-        <w:br/>
-      </w:r>
-      <w:r>
-        <w:rPr>
-          <w:rFonts w:ascii="Times New Roman" w:hAnsi="Times New Roman" w:cs="Times New Roman"/>
-          <w:sz w:val="30"/>
-          <w:szCs w:val="30"/>
-        </w:rPr>
-        <w:t>SQLite Database (</w:t>
-      </w:r>
-      <w:proofErr w:type="spellStart"/>
-      <w:r>
-        <w:rPr>
-          <w:rFonts w:ascii="Times New Roman" w:hAnsi="Times New Roman" w:cs="Times New Roman"/>
-          <w:sz w:val="30"/>
-          <w:szCs w:val="30"/>
-        </w:rPr>
-        <w:t>raw_food_sales</w:t>
-      </w:r>
-      <w:proofErr w:type="spellEnd"/>
-      <w:r>
-        <w:rPr>
-          <w:rFonts w:ascii="Times New Roman" w:hAnsi="Times New Roman" w:cs="Times New Roman"/>
-          <w:sz w:val="30"/>
-          <w:szCs w:val="30"/>
-        </w:rPr>
-        <w:t xml:space="preserve"> table)</w:t>
-      </w:r>
-      <w:r>
-        <w:rPr>
-          <w:rFonts w:ascii="Times New Roman" w:hAnsi="Times New Roman" w:cs="Times New Roman"/>
-          <w:sz w:val="30"/>
-          <w:szCs w:val="30"/>
-        </w:rPr>
-        <w:br/>
-        <w:t xml:space="preserve">        ↓</w:t>
-      </w:r>
-      <w:r>
-        <w:rPr>
-          <w:rFonts w:ascii="Times New Roman" w:hAnsi="Times New Roman" w:cs="Times New Roman"/>
-          <w:sz w:val="30"/>
-          <w:szCs w:val="30"/>
-        </w:rPr>
-        <w:br/>
-      </w:r>
-      <w:r>
-        <w:rPr>
-          <w:rFonts w:ascii="Times New Roman" w:hAnsi="Times New Roman" w:cs="Times New Roman"/>
-          <w:sz w:val="30"/>
-          <w:szCs w:val="30"/>
-        </w:rPr>
-        <w:t>/run-pipeline API</w:t>
-      </w:r>
-      <w:r>
-        <w:rPr>
-          <w:rFonts w:ascii="Times New Roman" w:hAnsi="Times New Roman" w:cs="Times New Roman"/>
-          <w:sz w:val="30"/>
-          <w:szCs w:val="30"/>
-        </w:rPr>
-        <w:br/>
-        <w:t xml:space="preserve">        ↓</w:t>
-      </w:r>
-      <w:r>
-        <w:rPr>
-          <w:rFonts w:ascii="Times New Roman" w:hAnsi="Times New Roman" w:cs="Times New Roman"/>
-          <w:sz w:val="30"/>
-          <w:szCs w:val="30"/>
+        <w:t>↓</w:t>
+      </w:r>
+      <w:r>
+        <w:rPr>
+          <w:rFonts w:ascii="Times New Roman" w:hAnsi="Times New Roman" w:cs="Times New Roman"/>
+          <w:sz w:val="24"/>
+          <w:szCs w:val="24"/>
         </w:rPr>
         <w:br/>
         <w:t>Preprocessing + Feature Engineering</w:t>
@@ -524,285 +605,1514 @@
       <w:r>
         <w:rPr>
           <w:rFonts w:ascii="Times New Roman" w:hAnsi="Times New Roman" w:cs="Times New Roman"/>
-          <w:sz w:val="30"/>
-          <w:szCs w:val="30"/>
+          <w:sz w:val="24"/>
+          <w:szCs w:val="24"/>
         </w:rPr>
         <w:br/>
-        <w:t xml:space="preserve">        ↓</w:t>
-      </w:r>
-      <w:r>
-        <w:rPr>
-          <w:rFonts w:ascii="Times New Roman" w:hAnsi="Times New Roman" w:cs="Times New Roman"/>
-          <w:sz w:val="30"/>
-          <w:szCs w:val="30"/>
+        <w:t>↓</w:t>
+      </w:r>
+      <w:r>
+        <w:rPr>
+          <w:rFonts w:ascii="Times New Roman" w:hAnsi="Times New Roman" w:cs="Times New Roman"/>
+          <w:sz w:val="24"/>
+          <w:szCs w:val="24"/>
         </w:rPr>
         <w:br/>
-        <w:t>Demand Forecasting Model Training</w:t>
-      </w:r>
-      <w:r>
-        <w:rPr>
-          <w:rFonts w:ascii="Times New Roman" w:hAnsi="Times New Roman" w:cs="Times New Roman"/>
-          <w:sz w:val="30"/>
-          <w:szCs w:val="30"/>
+        <w:t xml:space="preserve">Model Training + Model </w:t>
+      </w:r>
+      <w:proofErr w:type="spellStart"/>
+      <w:r>
+        <w:rPr>
+          <w:rFonts w:ascii="Times New Roman" w:hAnsi="Times New Roman" w:cs="Times New Roman"/>
+          <w:sz w:val="24"/>
+          <w:szCs w:val="24"/>
+        </w:rPr>
+        <w:t>Comparison</w:t>
+      </w:r>
+      <w:r>
+        <w:rPr>
+          <w:rFonts w:ascii="Times New Roman" w:hAnsi="Times New Roman" w:cs="Times New Roman"/>
+          <w:sz w:val="24"/>
+          <w:szCs w:val="24"/>
+        </w:rPr>
+        <w:t>+Best</w:t>
+      </w:r>
+      <w:proofErr w:type="spellEnd"/>
+      <w:r>
+        <w:rPr>
+          <w:rFonts w:ascii="Times New Roman" w:hAnsi="Times New Roman" w:cs="Times New Roman"/>
+          <w:sz w:val="24"/>
+          <w:szCs w:val="24"/>
+        </w:rPr>
+        <w:t xml:space="preserve"> Model Selection</w:t>
+      </w:r>
+      <w:r>
+        <w:rPr>
+          <w:rFonts w:ascii="Times New Roman" w:hAnsi="Times New Roman" w:cs="Times New Roman"/>
+          <w:sz w:val="24"/>
+          <w:szCs w:val="24"/>
         </w:rPr>
         <w:br/>
-        <w:t xml:space="preserve">        ↓</w:t>
-      </w:r>
-      <w:r>
-        <w:rPr>
-          <w:rFonts w:ascii="Times New Roman" w:hAnsi="Times New Roman" w:cs="Times New Roman"/>
-          <w:sz w:val="30"/>
-          <w:szCs w:val="30"/>
+        <w:t>↓</w:t>
+      </w:r>
+      <w:r>
+        <w:rPr>
+          <w:rFonts w:ascii="Times New Roman" w:hAnsi="Times New Roman" w:cs="Times New Roman"/>
+          <w:sz w:val="24"/>
+          <w:szCs w:val="24"/>
         </w:rPr>
         <w:br/>
-        <w:t>Model Registry + Artifacts</w:t>
-      </w:r>
-      <w:r>
-        <w:rPr>
-          <w:rFonts w:ascii="Times New Roman" w:hAnsi="Times New Roman" w:cs="Times New Roman"/>
-          <w:sz w:val="30"/>
-          <w:szCs w:val="30"/>
+        <w:t>Model Registry + Saved Model</w:t>
+      </w:r>
+      <w:r>
+        <w:rPr>
+          <w:rFonts w:ascii="Times New Roman" w:hAnsi="Times New Roman" w:cs="Times New Roman"/>
+          <w:sz w:val="24"/>
+          <w:szCs w:val="24"/>
         </w:rPr>
         <w:br/>
-        <w:t xml:space="preserve">        ↓</w:t>
-      </w:r>
-      <w:r>
-        <w:rPr>
-          <w:rFonts w:ascii="Times New Roman" w:hAnsi="Times New Roman" w:cs="Times New Roman"/>
-          <w:sz w:val="30"/>
-          <w:szCs w:val="30"/>
+        <w:t>↓</w:t>
+      </w:r>
+      <w:r>
+        <w:rPr>
+          <w:rFonts w:ascii="Times New Roman" w:hAnsi="Times New Roman" w:cs="Times New Roman"/>
+          <w:sz w:val="24"/>
+          <w:szCs w:val="24"/>
         </w:rPr>
         <w:br/>
-        <w:t>POST /predict-demand</w:t>
-      </w:r>
-      <w:r>
-        <w:rPr>
-          <w:rFonts w:ascii="Times New Roman" w:hAnsi="Times New Roman" w:cs="Times New Roman"/>
-          <w:sz w:val="30"/>
-          <w:szCs w:val="30"/>
+        <w:t>FastAPI Backend</w:t>
+      </w:r>
+      <w:r>
+        <w:rPr>
+          <w:rFonts w:ascii="Times New Roman" w:hAnsi="Times New Roman" w:cs="Times New Roman"/>
+          <w:sz w:val="24"/>
+          <w:szCs w:val="24"/>
         </w:rPr>
         <w:br/>
-        <w:t xml:space="preserve">        ↓</w:t>
-      </w:r>
-      <w:r>
-        <w:rPr>
-          <w:rFonts w:ascii="Times New Roman" w:hAnsi="Times New Roman" w:cs="Times New Roman"/>
-          <w:sz w:val="30"/>
-          <w:szCs w:val="30"/>
+        <w:t>↓</w:t>
+      </w:r>
+      <w:r>
+        <w:rPr>
+          <w:rFonts w:ascii="Times New Roman" w:hAnsi="Times New Roman" w:cs="Times New Roman"/>
+          <w:sz w:val="24"/>
+          <w:szCs w:val="24"/>
         </w:rPr>
         <w:br/>
-        <w:t>Prediction Logs + Waste Risk Output</w:t>
-      </w:r>
-      <w:r>
-        <w:rPr>
-          <w:rFonts w:ascii="Times New Roman" w:hAnsi="Times New Roman" w:cs="Times New Roman"/>
-          <w:sz w:val="30"/>
-          <w:szCs w:val="30"/>
+        <w:t>Prediction Endpoint /predict-demand</w:t>
+      </w:r>
+      <w:r>
+        <w:rPr>
+          <w:rFonts w:ascii="Times New Roman" w:hAnsi="Times New Roman" w:cs="Times New Roman"/>
+          <w:sz w:val="24"/>
+          <w:szCs w:val="24"/>
         </w:rPr>
         <w:br/>
-        <w:t xml:space="preserve">        ↓</w:t>
-      </w:r>
-      <w:r>
-        <w:rPr>
-          <w:rFonts w:ascii="Times New Roman" w:hAnsi="Times New Roman" w:cs="Times New Roman"/>
-          <w:sz w:val="30"/>
-          <w:szCs w:val="30"/>
+        <w:t>↓</w:t>
+      </w:r>
+      <w:r>
+        <w:rPr>
+          <w:rFonts w:ascii="Times New Roman" w:hAnsi="Times New Roman" w:cs="Times New Roman"/>
+          <w:sz w:val="24"/>
+          <w:szCs w:val="24"/>
         </w:rPr>
         <w:br/>
-        <w:t>Drift Detection</w:t>
-      </w:r>
-      <w:r>
-        <w:rPr>
-          <w:rFonts w:ascii="Times New Roman" w:hAnsi="Times New Roman" w:cs="Times New Roman"/>
-          <w:sz w:val="30"/>
-          <w:szCs w:val="30"/>
+        <w:t>Model Inference</w:t>
+      </w:r>
+      <w:r>
+        <w:rPr>
+          <w:rFonts w:ascii="Times New Roman" w:hAnsi="Times New Roman" w:cs="Times New Roman"/>
+          <w:sz w:val="24"/>
+          <w:szCs w:val="24"/>
         </w:rPr>
         <w:br/>
-        <w:t xml:space="preserve">        ↓</w:t>
-      </w:r>
-      <w:r>
-        <w:rPr>
-          <w:rFonts w:ascii="Times New Roman" w:hAnsi="Times New Roman" w:cs="Times New Roman"/>
-          <w:sz w:val="30"/>
-          <w:szCs w:val="30"/>
+        <w:t>↓</w:t>
+      </w:r>
+      <w:r>
+        <w:rPr>
+          <w:rFonts w:ascii="Times New Roman" w:hAnsi="Times New Roman" w:cs="Times New Roman"/>
+          <w:sz w:val="24"/>
+          <w:szCs w:val="24"/>
         </w:rPr>
         <w:br/>
-        <w:t>If Drift → Auto Retraining</w:t>
-      </w:r>
-      <w:r>
-        <w:rPr>
-          <w:rFonts w:ascii="Times New Roman" w:hAnsi="Times New Roman" w:cs="Times New Roman"/>
-          <w:sz w:val="30"/>
-          <w:szCs w:val="30"/>
+        <w:t>Prediction Logs + Waste Risk + Recommendation</w:t>
+      </w:r>
+      <w:r>
+        <w:rPr>
+          <w:rFonts w:ascii="Times New Roman" w:hAnsi="Times New Roman" w:cs="Times New Roman"/>
+          <w:sz w:val="24"/>
+          <w:szCs w:val="24"/>
         </w:rPr>
         <w:br/>
-        <w:t xml:space="preserve">        ↓</w:t>
-      </w:r>
-      <w:r>
-        <w:rPr>
-          <w:rFonts w:ascii="Times New Roman" w:hAnsi="Times New Roman" w:cs="Times New Roman"/>
-          <w:sz w:val="30"/>
-          <w:szCs w:val="30"/>
+        <w:t>↓</w:t>
+      </w:r>
+      <w:r>
+        <w:rPr>
+          <w:rFonts w:ascii="Times New Roman" w:hAnsi="Times New Roman" w:cs="Times New Roman"/>
+          <w:sz w:val="24"/>
+          <w:szCs w:val="24"/>
         </w:rPr>
         <w:br/>
-        <w:t>Streamlit Dashboard</w:t>
+        <w:t xml:space="preserve">Drift </w:t>
+      </w:r>
+      <w:proofErr w:type="spellStart"/>
+      <w:r>
+        <w:rPr>
+          <w:rFonts w:ascii="Times New Roman" w:hAnsi="Times New Roman" w:cs="Times New Roman"/>
+          <w:sz w:val="24"/>
+          <w:szCs w:val="24"/>
+        </w:rPr>
+        <w:t>Detection</w:t>
+      </w:r>
+      <w:r>
+        <w:rPr>
+          <w:rFonts w:ascii="Times New Roman" w:hAnsi="Times New Roman" w:cs="Times New Roman"/>
+          <w:sz w:val="24"/>
+          <w:szCs w:val="24"/>
+        </w:rPr>
+        <w:t>+If</w:t>
+      </w:r>
+      <w:proofErr w:type="spellEnd"/>
+      <w:r>
+        <w:rPr>
+          <w:rFonts w:ascii="Times New Roman" w:hAnsi="Times New Roman" w:cs="Times New Roman"/>
+          <w:sz w:val="24"/>
+          <w:szCs w:val="24"/>
+        </w:rPr>
+        <w:t xml:space="preserve"> Drift Detected</w:t>
+      </w:r>
+      <w:r>
+        <w:rPr>
+          <w:rFonts w:ascii="Times New Roman" w:hAnsi="Times New Roman" w:cs="Times New Roman"/>
+          <w:sz w:val="24"/>
+          <w:szCs w:val="24"/>
+        </w:rPr>
+        <w:br/>
+        <w:t>↓</w:t>
+      </w:r>
+      <w:r>
+        <w:rPr>
+          <w:rFonts w:ascii="Times New Roman" w:hAnsi="Times New Roman" w:cs="Times New Roman"/>
+          <w:sz w:val="24"/>
+          <w:szCs w:val="24"/>
+        </w:rPr>
+        <w:br/>
+        <w:t>Automatic Retraining</w:t>
+      </w:r>
+      <w:r>
+        <w:rPr>
+          <w:rFonts w:ascii="Times New Roman" w:hAnsi="Times New Roman" w:cs="Times New Roman"/>
+          <w:sz w:val="24"/>
+          <w:szCs w:val="24"/>
+        </w:rPr>
+        <w:br/>
+        <w:t>↓</w:t>
+      </w:r>
+      <w:r>
+        <w:rPr>
+          <w:rFonts w:ascii="Times New Roman" w:hAnsi="Times New Roman" w:cs="Times New Roman"/>
+          <w:sz w:val="24"/>
+          <w:szCs w:val="24"/>
+        </w:rPr>
+        <w:br/>
+        <w:t>Updated Model Registry</w:t>
+      </w:r>
+      <w:r>
+        <w:rPr>
+          <w:rFonts w:ascii="Times New Roman" w:hAnsi="Times New Roman" w:cs="Times New Roman"/>
+          <w:sz w:val="24"/>
+          <w:szCs w:val="24"/>
+        </w:rPr>
+        <w:br/>
+      </w:r>
+      <w:r>
+        <w:rPr>
+          <w:rFonts w:ascii="Times New Roman" w:hAnsi="Times New Roman" w:cs="Times New Roman"/>
+          <w:sz w:val="24"/>
+          <w:szCs w:val="24"/>
+        </w:rPr>
+        <w:br/>
+        <w:t>External Retail System</w:t>
+      </w:r>
+      <w:r>
+        <w:rPr>
+          <w:rFonts w:ascii="Times New Roman" w:hAnsi="Times New Roman" w:cs="Times New Roman"/>
+          <w:sz w:val="24"/>
+          <w:szCs w:val="24"/>
+        </w:rPr>
+        <w:br/>
+        <w:t>↓</w:t>
+      </w:r>
+      <w:r>
+        <w:rPr>
+          <w:rFonts w:ascii="Times New Roman" w:hAnsi="Times New Roman" w:cs="Times New Roman"/>
+          <w:sz w:val="24"/>
+          <w:szCs w:val="24"/>
+        </w:rPr>
+        <w:br/>
+        <w:t>POST /sales-event</w:t>
+      </w:r>
+      <w:r>
+        <w:rPr>
+          <w:rFonts w:ascii="Times New Roman" w:hAnsi="Times New Roman" w:cs="Times New Roman"/>
+          <w:sz w:val="24"/>
+          <w:szCs w:val="24"/>
+        </w:rPr>
+        <w:br/>
+        <w:t>↓</w:t>
+      </w:r>
+      <w:r>
+        <w:rPr>
+          <w:rFonts w:ascii="Times New Roman" w:hAnsi="Times New Roman" w:cs="Times New Roman"/>
+          <w:sz w:val="24"/>
+          <w:szCs w:val="24"/>
+        </w:rPr>
+        <w:br/>
+        <w:t>FastAPI Backend</w:t>
+      </w:r>
+      <w:r>
+        <w:rPr>
+          <w:rFonts w:ascii="Times New Roman" w:hAnsi="Times New Roman" w:cs="Times New Roman"/>
+          <w:sz w:val="24"/>
+          <w:szCs w:val="24"/>
+        </w:rPr>
+        <w:br/>
+        <w:t>↓</w:t>
+      </w:r>
+      <w:r>
+        <w:rPr>
+          <w:rFonts w:ascii="Times New Roman" w:hAnsi="Times New Roman" w:cs="Times New Roman"/>
+          <w:sz w:val="24"/>
+          <w:szCs w:val="24"/>
+        </w:rPr>
+        <w:br/>
+        <w:t>SQLite Operational Database</w:t>
+      </w:r>
+      <w:r>
+        <w:rPr>
+          <w:rFonts w:ascii="Times New Roman" w:hAnsi="Times New Roman" w:cs="Times New Roman"/>
+          <w:sz w:val="24"/>
+          <w:szCs w:val="24"/>
+        </w:rPr>
+        <w:br/>
+      </w:r>
+      <w:r>
+        <w:rPr>
+          <w:rFonts w:ascii="Times New Roman" w:hAnsi="Times New Roman" w:cs="Times New Roman"/>
+          <w:sz w:val="24"/>
+          <w:szCs w:val="24"/>
+        </w:rPr>
+        <w:br/>
+        <w:t>Streamlit Dashboard connects to:</w:t>
+      </w:r>
+      <w:r>
+        <w:rPr>
+          <w:rFonts w:ascii="Times New Roman" w:hAnsi="Times New Roman" w:cs="Times New Roman"/>
+          <w:sz w:val="24"/>
+          <w:szCs w:val="24"/>
+        </w:rPr>
+        <w:br/>
+        <w:t>- prediction results</w:t>
+      </w:r>
+      <w:r>
+        <w:rPr>
+          <w:rFonts w:ascii="Times New Roman" w:hAnsi="Times New Roman" w:cs="Times New Roman"/>
+          <w:sz w:val="24"/>
+          <w:szCs w:val="24"/>
+        </w:rPr>
+        <w:br/>
+        <w:t>- latest sales</w:t>
+      </w:r>
+      <w:r>
+        <w:rPr>
+          <w:rFonts w:ascii="Times New Roman" w:hAnsi="Times New Roman" w:cs="Times New Roman"/>
+          <w:sz w:val="24"/>
+          <w:szCs w:val="24"/>
+        </w:rPr>
+        <w:br/>
+        <w:t>- model info</w:t>
+      </w:r>
+      <w:r>
+        <w:rPr>
+          <w:rFonts w:ascii="Times New Roman" w:hAnsi="Times New Roman" w:cs="Times New Roman"/>
+          <w:sz w:val="24"/>
+          <w:szCs w:val="24"/>
+        </w:rPr>
+        <w:br/>
+        <w:t>- drift reports</w:t>
+      </w:r>
+      <w:r>
+        <w:rPr>
+          <w:rFonts w:ascii="Times New Roman" w:hAnsi="Times New Roman" w:cs="Times New Roman"/>
+          <w:sz w:val="24"/>
+          <w:szCs w:val="24"/>
+        </w:rPr>
+        <w:br/>
+        <w:t>- retraining actions</w:t>
       </w:r>
     </w:p>
     <w:p>
       <w:pPr>
-        <w:jc w:val="center"/>
-        <w:rPr>
-          <w:rFonts w:ascii="Times New Roman" w:hAnsi="Times New Roman" w:cs="Times New Roman"/>
-          <w:sz w:val="30"/>
-          <w:szCs w:val="30"/>
-        </w:rPr>
-      </w:pPr>
-      <w:r>
-        <w:rPr>
-          <w:rFonts w:ascii="Times New Roman" w:hAnsi="Times New Roman" w:cs="Times New Roman"/>
-          <w:sz w:val="24"/>
-          <w:szCs w:val="24"/>
-        </w:rPr>
-        <w:br/>
-      </w:r>
+        <w:jc w:val="both"/>
+        <w:rPr>
+          <w:rFonts w:ascii="Times New Roman" w:hAnsi="Times New Roman" w:cs="Times New Roman"/>
+          <w:sz w:val="24"/>
+          <w:szCs w:val="24"/>
+        </w:rPr>
+      </w:pPr>
       <w:r>
         <w:rPr>
           <w:rFonts w:ascii="Times New Roman" w:hAnsi="Times New Roman" w:cs="Times New Roman"/>
           <w:b/>
-          <w:sz w:val="30"/>
-          <w:szCs w:val="30"/>
-        </w:rPr>
-        <w:t>Figure 1: End-to-end MLOps pipeline architecture for food waste prediction and inventory optimization.</w:t>
+          <w:sz w:val="24"/>
+          <w:szCs w:val="24"/>
+        </w:rPr>
+        <w:t xml:space="preserve">Figure 1: End-to-end </w:t>
+      </w:r>
+      <w:proofErr w:type="spellStart"/>
+      <w:r>
+        <w:rPr>
+          <w:rFonts w:ascii="Times New Roman" w:hAnsi="Times New Roman" w:cs="Times New Roman"/>
+          <w:b/>
+          <w:sz w:val="24"/>
+          <w:szCs w:val="24"/>
+        </w:rPr>
+        <w:t>MLOps</w:t>
+      </w:r>
+      <w:proofErr w:type="spellEnd"/>
+      <w:r>
+        <w:rPr>
+          <w:rFonts w:ascii="Times New Roman" w:hAnsi="Times New Roman" w:cs="Times New Roman"/>
+          <w:b/>
+          <w:sz w:val="24"/>
+          <w:szCs w:val="24"/>
+        </w:rPr>
+        <w:t xml:space="preserve"> pipeline architecture for retail demand forecasting and waste-risk monitoring.</w:t>
       </w:r>
     </w:p>
     <w:p>
       <w:pPr>
-        <w:jc w:val="both"/>
-        <w:rPr>
-          <w:rFonts w:ascii="Times New Roman" w:eastAsiaTheme="majorEastAsia" w:hAnsi="Times New Roman" w:cs="Times New Roman"/>
-          <w:b/>
-          <w:bCs/>
-          <w:sz w:val="24"/>
-          <w:szCs w:val="24"/>
-        </w:rPr>
-      </w:pPr>
-      <w:r>
-        <w:rPr>
-          <w:rFonts w:ascii="Times New Roman" w:hAnsi="Times New Roman" w:cs="Times New Roman"/>
-          <w:sz w:val="24"/>
-          <w:szCs w:val="24"/>
-        </w:rPr>
-        <w:t>The pipeline simulates a production-style retail MLOps workflow where external inventory events are ingested through APIs, processed inside the ML pipeline, monitored for drift, and retrained automatically when operational changes occur.</w:t>
+        <w:pStyle w:val="Heading2"/>
+        <w:rPr>
+          <w:rFonts w:ascii="Times New Roman" w:hAnsi="Times New Roman" w:cs="Times New Roman"/>
+          <w:color w:val="auto"/>
+          <w:sz w:val="32"/>
+          <w:szCs w:val="32"/>
+        </w:rPr>
+      </w:pPr>
+      <w:r>
+        <w:rPr>
+          <w:rFonts w:ascii="Times New Roman" w:hAnsi="Times New Roman" w:cs="Times New Roman"/>
+          <w:color w:val="auto"/>
+          <w:sz w:val="32"/>
+          <w:szCs w:val="32"/>
+        </w:rPr>
+        <w:lastRenderedPageBreak/>
+        <w:t>3. Technical Details of Each Pipeline Component</w:t>
       </w:r>
     </w:p>
     <w:p>
       <w:pPr>
-        <w:pStyle w:val="Heading2"/>
-        <w:rPr>
-          <w:rFonts w:ascii="Times New Roman" w:hAnsi="Times New Roman" w:cs="Times New Roman"/>
-          <w:color w:val="auto"/>
-          <w:sz w:val="30"/>
-          <w:szCs w:val="30"/>
-        </w:rPr>
-      </w:pPr>
-      <w:r>
-        <w:rPr>
-          <w:rFonts w:ascii="Times New Roman" w:hAnsi="Times New Roman" w:cs="Times New Roman"/>
-          <w:color w:val="auto"/>
-          <w:sz w:val="30"/>
-          <w:szCs w:val="30"/>
-        </w:rPr>
-        <w:lastRenderedPageBreak/>
-        <w:t>3. Technical Details of Each Pipeline Component</w:t>
+        <w:rPr>
+          <w:rFonts w:ascii="Times New Roman" w:hAnsi="Times New Roman" w:cs="Times New Roman"/>
+          <w:b/>
+          <w:sz w:val="32"/>
+          <w:szCs w:val="32"/>
+        </w:rPr>
+      </w:pPr>
+      <w:r>
+        <w:rPr>
+          <w:rFonts w:ascii="Times New Roman" w:hAnsi="Times New Roman" w:cs="Times New Roman"/>
+          <w:b/>
+          <w:sz w:val="32"/>
+          <w:szCs w:val="32"/>
+        </w:rPr>
+        <w:t>3.1 Historical Data Collection</w:t>
       </w:r>
     </w:p>
     <w:p>
       <w:pPr>
-        <w:rPr>
-          <w:rFonts w:ascii="Times New Roman" w:hAnsi="Times New Roman" w:cs="Times New Roman"/>
-          <w:sz w:val="24"/>
-          <w:szCs w:val="24"/>
-        </w:rPr>
-      </w:pPr>
-      <w:r>
-        <w:rPr>
-          <w:rFonts w:ascii="Times New Roman" w:hAnsi="Times New Roman" w:cs="Times New Roman"/>
-          <w:b/>
-          <w:sz w:val="28"/>
-          <w:szCs w:val="28"/>
-        </w:rPr>
-        <w:t xml:space="preserve">3.1 </w:t>
-      </w:r>
-      <w:r>
-        <w:rPr>
-          <w:rFonts w:ascii="Times New Roman" w:hAnsi="Times New Roman" w:cs="Times New Roman"/>
-          <w:b/>
-          <w:sz w:val="28"/>
-          <w:szCs w:val="28"/>
-        </w:rPr>
-        <w:t>Real-Time Data Ingestion</w:t>
-      </w:r>
-      <w:r>
-        <w:rPr>
-          <w:rFonts w:ascii="Times New Roman" w:hAnsi="Times New Roman" w:cs="Times New Roman"/>
-          <w:sz w:val="24"/>
-          <w:szCs w:val="24"/>
-        </w:rPr>
-        <w:br/>
-        <w:t>The data ingestion component was redesigned to simulate a production-oriented retail workflow. Instead of directly inserting records into the database through standalone scripts, the system uses API-based ingestion.</w:t>
-      </w:r>
-      <w:r>
-        <w:rPr>
-          <w:rFonts w:ascii="Times New Roman" w:hAnsi="Times New Roman" w:cs="Times New Roman"/>
-          <w:sz w:val="24"/>
-          <w:szCs w:val="24"/>
-        </w:rPr>
-        <w:br/>
-      </w:r>
-      <w:r>
-        <w:rPr>
-          <w:rFonts w:ascii="Times New Roman" w:hAnsi="Times New Roman" w:cs="Times New Roman"/>
-          <w:sz w:val="24"/>
-          <w:szCs w:val="24"/>
-        </w:rPr>
-        <w:br/>
-        <w:t>An external client simulates a supermarket operational system by generating sales and inventory events and sending them to the FastAPI backend through the /sales-event endpoint.</w:t>
+        <w:spacing w:before="100" w:beforeAutospacing="1" w:after="100" w:afterAutospacing="1" w:line="240" w:lineRule="auto"/>
+        <w:jc w:val="both"/>
+        <w:rPr>
+          <w:rFonts w:ascii="Times New Roman" w:eastAsia="Times New Roman" w:hAnsi="Times New Roman" w:cs="Times New Roman"/>
+          <w:sz w:val="24"/>
+          <w:szCs w:val="24"/>
+        </w:rPr>
+      </w:pPr>
+      <w:r>
+        <w:rPr>
+          <w:rFonts w:ascii="Times New Roman" w:eastAsia="Times New Roman" w:hAnsi="Times New Roman" w:cs="Times New Roman"/>
+          <w:sz w:val="24"/>
+          <w:szCs w:val="24"/>
+        </w:rPr>
+        <w:t xml:space="preserve">The Walmart Store Sales Forecasting dataset from </w:t>
+      </w:r>
+      <w:proofErr w:type="spellStart"/>
+      <w:r>
+        <w:rPr>
+          <w:rFonts w:ascii="Times New Roman" w:eastAsia="Times New Roman" w:hAnsi="Times New Roman" w:cs="Times New Roman"/>
+          <w:sz w:val="24"/>
+          <w:szCs w:val="24"/>
+        </w:rPr>
+        <w:t>Kaggle</w:t>
+      </w:r>
+      <w:proofErr w:type="spellEnd"/>
+      <w:r>
+        <w:rPr>
+          <w:rFonts w:ascii="Times New Roman" w:eastAsia="Times New Roman" w:hAnsi="Times New Roman" w:cs="Times New Roman"/>
+          <w:sz w:val="24"/>
+          <w:szCs w:val="24"/>
+        </w:rPr>
+        <w:t xml:space="preserve"> was used as the historical training dataset. The dataset contains historical retail sales information across multiple Walmart stores and departments, including holiday-related effects and </w:t>
+      </w:r>
+      <w:r>
+        <w:rPr>
+          <w:rFonts w:ascii="Times New Roman" w:hAnsi="Times New Roman" w:cs="Times New Roman"/>
+          <w:sz w:val="24"/>
+          <w:szCs w:val="24"/>
+        </w:rPr>
+        <w:t>retail-related variables</w:t>
+      </w:r>
+      <w:r>
+        <w:rPr>
+          <w:rFonts w:ascii="Times New Roman" w:eastAsia="Times New Roman" w:hAnsi="Times New Roman" w:cs="Times New Roman"/>
+          <w:sz w:val="24"/>
+          <w:szCs w:val="24"/>
+        </w:rPr>
+        <w:t>.</w:t>
       </w:r>
     </w:p>
     <w:p>
       <w:pPr>
-        <w:rPr>
-          <w:rFonts w:ascii="Times New Roman" w:hAnsi="Times New Roman" w:cs="Times New Roman"/>
-          <w:sz w:val="24"/>
-          <w:szCs w:val="24"/>
-        </w:rPr>
-      </w:pPr>
-      <w:r>
-        <w:rPr>
-          <w:rFonts w:ascii="Times New Roman" w:hAnsi="Times New Roman" w:cs="Times New Roman"/>
-          <w:sz w:val="24"/>
-          <w:szCs w:val="24"/>
-        </w:rPr>
-        <w:t>The external_client.py module simulates an external retail system that continuously sends live inventory and sales events to the FastAPI backend through HTTP POST requests. This architecture demonstrates a production-oriented API ingestion workflow instead of directly inserting records into the database through standalone scripts.</w:t>
+        <w:spacing w:before="100" w:beforeAutospacing="1" w:after="100" w:afterAutospacing="1" w:line="240" w:lineRule="auto"/>
+        <w:jc w:val="both"/>
+        <w:rPr>
+          <w:rFonts w:ascii="Times New Roman" w:eastAsia="Times New Roman" w:hAnsi="Times New Roman" w:cs="Times New Roman"/>
+          <w:sz w:val="24"/>
+          <w:szCs w:val="24"/>
+        </w:rPr>
+      </w:pPr>
+      <w:r>
+        <w:rPr>
+          <w:rFonts w:ascii="Times New Roman" w:eastAsia="Times New Roman" w:hAnsi="Times New Roman" w:cs="Times New Roman"/>
+          <w:sz w:val="24"/>
+          <w:szCs w:val="24"/>
+        </w:rPr>
+        <w:t>Since the dataset does not contain inventory expiry or food waste information, additional inventory-related variables were synthetically generated to simulate inventory optimization and food waste monitoring workflows.</w:t>
       </w:r>
     </w:p>
     <w:p>
       <w:pPr>
-        <w:rPr>
-          <w:rFonts w:ascii="Times New Roman" w:hAnsi="Times New Roman" w:cs="Times New Roman"/>
-          <w:sz w:val="24"/>
-          <w:szCs w:val="24"/>
-        </w:rPr>
-      </w:pPr>
-      <w:r>
-        <w:rPr>
-          <w:rFonts w:ascii="Times New Roman" w:hAnsi="Times New Roman" w:cs="Times New Roman"/>
-          <w:sz w:val="24"/>
-          <w:szCs w:val="24"/>
-        </w:rPr>
+        <w:spacing w:before="100" w:beforeAutospacing="1" w:after="100" w:afterAutospacing="1" w:line="240" w:lineRule="auto"/>
+        <w:rPr>
+          <w:rFonts w:ascii="Times New Roman" w:eastAsia="Times New Roman" w:hAnsi="Times New Roman" w:cs="Times New Roman"/>
+          <w:sz w:val="24"/>
+          <w:szCs w:val="24"/>
+        </w:rPr>
+      </w:pPr>
+      <w:r>
+        <w:rPr>
+          <w:rFonts w:ascii="Times New Roman" w:eastAsia="Times New Roman" w:hAnsi="Times New Roman" w:cs="Times New Roman"/>
+          <w:sz w:val="24"/>
+          <w:szCs w:val="24"/>
+        </w:rPr>
+        <w:t>The generated variables include:</w:t>
+      </w:r>
+    </w:p>
+    <w:p>
+      <w:pPr>
+        <w:numPr>
+          <w:ilvl w:val="0"/>
+          <w:numId w:val="11"/>
+        </w:numPr>
+        <w:spacing w:before="100" w:beforeAutospacing="1" w:after="100" w:afterAutospacing="1" w:line="240" w:lineRule="auto"/>
+        <w:rPr>
+          <w:rFonts w:ascii="Times New Roman" w:eastAsia="Times New Roman" w:hAnsi="Times New Roman" w:cs="Times New Roman"/>
+          <w:sz w:val="24"/>
+          <w:szCs w:val="24"/>
+        </w:rPr>
+      </w:pPr>
+      <w:proofErr w:type="spellStart"/>
+      <w:r>
+        <w:rPr>
+          <w:rFonts w:ascii="Times New Roman" w:eastAsia="Times New Roman" w:hAnsi="Times New Roman" w:cs="Times New Roman"/>
+          <w:sz w:val="24"/>
+          <w:szCs w:val="24"/>
+        </w:rPr>
+        <w:t>current_stock</w:t>
+      </w:r>
+      <w:proofErr w:type="spellEnd"/>
+    </w:p>
+    <w:p>
+      <w:pPr>
+        <w:numPr>
+          <w:ilvl w:val="0"/>
+          <w:numId w:val="11"/>
+        </w:numPr>
+        <w:spacing w:before="100" w:beforeAutospacing="1" w:after="100" w:afterAutospacing="1" w:line="240" w:lineRule="auto"/>
+        <w:rPr>
+          <w:rFonts w:ascii="Times New Roman" w:eastAsia="Times New Roman" w:hAnsi="Times New Roman" w:cs="Times New Roman"/>
+          <w:sz w:val="24"/>
+          <w:szCs w:val="24"/>
+        </w:rPr>
+      </w:pPr>
+      <w:proofErr w:type="spellStart"/>
+      <w:r>
+        <w:rPr>
+          <w:rFonts w:ascii="Times New Roman" w:eastAsia="Times New Roman" w:hAnsi="Times New Roman" w:cs="Times New Roman"/>
+          <w:sz w:val="24"/>
+          <w:szCs w:val="24"/>
+        </w:rPr>
+        <w:t>expiry_days</w:t>
+      </w:r>
+      <w:proofErr w:type="spellEnd"/>
+    </w:p>
+    <w:p>
+      <w:pPr>
+        <w:numPr>
+          <w:ilvl w:val="0"/>
+          <w:numId w:val="11"/>
+        </w:numPr>
+        <w:spacing w:before="100" w:beforeAutospacing="1" w:after="100" w:afterAutospacing="1" w:line="240" w:lineRule="auto"/>
+        <w:rPr>
+          <w:rFonts w:ascii="Times New Roman" w:eastAsia="Times New Roman" w:hAnsi="Times New Roman" w:cs="Times New Roman"/>
+          <w:sz w:val="24"/>
+          <w:szCs w:val="24"/>
+        </w:rPr>
+      </w:pPr>
+      <w:proofErr w:type="spellStart"/>
+      <w:r>
+        <w:rPr>
+          <w:rFonts w:ascii="Times New Roman" w:eastAsia="Times New Roman" w:hAnsi="Times New Roman" w:cs="Times New Roman"/>
+          <w:sz w:val="24"/>
+          <w:szCs w:val="24"/>
+        </w:rPr>
+        <w:t>unit_price</w:t>
+      </w:r>
+      <w:proofErr w:type="spellEnd"/>
+    </w:p>
+    <w:p>
+      <w:pPr>
+        <w:numPr>
+          <w:ilvl w:val="0"/>
+          <w:numId w:val="11"/>
+        </w:numPr>
+        <w:spacing w:before="100" w:beforeAutospacing="1" w:after="100" w:afterAutospacing="1" w:line="240" w:lineRule="auto"/>
+        <w:rPr>
+          <w:rFonts w:ascii="Times New Roman" w:eastAsia="Times New Roman" w:hAnsi="Times New Roman" w:cs="Times New Roman"/>
+          <w:sz w:val="24"/>
+          <w:szCs w:val="24"/>
+        </w:rPr>
+      </w:pPr>
+      <w:proofErr w:type="spellStart"/>
+      <w:r>
+        <w:rPr>
+          <w:rFonts w:ascii="Times New Roman" w:eastAsia="Times New Roman" w:hAnsi="Times New Roman" w:cs="Times New Roman"/>
+          <w:sz w:val="24"/>
+          <w:szCs w:val="24"/>
+        </w:rPr>
+        <w:t>waste_quantity</w:t>
+      </w:r>
+      <w:proofErr w:type="spellEnd"/>
+    </w:p>
+    <w:p>
+      <w:pPr>
+        <w:numPr>
+          <w:ilvl w:val="0"/>
+          <w:numId w:val="11"/>
+        </w:numPr>
+        <w:spacing w:before="100" w:beforeAutospacing="1" w:after="100" w:afterAutospacing="1" w:line="240" w:lineRule="auto"/>
+        <w:rPr>
+          <w:rFonts w:ascii="Times New Roman" w:eastAsia="Times New Roman" w:hAnsi="Times New Roman" w:cs="Times New Roman"/>
+          <w:sz w:val="24"/>
+          <w:szCs w:val="24"/>
+        </w:rPr>
+      </w:pPr>
+      <w:r>
+        <w:rPr>
+          <w:rFonts w:ascii="Times New Roman" w:eastAsia="Times New Roman" w:hAnsi="Times New Roman" w:cs="Times New Roman"/>
+          <w:sz w:val="24"/>
+          <w:szCs w:val="24"/>
+        </w:rPr>
+        <w:t>category labels</w:t>
+      </w:r>
+    </w:p>
+    <w:p>
+      <w:pPr>
+        <w:numPr>
+          <w:ilvl w:val="0"/>
+          <w:numId w:val="11"/>
+        </w:numPr>
+        <w:spacing w:before="100" w:beforeAutospacing="1" w:after="100" w:afterAutospacing="1" w:line="240" w:lineRule="auto"/>
+        <w:rPr>
+          <w:rFonts w:ascii="Times New Roman" w:eastAsia="Times New Roman" w:hAnsi="Times New Roman" w:cs="Times New Roman"/>
+          <w:sz w:val="24"/>
+          <w:szCs w:val="24"/>
+        </w:rPr>
+      </w:pPr>
+      <w:r>
+        <w:rPr>
+          <w:rFonts w:ascii="Times New Roman" w:eastAsia="Times New Roman" w:hAnsi="Times New Roman" w:cs="Times New Roman"/>
+          <w:sz w:val="24"/>
+          <w:szCs w:val="24"/>
+        </w:rPr>
+        <w:t>promotional indicators</w:t>
+      </w:r>
+    </w:p>
+    <w:p>
+      <w:pPr>
+        <w:spacing w:before="100" w:beforeAutospacing="1" w:after="100" w:afterAutospacing="1" w:line="240" w:lineRule="auto"/>
+        <w:rPr>
+          <w:rFonts w:ascii="Times New Roman" w:eastAsia="Times New Roman" w:hAnsi="Times New Roman" w:cs="Times New Roman"/>
+          <w:sz w:val="24"/>
+          <w:szCs w:val="24"/>
+        </w:rPr>
+      </w:pPr>
+      <w:r>
+        <w:rPr>
+          <w:rFonts w:ascii="Times New Roman" w:eastAsia="Times New Roman" w:hAnsi="Times New Roman" w:cs="Times New Roman"/>
+          <w:sz w:val="24"/>
+          <w:szCs w:val="24"/>
+        </w:rPr>
+        <w:t xml:space="preserve">These additional variables helped simulate realistic retail inventory conditions for the </w:t>
+      </w:r>
+      <w:proofErr w:type="spellStart"/>
+      <w:r>
+        <w:rPr>
+          <w:rFonts w:ascii="Times New Roman" w:eastAsia="Times New Roman" w:hAnsi="Times New Roman" w:cs="Times New Roman"/>
+          <w:sz w:val="24"/>
+          <w:szCs w:val="24"/>
+        </w:rPr>
+        <w:t>MLOps</w:t>
+      </w:r>
+      <w:proofErr w:type="spellEnd"/>
+      <w:r>
+        <w:rPr>
+          <w:rFonts w:ascii="Times New Roman" w:eastAsia="Times New Roman" w:hAnsi="Times New Roman" w:cs="Times New Roman"/>
+          <w:sz w:val="24"/>
+          <w:szCs w:val="24"/>
+        </w:rPr>
+        <w:t xml:space="preserve"> pipeline.</w:t>
+      </w:r>
+    </w:p>
+    <w:p>
+      <w:pPr>
+        <w:rPr>
+          <w:rFonts w:ascii="Times New Roman" w:hAnsi="Times New Roman" w:cs="Times New Roman"/>
+          <w:b/>
+          <w:sz w:val="32"/>
+          <w:szCs w:val="32"/>
+        </w:rPr>
+      </w:pPr>
+      <w:r>
+        <w:rPr>
+          <w:rFonts w:ascii="Times New Roman" w:hAnsi="Times New Roman" w:cs="Times New Roman"/>
+          <w:b/>
+          <w:sz w:val="32"/>
+          <w:szCs w:val="32"/>
+        </w:rPr>
+        <w:t>3.2 Preprocessing</w:t>
+      </w:r>
+      <w:r>
+        <w:rPr>
+          <w:rFonts w:ascii="Times New Roman" w:hAnsi="Times New Roman" w:cs="Times New Roman"/>
+          <w:sz w:val="24"/>
+          <w:szCs w:val="24"/>
+        </w:rPr>
+        <w:br/>
+        <w:t>The preprocessing stage ensures consistency between training and inference.</w:t>
+      </w:r>
+      <w:r>
+        <w:rPr>
+          <w:rFonts w:ascii="Times New Roman" w:hAnsi="Times New Roman" w:cs="Times New Roman"/>
+          <w:sz w:val="24"/>
+          <w:szCs w:val="24"/>
+        </w:rPr>
+        <w:br/>
+        <w:t>The preprocessing pipeline reads sales records directly from the SQLite database and performs several transformation and cleaning operations before model training.</w:t>
+      </w:r>
+      <w:r>
+        <w:rPr>
+          <w:rFonts w:ascii="Times New Roman" w:hAnsi="Times New Roman" w:cs="Times New Roman"/>
+          <w:sz w:val="24"/>
+          <w:szCs w:val="24"/>
+        </w:rPr>
+        <w:br/>
+        <w:t>The following preprocessing steps are applied:</w:t>
+      </w:r>
+      <w:r>
+        <w:rPr>
+          <w:rFonts w:ascii="Times New Roman" w:hAnsi="Times New Roman" w:cs="Times New Roman"/>
+          <w:sz w:val="24"/>
+          <w:szCs w:val="24"/>
+        </w:rPr>
+        <w:br/>
+        <w:t>• missing value handling</w:t>
+      </w:r>
+      <w:r>
+        <w:rPr>
+          <w:rFonts w:ascii="Times New Roman" w:hAnsi="Times New Roman" w:cs="Times New Roman"/>
+          <w:sz w:val="24"/>
+          <w:szCs w:val="24"/>
+        </w:rPr>
+        <w:br/>
+        <w:t>• numerical type conversion</w:t>
+      </w:r>
+      <w:r>
+        <w:rPr>
+          <w:rFonts w:ascii="Times New Roman" w:hAnsi="Times New Roman" w:cs="Times New Roman"/>
+          <w:sz w:val="24"/>
+          <w:szCs w:val="24"/>
+        </w:rPr>
+        <w:br/>
+        <w:t>• duplicate removal</w:t>
+      </w:r>
+      <w:r>
+        <w:rPr>
+          <w:rFonts w:ascii="Times New Roman" w:hAnsi="Times New Roman" w:cs="Times New Roman"/>
+          <w:sz w:val="24"/>
+          <w:szCs w:val="24"/>
+        </w:rPr>
+        <w:br/>
+        <w:t>• categorical encoding</w:t>
+      </w:r>
+      <w:r>
+        <w:rPr>
+          <w:rFonts w:ascii="Times New Roman" w:hAnsi="Times New Roman" w:cs="Times New Roman"/>
+          <w:sz w:val="24"/>
+          <w:szCs w:val="24"/>
+        </w:rPr>
+        <w:br/>
+        <w:t>• invalid value handling</w:t>
+      </w:r>
+      <w:r>
+        <w:rPr>
+          <w:rFonts w:ascii="Times New Roman" w:hAnsi="Times New Roman" w:cs="Times New Roman"/>
+          <w:sz w:val="24"/>
+          <w:szCs w:val="24"/>
+        </w:rPr>
+        <w:br/>
+        <w:t>• outlier safety</w:t>
+      </w:r>
+      <w:r>
+        <w:rPr>
+          <w:rFonts w:ascii="Times New Roman" w:hAnsi="Times New Roman" w:cs="Times New Roman"/>
+          <w:sz w:val="24"/>
+          <w:szCs w:val="24"/>
+        </w:rPr>
+        <w:t xml:space="preserve"> handling</w:t>
+      </w:r>
+      <w:r>
+        <w:rPr>
+          <w:rFonts w:ascii="Times New Roman" w:hAnsi="Times New Roman" w:cs="Times New Roman"/>
+          <w:sz w:val="24"/>
+          <w:szCs w:val="24"/>
+        </w:rPr>
+        <w:br/>
+        <w:t>• feature engineering</w:t>
+      </w:r>
+      <w:r>
+        <w:rPr>
+          <w:rFonts w:ascii="Times New Roman" w:hAnsi="Times New Roman" w:cs="Times New Roman"/>
+          <w:sz w:val="24"/>
+          <w:szCs w:val="24"/>
+        </w:rPr>
+        <w:br/>
+        <w:t>SQLite was selected because it provides lightweight structured storage and integrates easily with Python-based machine learning pipelines.</w:t>
+      </w:r>
+      <w:r>
+        <w:rPr>
+          <w:rFonts w:ascii="Times New Roman" w:hAnsi="Times New Roman" w:cs="Times New Roman"/>
+          <w:sz w:val="24"/>
+          <w:szCs w:val="24"/>
+        </w:rPr>
+        <w:br/>
+        <w:t xml:space="preserve">Consistent preprocessing is important in </w:t>
+      </w:r>
+      <w:proofErr w:type="spellStart"/>
+      <w:r>
+        <w:rPr>
+          <w:rFonts w:ascii="Times New Roman" w:hAnsi="Times New Roman" w:cs="Times New Roman"/>
+          <w:sz w:val="24"/>
+          <w:szCs w:val="24"/>
+        </w:rPr>
+        <w:t>MLOps</w:t>
+      </w:r>
+      <w:proofErr w:type="spellEnd"/>
+      <w:r>
+        <w:rPr>
+          <w:rFonts w:ascii="Times New Roman" w:hAnsi="Times New Roman" w:cs="Times New Roman"/>
+          <w:sz w:val="24"/>
+          <w:szCs w:val="24"/>
+        </w:rPr>
+        <w:t xml:space="preserve"> systems because training-serving mismatch may reduce prediction reliability. Therefore, the same preprocessing logic is reused during both training and prediction stages.</w:t>
+      </w:r>
+      <w:r>
+        <w:rPr>
+          <w:rFonts w:ascii="Times New Roman" w:hAnsi="Times New Roman" w:cs="Times New Roman"/>
+          <w:sz w:val="24"/>
+          <w:szCs w:val="24"/>
+        </w:rPr>
+        <w:br/>
+      </w:r>
+    </w:p>
+    <w:p>
+      <w:pPr>
+        <w:rPr>
+          <w:rFonts w:ascii="Times New Roman" w:hAnsi="Times New Roman" w:cs="Times New Roman"/>
+          <w:sz w:val="24"/>
+          <w:szCs w:val="24"/>
+        </w:rPr>
+      </w:pPr>
+      <w:r>
+        <w:rPr>
+          <w:rFonts w:ascii="Times New Roman" w:hAnsi="Times New Roman" w:cs="Times New Roman"/>
+          <w:b/>
+          <w:sz w:val="32"/>
+          <w:szCs w:val="32"/>
+        </w:rPr>
+        <w:lastRenderedPageBreak/>
+        <w:t>3.3 Feature Engineering</w:t>
+      </w:r>
+      <w:r>
+        <w:rPr>
+          <w:rFonts w:ascii="Times New Roman" w:hAnsi="Times New Roman" w:cs="Times New Roman"/>
+          <w:sz w:val="24"/>
+          <w:szCs w:val="24"/>
+        </w:rPr>
+        <w:br/>
+        <w:t>Feature engineering was applied to capture inventory behavi</w:t>
+      </w:r>
+      <w:r>
+        <w:rPr>
+          <w:rFonts w:ascii="Times New Roman" w:hAnsi="Times New Roman" w:cs="Times New Roman"/>
+          <w:sz w:val="24"/>
+          <w:szCs w:val="24"/>
+        </w:rPr>
+        <w:t xml:space="preserve">or, sales patterns, retail </w:t>
+      </w:r>
+      <w:r>
+        <w:rPr>
+          <w:rFonts w:ascii="Times New Roman" w:hAnsi="Times New Roman" w:cs="Times New Roman"/>
+          <w:sz w:val="24"/>
+          <w:szCs w:val="24"/>
+        </w:rPr>
+        <w:t>c</w:t>
+      </w:r>
+      <w:r>
+        <w:rPr>
+          <w:rFonts w:ascii="Times New Roman" w:hAnsi="Times New Roman" w:cs="Times New Roman"/>
+          <w:sz w:val="24"/>
+          <w:szCs w:val="24"/>
+        </w:rPr>
+        <w:t>onditions, and food waste risk.</w:t>
+      </w:r>
+      <w:r>
+        <w:rPr>
+          <w:rFonts w:ascii="Times New Roman" w:hAnsi="Times New Roman" w:cs="Times New Roman"/>
+          <w:sz w:val="24"/>
+          <w:szCs w:val="24"/>
+        </w:rPr>
+        <w:br/>
+        <w:t>The following engineered features were created:</w:t>
+      </w:r>
+    </w:p>
+    <w:p>
+      <w:pPr>
+        <w:pStyle w:val="NormalWeb"/>
+        <w:numPr>
+          <w:ilvl w:val="0"/>
+          <w:numId w:val="10"/>
+        </w:numPr>
+      </w:pPr>
+      <w:proofErr w:type="spellStart"/>
+      <w:r>
+        <w:t>product_encoded</w:t>
+      </w:r>
+      <w:proofErr w:type="spellEnd"/>
+      <w:r>
+        <w:br/>
+        <w:t>This feature converts Walmart department identifiers into numerical values so that machine learning models can process product-level retail patterns.</w:t>
+      </w:r>
+    </w:p>
+    <w:p>
+      <w:pPr>
+        <w:pStyle w:val="NormalWeb"/>
+        <w:numPr>
+          <w:ilvl w:val="0"/>
+          <w:numId w:val="10"/>
+        </w:numPr>
+      </w:pPr>
+      <w:proofErr w:type="spellStart"/>
+      <w:r>
+        <w:t>category_encoded</w:t>
+      </w:r>
+      <w:proofErr w:type="spellEnd"/>
+      <w:r>
+        <w:br/>
+        <w:t>This feature converts retail category labels into numerical representations to capture operational differences between store categories.</w:t>
+      </w:r>
+    </w:p>
+    <w:p>
+      <w:pPr>
+        <w:pStyle w:val="NormalWeb"/>
+        <w:numPr>
+          <w:ilvl w:val="0"/>
+          <w:numId w:val="10"/>
+        </w:numPr>
+      </w:pPr>
+      <w:proofErr w:type="spellStart"/>
+      <w:r>
+        <w:t>short_expiry</w:t>
+      </w:r>
+      <w:proofErr w:type="spellEnd"/>
+      <w:r>
+        <w:br/>
+        <w:t>This binary feature identifies products with limited remaining shelf life. Products with shorter expiry periods have higher probability of becoming unsold inventory and contributing to potential food waste.</w:t>
+      </w:r>
+    </w:p>
+    <w:p>
+      <w:pPr>
+        <w:pStyle w:val="NormalWeb"/>
+        <w:numPr>
+          <w:ilvl w:val="0"/>
+          <w:numId w:val="10"/>
+        </w:numPr>
+      </w:pPr>
+      <w:proofErr w:type="spellStart"/>
+      <w:r>
+        <w:t>promotion_active</w:t>
+      </w:r>
+      <w:proofErr w:type="spellEnd"/>
+      <w:r>
+        <w:br/>
+      </w:r>
+      <w:r>
+        <w:t>This feature is derived directly from the promotion indicator and shows whether a promotional campaign is active.</w:t>
+      </w:r>
+    </w:p>
+    <w:p>
+      <w:pPr>
+        <w:pStyle w:val="NormalWeb"/>
+        <w:numPr>
+          <w:ilvl w:val="0"/>
+          <w:numId w:val="10"/>
+        </w:numPr>
+      </w:pPr>
+      <w:proofErr w:type="spellStart"/>
+      <w:r>
+        <w:t>is_weekend</w:t>
+      </w:r>
+      <w:proofErr w:type="spellEnd"/>
+      <w:r>
+        <w:br/>
+        <w:t>This feature captures weekend purchasing behavior because retail demand often changes during weekends compared to weekdays.</w:t>
+      </w:r>
+    </w:p>
+    <w:p>
+      <w:pPr>
+        <w:pStyle w:val="NormalWeb"/>
+        <w:numPr>
+          <w:ilvl w:val="0"/>
+          <w:numId w:val="10"/>
+        </w:numPr>
+      </w:pPr>
+      <w:proofErr w:type="spellStart"/>
+      <w:r>
+        <w:t>day_of_week</w:t>
+      </w:r>
+      <w:proofErr w:type="spellEnd"/>
+      <w:r>
+        <w:br/>
+        <w:t>This feature captures daily purchasing patterns across the retail week to improve forecasting consistency.</w:t>
+      </w:r>
+    </w:p>
+    <w:p>
+      <w:pPr>
+        <w:pStyle w:val="NormalWeb"/>
+        <w:numPr>
+          <w:ilvl w:val="0"/>
+          <w:numId w:val="10"/>
+        </w:numPr>
+      </w:pPr>
+      <w:proofErr w:type="spellStart"/>
+      <w:r>
+        <w:t>stock_to_sales_ratio</w:t>
+      </w:r>
+      <w:proofErr w:type="spellEnd"/>
+      <w:r>
+        <w:br/>
+      </w:r>
+      <w:r>
+        <w:t xml:space="preserve">This feature was calculated as </w:t>
+      </w:r>
+      <w:proofErr w:type="spellStart"/>
+      <w:r>
+        <w:t>current_stock</w:t>
+      </w:r>
+      <w:proofErr w:type="spellEnd"/>
+      <w:r>
+        <w:t xml:space="preserve"> divided by </w:t>
+      </w:r>
+      <w:proofErr w:type="spellStart"/>
+      <w:r>
+        <w:t>units_sold</w:t>
+      </w:r>
+      <w:proofErr w:type="spellEnd"/>
+      <w:r>
+        <w:t xml:space="preserve"> to estimate relative inventory pressure and identify possible overstock conditions.</w:t>
+      </w:r>
+    </w:p>
+    <w:p>
+      <w:pPr>
+        <w:pStyle w:val="NormalWeb"/>
+        <w:numPr>
+          <w:ilvl w:val="0"/>
+          <w:numId w:val="10"/>
+        </w:numPr>
+      </w:pPr>
+      <w:proofErr w:type="spellStart"/>
+      <w:r>
+        <w:t>waste_risk_score</w:t>
+      </w:r>
+      <w:proofErr w:type="spellEnd"/>
+      <w:r>
+        <w:br/>
+        <w:t>This feature combines inventory level, demand level, and expiry-related conditions into a simplified operational waste-risk indicator for inventory monitoring.</w:t>
+      </w:r>
+    </w:p>
+    <w:p>
+      <w:pPr>
+        <w:pStyle w:val="NormalWeb"/>
+      </w:pPr>
+      <w:r>
+        <w:t>The same feature engineering logic is reused during both training and prediction to reduce training-serving skew.</w:t>
+      </w:r>
+      <w:r>
+        <w:br/>
+      </w:r>
+      <w:r>
+        <w:br/>
+      </w:r>
+    </w:p>
+    <w:p>
+      <w:pPr>
+        <w:rPr>
+          <w:rFonts w:ascii="Times New Roman" w:hAnsi="Times New Roman" w:cs="Times New Roman"/>
+          <w:b/>
+          <w:sz w:val="32"/>
+          <w:szCs w:val="32"/>
+        </w:rPr>
+      </w:pPr>
+      <w:r>
+        <w:rPr>
+          <w:rFonts w:ascii="Times New Roman" w:hAnsi="Times New Roman" w:cs="Times New Roman"/>
+          <w:b/>
+          <w:sz w:val="24"/>
+          <w:szCs w:val="24"/>
+        </w:rPr>
+        <w:br w:type="page"/>
+      </w:r>
+      <w:r>
+        <w:rPr>
+          <w:rFonts w:ascii="Times New Roman" w:hAnsi="Times New Roman" w:cs="Times New Roman"/>
+          <w:b/>
+          <w:sz w:val="32"/>
+          <w:szCs w:val="32"/>
+        </w:rPr>
+        <w:lastRenderedPageBreak/>
+        <w:t>3.4 Model Training</w:t>
+      </w:r>
+      <w:r>
+        <w:rPr>
+          <w:rFonts w:ascii="Times New Roman" w:hAnsi="Times New Roman" w:cs="Times New Roman"/>
+          <w:sz w:val="24"/>
+          <w:szCs w:val="24"/>
+        </w:rPr>
+        <w:br/>
+      </w:r>
+      <w:r>
+        <w:rPr>
+          <w:rFonts w:ascii="Times New Roman" w:hAnsi="Times New Roman" w:cs="Times New Roman"/>
+          <w:sz w:val="24"/>
+          <w:szCs w:val="24"/>
+        </w:rPr>
+        <w:t xml:space="preserve">Multiple candidate models, including </w:t>
+      </w:r>
+      <w:proofErr w:type="spellStart"/>
+      <w:r>
+        <w:rPr>
+          <w:rFonts w:ascii="Times New Roman" w:hAnsi="Times New Roman" w:cs="Times New Roman"/>
+          <w:sz w:val="24"/>
+          <w:szCs w:val="24"/>
+        </w:rPr>
+        <w:t>RandomForestRegressor</w:t>
+      </w:r>
+      <w:proofErr w:type="spellEnd"/>
+      <w:r>
+        <w:rPr>
+          <w:rFonts w:ascii="Times New Roman" w:hAnsi="Times New Roman" w:cs="Times New Roman"/>
+          <w:sz w:val="24"/>
+          <w:szCs w:val="24"/>
+        </w:rPr>
+        <w:t xml:space="preserve"> and </w:t>
+      </w:r>
+      <w:proofErr w:type="spellStart"/>
+      <w:r>
+        <w:rPr>
+          <w:rFonts w:ascii="Times New Roman" w:hAnsi="Times New Roman" w:cs="Times New Roman"/>
+          <w:sz w:val="24"/>
+          <w:szCs w:val="24"/>
+        </w:rPr>
+        <w:t>LightGBMRegressor</w:t>
+      </w:r>
+      <w:proofErr w:type="spellEnd"/>
+      <w:r>
+        <w:rPr>
+          <w:rFonts w:ascii="Times New Roman" w:hAnsi="Times New Roman" w:cs="Times New Roman"/>
+          <w:sz w:val="24"/>
+          <w:szCs w:val="24"/>
+        </w:rPr>
+        <w:t>, were evaluated during training. The best-performing model was selected automatically based on RMSE performance. RMSE was used as the primary model selection metric because it penalizes large forecasting errors more strongly than MAE.</w:t>
+      </w:r>
+      <w:r>
+        <w:rPr>
+          <w:rFonts w:ascii="Times New Roman" w:hAnsi="Times New Roman" w:cs="Times New Roman"/>
+          <w:sz w:val="24"/>
+          <w:szCs w:val="24"/>
+        </w:rPr>
+        <w:br/>
+        <w:t>A Random Forest regression model was selected for demand forecasting because it performs effectively on structured retail datasets and can capture non-linear operational</w:t>
+      </w:r>
+      <w:r>
+        <w:rPr>
+          <w:rFonts w:ascii="Times New Roman" w:hAnsi="Times New Roman" w:cs="Times New Roman"/>
+          <w:sz w:val="24"/>
+          <w:szCs w:val="24"/>
+        </w:rPr>
+        <w:t xml:space="preserve"> relationships.</w:t>
+      </w:r>
+      <w:r>
+        <w:rPr>
+          <w:rFonts w:ascii="Times New Roman" w:hAnsi="Times New Roman" w:cs="Times New Roman"/>
+          <w:sz w:val="24"/>
+          <w:szCs w:val="24"/>
+        </w:rPr>
+        <w:br/>
+        <w:t xml:space="preserve">The target variable used for training is </w:t>
+      </w:r>
+      <w:proofErr w:type="spellStart"/>
+      <w:r>
+        <w:rPr>
+          <w:rFonts w:ascii="Times New Roman" w:hAnsi="Times New Roman" w:cs="Times New Roman"/>
+          <w:sz w:val="24"/>
+          <w:szCs w:val="24"/>
+        </w:rPr>
+        <w:t>units_sold</w:t>
+      </w:r>
+      <w:proofErr w:type="spellEnd"/>
+      <w:r>
+        <w:rPr>
+          <w:rFonts w:ascii="Times New Roman" w:hAnsi="Times New Roman" w:cs="Times New Roman"/>
+          <w:sz w:val="24"/>
+          <w:szCs w:val="24"/>
+        </w:rPr>
+        <w:t>, representing future product demand.</w:t>
+      </w:r>
+      <w:r>
+        <w:rPr>
+          <w:rFonts w:ascii="Times New Roman" w:hAnsi="Times New Roman" w:cs="Times New Roman"/>
+          <w:sz w:val="24"/>
+          <w:szCs w:val="24"/>
+        </w:rPr>
+        <w:br/>
+      </w:r>
+      <w:r>
+        <w:rPr>
+          <w:rFonts w:ascii="Times New Roman" w:hAnsi="Times New Roman" w:cs="Times New Roman"/>
+          <w:sz w:val="24"/>
+          <w:szCs w:val="24"/>
+        </w:rPr>
+        <w:br/>
+        <w:t xml:space="preserve">The training pipeline begins by loading the processed dataset and separating the target variable from input features. The dataset is then divided into training and testing subsets using </w:t>
+      </w:r>
+      <w:proofErr w:type="spellStart"/>
+      <w:r>
+        <w:rPr>
+          <w:rFonts w:ascii="Times New Roman" w:hAnsi="Times New Roman" w:cs="Times New Roman"/>
+          <w:sz w:val="24"/>
+          <w:szCs w:val="24"/>
+        </w:rPr>
+        <w:t>train_test_split</w:t>
+      </w:r>
+      <w:proofErr w:type="spellEnd"/>
+      <w:r>
+        <w:rPr>
+          <w:rFonts w:ascii="Times New Roman" w:hAnsi="Times New Roman" w:cs="Times New Roman"/>
+          <w:sz w:val="24"/>
+          <w:szCs w:val="24"/>
+        </w:rPr>
+        <w:t xml:space="preserve"> to evaluate model performance on unseen records.</w:t>
+      </w:r>
+      <w:r>
+        <w:rPr>
+          <w:rFonts w:ascii="Times New Roman" w:hAnsi="Times New Roman" w:cs="Times New Roman"/>
+          <w:sz w:val="24"/>
+          <w:szCs w:val="24"/>
+        </w:rPr>
+        <w:br/>
+      </w:r>
+      <w:r>
+        <w:rPr>
+          <w:rFonts w:ascii="Times New Roman" w:hAnsi="Times New Roman" w:cs="Times New Roman"/>
+          <w:sz w:val="24"/>
+          <w:szCs w:val="24"/>
+        </w:rPr>
+        <w:br/>
+        <w:t>After training, the model generates predictions on the test set.</w:t>
+      </w:r>
+      <w:r>
+        <w:rPr>
+          <w:rFonts w:ascii="Times New Roman" w:hAnsi="Times New Roman" w:cs="Times New Roman"/>
+          <w:sz w:val="24"/>
+          <w:szCs w:val="24"/>
+        </w:rPr>
+        <w:br/>
+      </w:r>
+      <w:r>
+        <w:rPr>
+          <w:rFonts w:ascii="Times New Roman" w:hAnsi="Times New Roman" w:cs="Times New Roman"/>
+          <w:sz w:val="24"/>
+          <w:szCs w:val="24"/>
+        </w:rPr>
+        <w:br/>
+        <w:t>The model is evaluated using:</w:t>
+      </w:r>
+      <w:r>
+        <w:rPr>
+          <w:rFonts w:ascii="Times New Roman" w:hAnsi="Times New Roman" w:cs="Times New Roman"/>
+          <w:sz w:val="24"/>
+          <w:szCs w:val="24"/>
+        </w:rPr>
+        <w:br/>
+        <w:t>• MAE (Mean Absolute Error)</w:t>
+      </w:r>
+      <w:r>
+        <w:rPr>
+          <w:rFonts w:ascii="Times New Roman" w:hAnsi="Times New Roman" w:cs="Times New Roman"/>
+          <w:sz w:val="24"/>
+          <w:szCs w:val="24"/>
+        </w:rPr>
+        <w:br/>
+        <w:t>• RMSE (Root Mean Squared Error)</w:t>
+      </w:r>
+      <w:r>
+        <w:rPr>
+          <w:rFonts w:ascii="Times New Roman" w:hAnsi="Times New Roman" w:cs="Times New Roman"/>
+          <w:sz w:val="24"/>
+          <w:szCs w:val="24"/>
+        </w:rPr>
+        <w:br/>
+        <w:t>• R² Score</w:t>
+      </w:r>
+      <w:r>
+        <w:rPr>
+          <w:rFonts w:ascii="Times New Roman" w:hAnsi="Times New Roman" w:cs="Times New Roman"/>
+          <w:sz w:val="24"/>
+          <w:szCs w:val="24"/>
+        </w:rPr>
+        <w:br/>
+      </w:r>
+      <w:r>
+        <w:rPr>
+          <w:rFonts w:ascii="Times New Roman" w:hAnsi="Times New Roman" w:cs="Times New Roman"/>
+          <w:sz w:val="24"/>
+          <w:szCs w:val="24"/>
+        </w:rPr>
+        <w:br/>
+        <w:t>MAE measures average prediction error, RMSE penalizes larger prediction errors, and R² evaluates how well the model explains demand variability. After successful training, artifacts including trained models, feature schemas, and evaluation metrics are stored for reproducibility and deployment.</w:t>
+      </w:r>
+      <w:r>
+        <w:rPr>
+          <w:rFonts w:ascii="Times New Roman" w:hAnsi="Times New Roman" w:cs="Times New Roman"/>
+          <w:sz w:val="24"/>
+          <w:szCs w:val="24"/>
+        </w:rPr>
+        <w:br/>
+      </w:r>
+      <w:r>
+        <w:rPr>
+          <w:rFonts w:ascii="Times New Roman" w:hAnsi="Times New Roman" w:cs="Times New Roman"/>
+          <w:sz w:val="24"/>
+          <w:szCs w:val="24"/>
+        </w:rPr>
+        <w:br/>
+        <w:t>Structured artifact storage was implemented to organize trained models, metrics, drift reports, and monitoring outputs.</w:t>
+      </w:r>
+    </w:p>
+    <w:p>
+      <w:pPr>
+        <w:rPr>
+          <w:rFonts w:ascii="Times New Roman" w:hAnsi="Times New Roman" w:cs="Times New Roman"/>
+          <w:sz w:val="24"/>
+          <w:szCs w:val="24"/>
+        </w:rPr>
+      </w:pPr>
+    </w:p>
+    <w:p>
+      <w:pPr>
+        <w:rPr>
+          <w:rFonts w:ascii="Times New Roman" w:hAnsi="Times New Roman" w:cs="Times New Roman"/>
+          <w:sz w:val="24"/>
+          <w:szCs w:val="24"/>
+        </w:rPr>
+      </w:pPr>
+      <w:r>
+        <w:rPr>
+          <w:rFonts w:ascii="Times New Roman" w:hAnsi="Times New Roman" w:cs="Times New Roman"/>
+          <w:b/>
+          <w:sz w:val="32"/>
+          <w:szCs w:val="32"/>
+        </w:rPr>
+        <w:t>3.5</w:t>
+      </w:r>
+      <w:r>
+        <w:rPr>
+          <w:rFonts w:ascii="Times New Roman" w:hAnsi="Times New Roman" w:cs="Times New Roman"/>
+          <w:b/>
+          <w:sz w:val="32"/>
+          <w:szCs w:val="32"/>
+        </w:rPr>
+        <w:t xml:space="preserve"> </w:t>
+      </w:r>
+      <w:r>
+        <w:rPr>
+          <w:rFonts w:ascii="Times New Roman" w:hAnsi="Times New Roman" w:cs="Times New Roman"/>
+          <w:b/>
+          <w:sz w:val="32"/>
+          <w:szCs w:val="32"/>
+        </w:rPr>
+        <w:t>Real-Time Data Ingestion</w:t>
+      </w:r>
+      <w:r>
+        <w:rPr>
+          <w:rFonts w:ascii="Times New Roman" w:hAnsi="Times New Roman" w:cs="Times New Roman"/>
+          <w:sz w:val="32"/>
+          <w:szCs w:val="32"/>
+        </w:rPr>
+        <w:br/>
+      </w:r>
+      <w:r>
+        <w:rPr>
+          <w:rFonts w:ascii="Times New Roman" w:hAnsi="Times New Roman" w:cs="Times New Roman"/>
+          <w:sz w:val="24"/>
+          <w:szCs w:val="24"/>
+        </w:rPr>
+        <w:t>The</w:t>
+      </w:r>
+      <w:r>
+        <w:rPr>
+          <w:rFonts w:ascii="Times New Roman" w:hAnsi="Times New Roman" w:cs="Times New Roman"/>
+          <w:sz w:val="24"/>
+          <w:szCs w:val="24"/>
+        </w:rPr>
+        <w:t xml:space="preserve"> data ingestion component was </w:t>
+      </w:r>
+      <w:r>
+        <w:rPr>
+          <w:rFonts w:ascii="Times New Roman" w:hAnsi="Times New Roman" w:cs="Times New Roman"/>
+          <w:sz w:val="24"/>
+          <w:szCs w:val="24"/>
+        </w:rPr>
+        <w:t xml:space="preserve">designed to simulate a </w:t>
+      </w:r>
+      <w:r>
+        <w:rPr>
+          <w:rFonts w:ascii="Times New Roman" w:hAnsi="Times New Roman" w:cs="Times New Roman"/>
+          <w:sz w:val="24"/>
+          <w:szCs w:val="24"/>
+        </w:rPr>
+        <w:t>practical</w:t>
+      </w:r>
+      <w:r>
+        <w:rPr>
+          <w:rFonts w:ascii="Times New Roman" w:hAnsi="Times New Roman" w:cs="Times New Roman"/>
+          <w:sz w:val="24"/>
+          <w:szCs w:val="24"/>
+        </w:rPr>
+        <w:t xml:space="preserve"> retail workflow. Instead of directly inserting records into the database through standalone scripts, the system uses API-based ingestion.</w:t>
+      </w:r>
+      <w:r>
+        <w:rPr>
+          <w:rFonts w:ascii="Times New Roman" w:hAnsi="Times New Roman" w:cs="Times New Roman"/>
+          <w:sz w:val="24"/>
+          <w:szCs w:val="24"/>
+        </w:rPr>
+        <w:br/>
+      </w:r>
+      <w:r>
+        <w:rPr>
+          <w:rFonts w:ascii="Times New Roman" w:hAnsi="Times New Roman" w:cs="Times New Roman"/>
+          <w:sz w:val="24"/>
+          <w:szCs w:val="24"/>
+        </w:rPr>
+        <w:br/>
+        <w:t>An external client simulates a supermarket operational system by generating sales and inventory events and sending them to the FastAPI backend through the /sales-event endpoint</w:t>
+      </w:r>
+      <w:r>
+        <w:rPr>
+          <w:rFonts w:ascii="Times New Roman" w:hAnsi="Times New Roman" w:cs="Times New Roman"/>
+          <w:sz w:val="24"/>
+          <w:szCs w:val="24"/>
+        </w:rPr>
+        <w:t>.</w:t>
+      </w:r>
+      <w:r>
+        <w:rPr>
+          <w:rFonts w:ascii="Times New Roman" w:hAnsi="Times New Roman" w:cs="Times New Roman"/>
+          <w:sz w:val="24"/>
+          <w:szCs w:val="24"/>
+        </w:rPr>
+        <w:t xml:space="preserve"> Incoming API requests are validated using </w:t>
+      </w:r>
+      <w:proofErr w:type="spellStart"/>
+      <w:r>
+        <w:rPr>
+          <w:rFonts w:ascii="Times New Roman" w:hAnsi="Times New Roman" w:cs="Times New Roman"/>
+          <w:sz w:val="24"/>
+          <w:szCs w:val="24"/>
+        </w:rPr>
+        <w:t>Pydantic</w:t>
+      </w:r>
+      <w:proofErr w:type="spellEnd"/>
+      <w:r>
+        <w:rPr>
+          <w:rFonts w:ascii="Times New Roman" w:hAnsi="Times New Roman" w:cs="Times New Roman"/>
+          <w:sz w:val="24"/>
+          <w:szCs w:val="24"/>
+        </w:rPr>
+        <w:t xml:space="preserve"> schema models before insertion into the SQLite database.</w:t>
+      </w:r>
+    </w:p>
+    <w:p>
+      <w:pPr>
+        <w:rPr>
+          <w:rFonts w:ascii="Times New Roman" w:hAnsi="Times New Roman" w:cs="Times New Roman"/>
+          <w:sz w:val="24"/>
+          <w:szCs w:val="24"/>
+        </w:rPr>
+      </w:pPr>
+      <w:r>
+        <w:rPr>
+          <w:rFonts w:ascii="Times New Roman" w:hAnsi="Times New Roman" w:cs="Times New Roman"/>
+          <w:noProof/>
+          <w:sz w:val="24"/>
+          <w:szCs w:val="24"/>
+        </w:rPr>
+        <w:lastRenderedPageBreak/>
         <w:drawing>
           <wp:inline distT="0" distB="0" distL="0" distR="0" wp14:anchorId="4DE71013" wp14:editId="79E97B39">
-            <wp:extent cx="5511800" cy="2203450"/>
+            <wp:extent cx="5511045" cy="3137095"/>
             <wp:effectExtent l="0" t="0" r="0" b="6350"/>
             <wp:docPr id="1" name="Picture 1"/>
             <wp:cNvGraphicFramePr>
@@ -824,7 +2134,7 @@
                   <pic:spPr>
                     <a:xfrm>
                       <a:off x="0" y="0"/>
-                      <a:ext cx="5511800" cy="2203450"/>
+                      <a:ext cx="5533419" cy="3149831"/>
                     </a:xfrm>
                     <a:prstGeom prst="rect">
                       <a:avLst/>
@@ -848,13 +2158,14 @@
       <w:r>
         <w:rPr>
           <w:rFonts w:ascii="Times New Roman" w:hAnsi="Times New Roman" w:cs="Times New Roman"/>
+          <w:noProof/>
           <w:sz w:val="24"/>
           <w:szCs w:val="24"/>
         </w:rPr>
         <w:drawing>
           <wp:inline distT="0" distB="0" distL="0" distR="0" wp14:anchorId="051CD25E" wp14:editId="48A1B4F9">
-            <wp:extent cx="5486400" cy="2241550"/>
-            <wp:effectExtent l="0" t="0" r="0" b="6350"/>
+            <wp:extent cx="5485373" cy="2595489"/>
+            <wp:effectExtent l="0" t="0" r="1270" b="0"/>
             <wp:docPr id="2" name="Picture 2"/>
             <wp:cNvGraphicFramePr>
               <a:graphicFrameLocks xmlns:a="http://schemas.openxmlformats.org/drawingml/2006/main" noChangeAspect="1"/>
@@ -875,7 +2186,7 @@
                   <pic:spPr>
                     <a:xfrm>
                       <a:off x="0" y="0"/>
-                      <a:ext cx="5486400" cy="2241550"/>
+                      <a:ext cx="5517995" cy="2610924"/>
                     </a:xfrm>
                     <a:prstGeom prst="rect">
                       <a:avLst/>
@@ -893,16 +2204,16 @@
         <w:jc w:val="center"/>
         <w:rPr>
           <w:rFonts w:ascii="Times New Roman" w:hAnsi="Times New Roman" w:cs="Times New Roman"/>
-          <w:sz w:val="28"/>
-          <w:szCs w:val="28"/>
+          <w:sz w:val="24"/>
+          <w:szCs w:val="24"/>
         </w:rPr>
       </w:pPr>
       <w:r>
         <w:rPr>
           <w:rFonts w:ascii="Times New Roman" w:hAnsi="Times New Roman" w:cs="Times New Roman"/>
           <w:b/>
-          <w:sz w:val="28"/>
-          <w:szCs w:val="28"/>
+          <w:sz w:val="24"/>
+          <w:szCs w:val="24"/>
         </w:rPr>
         <w:t xml:space="preserve">Figure 2: </w:t>
       </w:r>
@@ -910,8 +2221,8 @@
         <w:rPr>
           <w:rFonts w:ascii="Times New Roman" w:hAnsi="Times New Roman" w:cs="Times New Roman"/>
           <w:b/>
-          <w:sz w:val="28"/>
-          <w:szCs w:val="28"/>
+          <w:sz w:val="24"/>
+          <w:szCs w:val="24"/>
         </w:rPr>
         <w:t xml:space="preserve">Production-style API ingestion workflow using the FastAPI </w:t>
       </w:r>
@@ -920,8 +2231,8 @@
           <w:rStyle w:val="HTMLCode"/>
           <w:rFonts w:ascii="Times New Roman" w:eastAsiaTheme="minorEastAsia" w:hAnsi="Times New Roman" w:cs="Times New Roman"/>
           <w:b/>
-          <w:sz w:val="28"/>
-          <w:szCs w:val="28"/>
+          <w:sz w:val="24"/>
+          <w:szCs w:val="24"/>
         </w:rPr>
         <w:t>/sales-event</w:t>
       </w:r>
@@ -929,8 +2240,8 @@
         <w:rPr>
           <w:rFonts w:ascii="Times New Roman" w:hAnsi="Times New Roman" w:cs="Times New Roman"/>
           <w:b/>
-          <w:sz w:val="28"/>
-          <w:szCs w:val="28"/>
+          <w:sz w:val="24"/>
+          <w:szCs w:val="24"/>
         </w:rPr>
         <w:t xml:space="preserve"> endpoint.</w:t>
       </w:r>
@@ -949,7 +2260,6 @@
           <w:sz w:val="24"/>
           <w:szCs w:val="24"/>
         </w:rPr>
-        <w:lastRenderedPageBreak/>
         <w:t xml:space="preserve">Each generated retail event is validated by the FastAPI backend and then stored inside the SQLite </w:t>
       </w:r>
       <w:proofErr w:type="spellStart"/>
@@ -968,7 +2278,23 @@
           <w:sz w:val="24"/>
           <w:szCs w:val="24"/>
         </w:rPr>
-        <w:t xml:space="preserve"> table. This simulates how real retail systems continuously stream operational inventory data into machine learning pipelines.</w:t>
+        <w:t xml:space="preserve"> table. This simulates how real retail systems </w:t>
+      </w:r>
+      <w:r>
+        <w:rPr>
+          <w:rFonts w:ascii="Times New Roman" w:hAnsi="Times New Roman" w:cs="Times New Roman"/>
+          <w:sz w:val="24"/>
+          <w:szCs w:val="24"/>
+        </w:rPr>
+        <w:t xml:space="preserve">continuously stream </w:t>
+      </w:r>
+      <w:r>
+        <w:rPr>
+          <w:rFonts w:ascii="Times New Roman" w:hAnsi="Times New Roman" w:cs="Times New Roman"/>
+          <w:sz w:val="24"/>
+          <w:szCs w:val="24"/>
+        </w:rPr>
+        <w:t>inventory data into machine learning pipelines.</w:t>
       </w:r>
     </w:p>
     <w:p>
@@ -1028,7 +2354,16 @@
           <w:szCs w:val="24"/>
         </w:rPr>
         <w:br/>
-        <w:t>The Walmart Store Sales Forecasting dataset from Kaggle was integrated into the system as historical training data. The dataset contains historical sales information across multiple Walmart stores and departments, including holiday-related effects a</w:t>
+        <w:t xml:space="preserve">The Walmart Store Sales Forecasting dataset from Kaggle was integrated into the system </w:t>
+      </w:r>
+      <w:r>
+        <w:rPr>
+          <w:rFonts w:ascii="Times New Roman" w:hAnsi="Times New Roman" w:cs="Times New Roman"/>
+          <w:sz w:val="24"/>
+          <w:szCs w:val="24"/>
+        </w:rPr>
+        <w:lastRenderedPageBreak/>
+        <w:t>as historical training data. The dataset contains historical sales information across multiple Walmart stores and departments, including holiday-related effects a</w:t>
       </w:r>
       <w:r>
         <w:rPr>
@@ -1041,6 +2376,7 @@
     </w:p>
     <w:p>
       <w:pPr>
+        <w:jc w:val="both"/>
         <w:rPr>
           <w:rFonts w:ascii="Times New Roman" w:hAnsi="Times New Roman" w:cs="Times New Roman"/>
           <w:sz w:val="24"/>
@@ -1054,761 +2390,233 @@
           <w:szCs w:val="24"/>
         </w:rPr>
         <w:t>Additional API endpoints such as /latest-sales were implemented to support production-like ingestion and data validation workflows.</w:t>
+      </w:r>
+      <w:r>
+        <w:rPr>
+          <w:rFonts w:ascii="Times New Roman" w:hAnsi="Times New Roman" w:cs="Times New Roman"/>
+          <w:sz w:val="24"/>
+          <w:szCs w:val="24"/>
+        </w:rPr>
+        <w:t xml:space="preserve"> </w:t>
+      </w:r>
+      <w:r>
+        <w:rPr>
+          <w:rFonts w:ascii="Times New Roman" w:hAnsi="Times New Roman" w:cs="Times New Roman"/>
+          <w:sz w:val="24"/>
+          <w:szCs w:val="24"/>
+        </w:rPr>
+        <w:t xml:space="preserve">Since the dataset does not contain real inventory expiry or food waste information, additional inventory-related variables such as </w:t>
+      </w:r>
+      <w:proofErr w:type="spellStart"/>
+      <w:r>
+        <w:rPr>
+          <w:rFonts w:ascii="Times New Roman" w:hAnsi="Times New Roman" w:cs="Times New Roman"/>
+          <w:sz w:val="24"/>
+          <w:szCs w:val="24"/>
+        </w:rPr>
+        <w:t>current_stock</w:t>
+      </w:r>
+      <w:proofErr w:type="spellEnd"/>
+      <w:r>
+        <w:rPr>
+          <w:rFonts w:ascii="Times New Roman" w:hAnsi="Times New Roman" w:cs="Times New Roman"/>
+          <w:sz w:val="24"/>
+          <w:szCs w:val="24"/>
+        </w:rPr>
+        <w:t xml:space="preserve">, </w:t>
+      </w:r>
+      <w:proofErr w:type="spellStart"/>
+      <w:r>
+        <w:rPr>
+          <w:rFonts w:ascii="Times New Roman" w:hAnsi="Times New Roman" w:cs="Times New Roman"/>
+          <w:sz w:val="24"/>
+          <w:szCs w:val="24"/>
+        </w:rPr>
+        <w:t>expiry_days</w:t>
+      </w:r>
+      <w:proofErr w:type="spellEnd"/>
+      <w:r>
+        <w:rPr>
+          <w:rFonts w:ascii="Times New Roman" w:hAnsi="Times New Roman" w:cs="Times New Roman"/>
+          <w:sz w:val="24"/>
+          <w:szCs w:val="24"/>
+        </w:rPr>
+        <w:t xml:space="preserve">, </w:t>
+      </w:r>
+      <w:proofErr w:type="spellStart"/>
+      <w:r>
+        <w:rPr>
+          <w:rFonts w:ascii="Times New Roman" w:hAnsi="Times New Roman" w:cs="Times New Roman"/>
+          <w:sz w:val="24"/>
+          <w:szCs w:val="24"/>
+        </w:rPr>
+        <w:t>unit_price</w:t>
+      </w:r>
+      <w:proofErr w:type="spellEnd"/>
+      <w:r>
+        <w:rPr>
+          <w:rFonts w:ascii="Times New Roman" w:hAnsi="Times New Roman" w:cs="Times New Roman"/>
+          <w:sz w:val="24"/>
+          <w:szCs w:val="24"/>
+        </w:rPr>
+        <w:t xml:space="preserve">, and </w:t>
+      </w:r>
+      <w:proofErr w:type="spellStart"/>
+      <w:r>
+        <w:rPr>
+          <w:rFonts w:ascii="Times New Roman" w:hAnsi="Times New Roman" w:cs="Times New Roman"/>
+          <w:sz w:val="24"/>
+          <w:szCs w:val="24"/>
+        </w:rPr>
+        <w:t>waste_quantity</w:t>
+      </w:r>
+      <w:proofErr w:type="spellEnd"/>
+      <w:r>
+        <w:rPr>
+          <w:rFonts w:ascii="Times New Roman" w:hAnsi="Times New Roman" w:cs="Times New Roman"/>
+          <w:sz w:val="24"/>
+          <w:szCs w:val="24"/>
+        </w:rPr>
+        <w:t xml:space="preserve"> were synthetically generated to simulate inventory optimization and waste-risk analysis workflows within a </w:t>
+      </w:r>
+      <w:r>
+        <w:rPr>
+          <w:rFonts w:ascii="Times New Roman" w:hAnsi="Times New Roman" w:cs="Times New Roman"/>
+          <w:sz w:val="24"/>
+          <w:szCs w:val="24"/>
+        </w:rPr>
+        <w:t>practical</w:t>
+      </w:r>
+      <w:r>
+        <w:rPr>
+          <w:rFonts w:ascii="Times New Roman" w:hAnsi="Times New Roman" w:cs="Times New Roman"/>
+          <w:sz w:val="24"/>
+          <w:szCs w:val="24"/>
+        </w:rPr>
+        <w:t xml:space="preserve"> </w:t>
+      </w:r>
+      <w:proofErr w:type="spellStart"/>
+      <w:r>
+        <w:rPr>
+          <w:rFonts w:ascii="Times New Roman" w:hAnsi="Times New Roman" w:cs="Times New Roman"/>
+          <w:sz w:val="24"/>
+          <w:szCs w:val="24"/>
+        </w:rPr>
+        <w:t>MLOps</w:t>
+      </w:r>
+      <w:proofErr w:type="spellEnd"/>
+      <w:r>
+        <w:rPr>
+          <w:rFonts w:ascii="Times New Roman" w:hAnsi="Times New Roman" w:cs="Times New Roman"/>
+          <w:sz w:val="24"/>
+          <w:szCs w:val="24"/>
+        </w:rPr>
+        <w:t xml:space="preserve"> environment.</w:t>
       </w:r>
     </w:p>
     <w:p>
       <w:pPr>
-        <w:rPr>
-          <w:rFonts w:ascii="Times New Roman" w:hAnsi="Times New Roman" w:cs="Times New Roman"/>
-          <w:sz w:val="24"/>
-          <w:szCs w:val="24"/>
-        </w:rPr>
-      </w:pPr>
-      <w:r>
-        <w:rPr>
-          <w:rFonts w:ascii="Times New Roman" w:hAnsi="Times New Roman" w:cs="Times New Roman"/>
-          <w:sz w:val="24"/>
-          <w:szCs w:val="24"/>
-        </w:rPr>
-        <w:t xml:space="preserve">The Walmart Store Sales Forecasting dataset was used as the primary historical retail demand dataset. Since the dataset does not contain real inventory expiry or food waste information, additional inventory-related variables such as </w:t>
-      </w:r>
-      <w:proofErr w:type="spellStart"/>
-      <w:r>
-        <w:rPr>
-          <w:rFonts w:ascii="Times New Roman" w:hAnsi="Times New Roman" w:cs="Times New Roman"/>
-          <w:sz w:val="24"/>
-          <w:szCs w:val="24"/>
-        </w:rPr>
-        <w:t>current_stock</w:t>
-      </w:r>
-      <w:proofErr w:type="spellEnd"/>
-      <w:r>
-        <w:rPr>
-          <w:rFonts w:ascii="Times New Roman" w:hAnsi="Times New Roman" w:cs="Times New Roman"/>
-          <w:sz w:val="24"/>
-          <w:szCs w:val="24"/>
-        </w:rPr>
-        <w:t xml:space="preserve">, </w:t>
-      </w:r>
-      <w:proofErr w:type="spellStart"/>
-      <w:r>
-        <w:rPr>
-          <w:rFonts w:ascii="Times New Roman" w:hAnsi="Times New Roman" w:cs="Times New Roman"/>
-          <w:sz w:val="24"/>
-          <w:szCs w:val="24"/>
-        </w:rPr>
-        <w:t>expiry_days</w:t>
-      </w:r>
-      <w:proofErr w:type="spellEnd"/>
-      <w:r>
-        <w:rPr>
-          <w:rFonts w:ascii="Times New Roman" w:hAnsi="Times New Roman" w:cs="Times New Roman"/>
-          <w:sz w:val="24"/>
-          <w:szCs w:val="24"/>
-        </w:rPr>
-        <w:t xml:space="preserve">, </w:t>
-      </w:r>
-      <w:proofErr w:type="spellStart"/>
-      <w:r>
-        <w:rPr>
-          <w:rFonts w:ascii="Times New Roman" w:hAnsi="Times New Roman" w:cs="Times New Roman"/>
-          <w:sz w:val="24"/>
-          <w:szCs w:val="24"/>
-        </w:rPr>
-        <w:t>unit_price</w:t>
-      </w:r>
-      <w:proofErr w:type="spellEnd"/>
-      <w:r>
-        <w:rPr>
-          <w:rFonts w:ascii="Times New Roman" w:hAnsi="Times New Roman" w:cs="Times New Roman"/>
-          <w:sz w:val="24"/>
-          <w:szCs w:val="24"/>
-        </w:rPr>
-        <w:t xml:space="preserve">, and </w:t>
-      </w:r>
-      <w:proofErr w:type="spellStart"/>
-      <w:r>
-        <w:rPr>
-          <w:rFonts w:ascii="Times New Roman" w:hAnsi="Times New Roman" w:cs="Times New Roman"/>
-          <w:sz w:val="24"/>
-          <w:szCs w:val="24"/>
-        </w:rPr>
-        <w:t>waste_quantity</w:t>
-      </w:r>
-      <w:proofErr w:type="spellEnd"/>
-      <w:r>
-        <w:rPr>
-          <w:rFonts w:ascii="Times New Roman" w:hAnsi="Times New Roman" w:cs="Times New Roman"/>
-          <w:sz w:val="24"/>
-          <w:szCs w:val="24"/>
-        </w:rPr>
-        <w:t xml:space="preserve"> were synthetically generated to simulate inventory optimization and waste-risk analysis workflows within a production-oriented </w:t>
-      </w:r>
-      <w:proofErr w:type="spellStart"/>
-      <w:r>
-        <w:rPr>
-          <w:rFonts w:ascii="Times New Roman" w:hAnsi="Times New Roman" w:cs="Times New Roman"/>
-          <w:sz w:val="24"/>
-          <w:szCs w:val="24"/>
-        </w:rPr>
-        <w:t>MLOps</w:t>
-      </w:r>
-      <w:proofErr w:type="spellEnd"/>
-      <w:r>
-        <w:rPr>
-          <w:rFonts w:ascii="Times New Roman" w:hAnsi="Times New Roman" w:cs="Times New Roman"/>
-          <w:sz w:val="24"/>
-          <w:szCs w:val="24"/>
-        </w:rPr>
-        <w:t xml:space="preserve"> environment.</w:t>
-      </w:r>
+        <w:jc w:val="both"/>
+        <w:rPr>
+          <w:rFonts w:ascii="Times New Roman" w:hAnsi="Times New Roman" w:cs="Times New Roman"/>
+          <w:sz w:val="24"/>
+          <w:szCs w:val="24"/>
+        </w:rPr>
+      </w:pPr>
     </w:p>
     <w:p>
       <w:pPr>
-        <w:rPr>
-          <w:rFonts w:ascii="Times New Roman" w:hAnsi="Times New Roman" w:cs="Times New Roman"/>
-          <w:sz w:val="24"/>
-          <w:szCs w:val="24"/>
-        </w:rPr>
-      </w:pPr>
-      <w:r>
-        <w:rPr>
-          <w:rFonts w:ascii="Times New Roman" w:hAnsi="Times New Roman" w:cs="Times New Roman"/>
-          <w:sz w:val="28"/>
-          <w:szCs w:val="28"/>
-        </w:rPr>
-        <w:br/>
-      </w:r>
-      <w:r>
-        <w:rPr>
-          <w:rFonts w:ascii="Times New Roman" w:hAnsi="Times New Roman" w:cs="Times New Roman"/>
-          <w:b/>
-          <w:sz w:val="28"/>
-          <w:szCs w:val="28"/>
-        </w:rPr>
-        <w:t>3.2 Preprocessing</w:t>
-      </w:r>
-      <w:r>
-        <w:rPr>
-          <w:rFonts w:ascii="Times New Roman" w:hAnsi="Times New Roman" w:cs="Times New Roman"/>
-          <w:sz w:val="24"/>
-          <w:szCs w:val="24"/>
-        </w:rPr>
-        <w:br/>
-      </w:r>
-      <w:r>
-        <w:rPr>
-          <w:rFonts w:ascii="Times New Roman" w:hAnsi="Times New Roman" w:cs="Times New Roman"/>
-          <w:sz w:val="24"/>
-          <w:szCs w:val="24"/>
-        </w:rPr>
-        <w:br/>
-        <w:t>The preprocessing stage ensures consistency between training and inference.</w:t>
-      </w:r>
-      <w:r>
-        <w:rPr>
-          <w:rFonts w:ascii="Times New Roman" w:hAnsi="Times New Roman" w:cs="Times New Roman"/>
-          <w:sz w:val="24"/>
-          <w:szCs w:val="24"/>
-        </w:rPr>
-        <w:br/>
-      </w:r>
-      <w:r>
-        <w:rPr>
-          <w:rFonts w:ascii="Times New Roman" w:hAnsi="Times New Roman" w:cs="Times New Roman"/>
-          <w:sz w:val="24"/>
-          <w:szCs w:val="24"/>
-        </w:rPr>
-        <w:br/>
-        <w:t>The preprocessing pipeline reads sales records directly from the SQLite database and performs several transformation and cleaning op</w:t>
-      </w:r>
-      <w:r>
-        <w:rPr>
-          <w:rFonts w:ascii="Times New Roman" w:hAnsi="Times New Roman" w:cs="Times New Roman"/>
-          <w:sz w:val="24"/>
-          <w:szCs w:val="24"/>
-        </w:rPr>
-        <w:t>erations before model training.</w:t>
-      </w:r>
-      <w:r>
-        <w:rPr>
-          <w:rFonts w:ascii="Times New Roman" w:hAnsi="Times New Roman" w:cs="Times New Roman"/>
-          <w:sz w:val="24"/>
-          <w:szCs w:val="24"/>
-        </w:rPr>
-        <w:br/>
-        <w:t>The following preprocessing steps are applied:</w:t>
-      </w:r>
-      <w:r>
-        <w:rPr>
-          <w:rFonts w:ascii="Times New Roman" w:hAnsi="Times New Roman" w:cs="Times New Roman"/>
-          <w:sz w:val="24"/>
-          <w:szCs w:val="24"/>
-        </w:rPr>
-        <w:br/>
-        <w:t>• missing value handling</w:t>
-      </w:r>
-      <w:r>
-        <w:rPr>
-          <w:rFonts w:ascii="Times New Roman" w:hAnsi="Times New Roman" w:cs="Times New Roman"/>
-          <w:sz w:val="24"/>
-          <w:szCs w:val="24"/>
-        </w:rPr>
-        <w:br/>
-        <w:t>• numerical type conversion</w:t>
-      </w:r>
-      <w:r>
-        <w:rPr>
-          <w:rFonts w:ascii="Times New Roman" w:hAnsi="Times New Roman" w:cs="Times New Roman"/>
-          <w:sz w:val="24"/>
-          <w:szCs w:val="24"/>
-        </w:rPr>
-        <w:br/>
-        <w:t>• duplicate removal</w:t>
-      </w:r>
-      <w:r>
-        <w:rPr>
-          <w:rFonts w:ascii="Times New Roman" w:hAnsi="Times New Roman" w:cs="Times New Roman"/>
-          <w:sz w:val="24"/>
-          <w:szCs w:val="24"/>
-        </w:rPr>
-        <w:br/>
-        <w:t>• categorical encoding</w:t>
-      </w:r>
-      <w:r>
-        <w:rPr>
-          <w:rFonts w:ascii="Times New Roman" w:hAnsi="Times New Roman" w:cs="Times New Roman"/>
-          <w:sz w:val="24"/>
-          <w:szCs w:val="24"/>
-        </w:rPr>
-        <w:br/>
-        <w:t>• invalid value handling</w:t>
-      </w:r>
-      <w:r>
-        <w:rPr>
-          <w:rFonts w:ascii="Times New Roman" w:hAnsi="Times New Roman" w:cs="Times New Roman"/>
-          <w:sz w:val="24"/>
-          <w:szCs w:val="24"/>
-        </w:rPr>
-        <w:br/>
-        <w:t>• outlier safety handling</w:t>
-      </w:r>
-      <w:r>
-        <w:rPr>
-          <w:rFonts w:ascii="Times New Roman" w:hAnsi="Times New Roman" w:cs="Times New Roman"/>
-          <w:sz w:val="24"/>
-          <w:szCs w:val="24"/>
-        </w:rPr>
-        <w:br/>
-        <w:t>• feature engineering</w:t>
-      </w:r>
-      <w:r>
-        <w:rPr>
-          <w:rFonts w:ascii="Times New Roman" w:hAnsi="Times New Roman" w:cs="Times New Roman"/>
-          <w:sz w:val="24"/>
-          <w:szCs w:val="24"/>
-        </w:rPr>
-        <w:br/>
-      </w:r>
-      <w:r>
-        <w:rPr>
-          <w:rFonts w:ascii="Times New Roman" w:hAnsi="Times New Roman" w:cs="Times New Roman"/>
-          <w:sz w:val="24"/>
-          <w:szCs w:val="24"/>
-        </w:rPr>
-        <w:br/>
-        <w:t>SQLite was selected because it provides lightweight structured storage and integrates easily with Python-based machine learning pipelines.</w:t>
-      </w:r>
-      <w:r>
-        <w:rPr>
-          <w:rFonts w:ascii="Times New Roman" w:hAnsi="Times New Roman" w:cs="Times New Roman"/>
-          <w:sz w:val="24"/>
-          <w:szCs w:val="24"/>
-        </w:rPr>
-        <w:br/>
-      </w:r>
-      <w:r>
-        <w:rPr>
-          <w:rFonts w:ascii="Times New Roman" w:hAnsi="Times New Roman" w:cs="Times New Roman"/>
-          <w:sz w:val="24"/>
-          <w:szCs w:val="24"/>
-        </w:rPr>
-        <w:br/>
-        <w:t xml:space="preserve">Consistent preprocessing is important in MLOps systems because training-serving </w:t>
-      </w:r>
-      <w:r>
-        <w:rPr>
-          <w:rFonts w:ascii="Times New Roman" w:hAnsi="Times New Roman" w:cs="Times New Roman"/>
-          <w:sz w:val="24"/>
-          <w:szCs w:val="24"/>
-        </w:rPr>
-        <w:lastRenderedPageBreak/>
-        <w:t>mismatch may reduce prediction reliability. Therefore, the same preprocessing logic is reused during both training and prediction stages.</w:t>
-      </w:r>
-      <w:r>
-        <w:rPr>
-          <w:rFonts w:ascii="Times New Roman" w:hAnsi="Times New Roman" w:cs="Times New Roman"/>
-          <w:sz w:val="24"/>
-          <w:szCs w:val="24"/>
-        </w:rPr>
-        <w:br/>
-      </w:r>
-      <w:r>
-        <w:rPr>
-          <w:rFonts w:ascii="Times New Roman" w:hAnsi="Times New Roman" w:cs="Times New Roman"/>
-          <w:sz w:val="24"/>
-          <w:szCs w:val="24"/>
-        </w:rPr>
-        <w:br/>
-      </w:r>
-      <w:r>
-        <w:rPr>
-          <w:rFonts w:ascii="Times New Roman" w:hAnsi="Times New Roman" w:cs="Times New Roman"/>
-          <w:b/>
-          <w:sz w:val="28"/>
-          <w:szCs w:val="28"/>
-        </w:rPr>
-        <w:t>3.3 Feature Engineering</w:t>
-      </w:r>
-      <w:r>
-        <w:rPr>
-          <w:rFonts w:ascii="Times New Roman" w:hAnsi="Times New Roman" w:cs="Times New Roman"/>
-          <w:sz w:val="24"/>
-          <w:szCs w:val="24"/>
-        </w:rPr>
-        <w:br/>
-      </w:r>
-      <w:r>
-        <w:rPr>
-          <w:rFonts w:ascii="Times New Roman" w:hAnsi="Times New Roman" w:cs="Times New Roman"/>
-          <w:sz w:val="24"/>
-          <w:szCs w:val="24"/>
-        </w:rPr>
-        <w:br/>
-        <w:t>Feature engineering was applied to capture inventory behavior, sales patterns, operational conditions, and food waste risk.</w:t>
-      </w:r>
-      <w:r>
-        <w:rPr>
-          <w:rFonts w:ascii="Times New Roman" w:hAnsi="Times New Roman" w:cs="Times New Roman"/>
-          <w:sz w:val="24"/>
-          <w:szCs w:val="24"/>
-        </w:rPr>
-        <w:br/>
-      </w:r>
-      <w:r>
-        <w:rPr>
-          <w:rFonts w:ascii="Times New Roman" w:hAnsi="Times New Roman" w:cs="Times New Roman"/>
-          <w:sz w:val="24"/>
-          <w:szCs w:val="24"/>
-        </w:rPr>
-        <w:br/>
-      </w:r>
-      <w:r>
-        <w:rPr>
-          <w:rFonts w:ascii="Times New Roman" w:hAnsi="Times New Roman" w:cs="Times New Roman"/>
-          <w:sz w:val="24"/>
-          <w:szCs w:val="24"/>
-        </w:rPr>
-        <w:t>The following en</w:t>
-      </w:r>
-      <w:r>
-        <w:rPr>
-          <w:rFonts w:ascii="Times New Roman" w:hAnsi="Times New Roman" w:cs="Times New Roman"/>
-          <w:sz w:val="24"/>
-          <w:szCs w:val="24"/>
-        </w:rPr>
-        <w:t>gineered features were created:</w:t>
+        <w:pStyle w:val="Heading2"/>
+        <w:rPr>
+          <w:rFonts w:ascii="Times New Roman" w:hAnsi="Times New Roman" w:cs="Times New Roman"/>
+          <w:color w:val="auto"/>
+          <w:sz w:val="32"/>
+          <w:szCs w:val="32"/>
+        </w:rPr>
+      </w:pPr>
+      <w:r>
+        <w:rPr>
+          <w:rFonts w:ascii="Times New Roman" w:hAnsi="Times New Roman" w:cs="Times New Roman"/>
+          <w:color w:val="auto"/>
+          <w:sz w:val="32"/>
+          <w:szCs w:val="32"/>
+        </w:rPr>
+        <w:t>3.6 Prediction Workflow</w:t>
       </w:r>
     </w:p>
     <w:p>
       <w:pPr>
         <w:pStyle w:val="NormalWeb"/>
-        <w:numPr>
-          <w:ilvl w:val="0"/>
-          <w:numId w:val="10"/>
-        </w:numPr>
-      </w:pPr>
-      <w:proofErr w:type="spellStart"/>
-      <w:r>
-        <w:t>product_encoded</w:t>
-      </w:r>
-      <w:proofErr w:type="spellEnd"/>
-      <w:r>
-        <w:br/>
-        <w:t>This feature converts Walmart department identifiers into numerical values so that machine learning models can process product-level retail patterns.</w:t>
+      </w:pPr>
+      <w:r>
+        <w:t xml:space="preserve">After model training, the deployed FastAPI backend provides prediction services through the </w:t>
+      </w:r>
+      <w:r>
+        <w:rPr>
+          <w:rStyle w:val="HTMLCode"/>
+        </w:rPr>
+        <w:t>/predict-demand</w:t>
+      </w:r>
+      <w:r>
+        <w:t xml:space="preserve"> endpoint. Incoming prediction requests are validated and transformed using the same feature construction logic used during training.</w:t>
       </w:r>
     </w:p>
     <w:p>
       <w:pPr>
         <w:pStyle w:val="NormalWeb"/>
-        <w:numPr>
-          <w:ilvl w:val="0"/>
-          <w:numId w:val="10"/>
-        </w:numPr>
-      </w:pPr>
-      <w:proofErr w:type="spellStart"/>
-      <w:r>
-        <w:t>category_encoded</w:t>
-      </w:r>
-      <w:proofErr w:type="spellEnd"/>
-      <w:r>
-        <w:br/>
-        <w:t>This feature converts retail category labels into numerical representations to capture operational differences between store categories.</w:t>
+      </w:pPr>
+      <w:r>
+        <w:t>The prediction workflow includes feature construction, model inference, waste-risk estimation, inventory recommendation generation, and prediction logging.</w:t>
       </w:r>
     </w:p>
     <w:p>
       <w:pPr>
         <w:pStyle w:val="NormalWeb"/>
-        <w:numPr>
-          <w:ilvl w:val="0"/>
-          <w:numId w:val="10"/>
-        </w:numPr>
-      </w:pPr>
-      <w:proofErr w:type="spellStart"/>
-      <w:r>
-        <w:t>short_expiry</w:t>
-      </w:r>
-      <w:proofErr w:type="spellEnd"/>
-      <w:r>
-        <w:br/>
-        <w:t>This binary feature identifies products with limited remaining shelf life. Products with shorter expiry periods have higher probability of becoming unsold inventory and contributing to potential food waste.</w:t>
+      </w:pPr>
+      <w:r>
+        <w:t>The system predicts future product demand and combines predicted demand with current stock and expiry information to estimate waste risk. Based on this result, the system generates inventory recommendations to support retail decision-making.</w:t>
       </w:r>
     </w:p>
     <w:p>
       <w:pPr>
         <w:pStyle w:val="NormalWeb"/>
-        <w:numPr>
-          <w:ilvl w:val="0"/>
-          <w:numId w:val="10"/>
-        </w:numPr>
-      </w:pPr>
+      </w:pPr>
+      <w:r>
+        <w:t xml:space="preserve">Prediction outputs are stored in the </w:t>
+      </w:r>
       <w:proofErr w:type="spellStart"/>
       <w:r>
-        <w:t>promotion_active</w:t>
+        <w:t>prediction_logs</w:t>
       </w:r>
       <w:proofErr w:type="spellEnd"/>
       <w:r>
-        <w:br/>
-        <w:t>This feature identifies whether promotional campaigns are active. Promotions may temporarily increase customer demand and reduce the probability of overstock-related waste.</w:t>
+        <w:t xml:space="preserve"> table for monitoring and traceability.</w:t>
       </w:r>
     </w:p>
     <w:p>
       <w:pPr>
-        <w:pStyle w:val="NormalWeb"/>
-        <w:numPr>
-          <w:ilvl w:val="0"/>
-          <w:numId w:val="10"/>
-        </w:numPr>
-      </w:pPr>
-      <w:proofErr w:type="spellStart"/>
-      <w:r>
-        <w:t>is_weekend</w:t>
-      </w:r>
-      <w:proofErr w:type="spellEnd"/>
-      <w:r>
-        <w:br/>
-        <w:t>This feature captures weekend purchasing behavior because retail demand often changes during weekends compared to weekdays.</w:t>
-      </w:r>
-    </w:p>
-    <w:p>
-      <w:pPr>
-        <w:pStyle w:val="NormalWeb"/>
-        <w:numPr>
-          <w:ilvl w:val="0"/>
-          <w:numId w:val="10"/>
-        </w:numPr>
-      </w:pPr>
-      <w:proofErr w:type="spellStart"/>
-      <w:r>
-        <w:t>day_of_week</w:t>
-      </w:r>
-      <w:proofErr w:type="spellEnd"/>
-      <w:r>
-        <w:br/>
-        <w:t>This feature captures daily purchasing patterns across the retail week to improve forecasting consistency.</w:t>
-      </w:r>
-    </w:p>
-    <w:p>
-      <w:pPr>
-        <w:pStyle w:val="NormalWeb"/>
-        <w:numPr>
-          <w:ilvl w:val="0"/>
-          <w:numId w:val="10"/>
-        </w:numPr>
-      </w:pPr>
-      <w:proofErr w:type="spellStart"/>
-      <w:r>
-        <w:t>stock_to_sales_ratio</w:t>
-      </w:r>
-      <w:proofErr w:type="spellEnd"/>
-      <w:r>
-        <w:br/>
-        <w:t>This engineered feature measures the relationship between current inventory and recent sales activity. Higher ratios may indicate overstock situations that could increase waste risk.</w:t>
-      </w:r>
-    </w:p>
-    <w:p>
-      <w:pPr>
-        <w:pStyle w:val="NormalWeb"/>
-        <w:numPr>
-          <w:ilvl w:val="0"/>
-          <w:numId w:val="10"/>
-        </w:numPr>
-      </w:pPr>
-      <w:proofErr w:type="spellStart"/>
-      <w:r>
-        <w:t>waste_risk_score</w:t>
-      </w:r>
-      <w:proofErr w:type="spellEnd"/>
-      <w:r>
-        <w:br/>
-        <w:t>This feature combines inventory level, demand level, and expiry-related conditions into a simplified operational waste-risk indicator for inventory monitoring.</w:t>
-      </w:r>
-    </w:p>
-    <w:p>
-      <w:pPr>
-        <w:rPr>
-          <w:rFonts w:ascii="Times New Roman" w:hAnsi="Times New Roman" w:cs="Times New Roman"/>
-          <w:sz w:val="24"/>
-          <w:szCs w:val="24"/>
-        </w:rPr>
-      </w:pPr>
-      <w:r>
-        <w:rPr>
-          <w:rFonts w:ascii="Times New Roman" w:hAnsi="Times New Roman" w:cs="Times New Roman"/>
-          <w:sz w:val="24"/>
-          <w:szCs w:val="24"/>
-        </w:rPr>
-        <w:t>These engineered features were selected because they help capture operational retail behavior, inventory conditions, and demand-related business patterns.</w:t>
-      </w:r>
-      <w:r>
-        <w:rPr>
-          <w:rFonts w:ascii="Times New Roman" w:hAnsi="Times New Roman" w:cs="Times New Roman"/>
-          <w:sz w:val="24"/>
-          <w:szCs w:val="24"/>
-        </w:rPr>
-        <w:br/>
-      </w:r>
-      <w:r>
-        <w:rPr>
-          <w:rFonts w:ascii="Times New Roman" w:hAnsi="Times New Roman" w:cs="Times New Roman"/>
-          <w:sz w:val="24"/>
-          <w:szCs w:val="24"/>
-        </w:rPr>
-        <w:br/>
-        <w:t>The same feature engineering logic is reused during both training and prediction to reduce training-serving skew.</w:t>
-      </w:r>
-      <w:r>
-        <w:rPr>
-          <w:rFonts w:ascii="Times New Roman" w:hAnsi="Times New Roman" w:cs="Times New Roman"/>
-          <w:sz w:val="24"/>
-          <w:szCs w:val="24"/>
-        </w:rPr>
-        <w:br/>
-      </w:r>
-      <w:r>
-        <w:rPr>
-          <w:rFonts w:ascii="Times New Roman" w:hAnsi="Times New Roman" w:cs="Times New Roman"/>
-          <w:sz w:val="24"/>
-          <w:szCs w:val="24"/>
-        </w:rPr>
-        <w:lastRenderedPageBreak/>
-        <w:br/>
-      </w:r>
-      <w:r>
-        <w:rPr>
-          <w:rFonts w:ascii="Times New Roman" w:hAnsi="Times New Roman" w:cs="Times New Roman"/>
-          <w:b/>
-          <w:sz w:val="28"/>
-          <w:szCs w:val="28"/>
-        </w:rPr>
-        <w:t>3.4 Model Training</w:t>
-      </w:r>
-      <w:r>
-        <w:rPr>
-          <w:rFonts w:ascii="Times New Roman" w:hAnsi="Times New Roman" w:cs="Times New Roman"/>
-          <w:sz w:val="24"/>
-          <w:szCs w:val="24"/>
-        </w:rPr>
-        <w:br/>
-      </w:r>
-      <w:r>
-        <w:rPr>
-          <w:rFonts w:ascii="Times New Roman" w:hAnsi="Times New Roman" w:cs="Times New Roman"/>
-          <w:sz w:val="24"/>
-          <w:szCs w:val="24"/>
-        </w:rPr>
-        <w:br/>
-        <w:t>A Random Forest regression model was selected for demand forecasting because it performs effectively on structured retail datasets and can capture non-linear operati</w:t>
-      </w:r>
-      <w:r>
-        <w:rPr>
-          <w:rFonts w:ascii="Times New Roman" w:hAnsi="Times New Roman" w:cs="Times New Roman"/>
-          <w:sz w:val="24"/>
-          <w:szCs w:val="24"/>
-        </w:rPr>
-        <w:t>onal relationships.</w:t>
-      </w:r>
-      <w:r>
-        <w:rPr>
-          <w:rFonts w:ascii="Times New Roman" w:hAnsi="Times New Roman" w:cs="Times New Roman"/>
-          <w:sz w:val="24"/>
-          <w:szCs w:val="24"/>
-        </w:rPr>
-        <w:br/>
-        <w:t>The target variable used for training is units_sold, representing future product demand.</w:t>
-      </w:r>
-      <w:r>
-        <w:rPr>
-          <w:rFonts w:ascii="Times New Roman" w:hAnsi="Times New Roman" w:cs="Times New Roman"/>
-          <w:sz w:val="24"/>
-          <w:szCs w:val="24"/>
-        </w:rPr>
-        <w:br/>
-      </w:r>
-      <w:r>
-        <w:rPr>
-          <w:rFonts w:ascii="Times New Roman" w:hAnsi="Times New Roman" w:cs="Times New Roman"/>
-          <w:sz w:val="24"/>
-          <w:szCs w:val="24"/>
-        </w:rPr>
-        <w:br/>
-        <w:t>The training pipeline begins by loading the processed dataset and separating the target variable from input features. The dataset is then divided into training and testing subsets using train_test_split to evaluate model performance on unseen records.</w:t>
-      </w:r>
-      <w:r>
-        <w:rPr>
-          <w:rFonts w:ascii="Times New Roman" w:hAnsi="Times New Roman" w:cs="Times New Roman"/>
-          <w:sz w:val="24"/>
-          <w:szCs w:val="24"/>
-        </w:rPr>
-        <w:br/>
-      </w:r>
-      <w:r>
-        <w:rPr>
-          <w:rFonts w:ascii="Times New Roman" w:hAnsi="Times New Roman" w:cs="Times New Roman"/>
-          <w:sz w:val="24"/>
-          <w:szCs w:val="24"/>
-        </w:rPr>
-        <w:br/>
-        <w:t>After training, the model generates predictions on the test set.</w:t>
-      </w:r>
-      <w:r>
-        <w:rPr>
-          <w:rFonts w:ascii="Times New Roman" w:hAnsi="Times New Roman" w:cs="Times New Roman"/>
-          <w:sz w:val="24"/>
-          <w:szCs w:val="24"/>
-        </w:rPr>
-        <w:br/>
-      </w:r>
-      <w:r>
-        <w:rPr>
-          <w:rFonts w:ascii="Times New Roman" w:hAnsi="Times New Roman" w:cs="Times New Roman"/>
-          <w:sz w:val="24"/>
-          <w:szCs w:val="24"/>
-        </w:rPr>
-        <w:br/>
-        <w:t>The model is evaluated using:</w:t>
-      </w:r>
-      <w:r>
-        <w:rPr>
-          <w:rFonts w:ascii="Times New Roman" w:hAnsi="Times New Roman" w:cs="Times New Roman"/>
-          <w:sz w:val="24"/>
-          <w:szCs w:val="24"/>
-        </w:rPr>
-        <w:br/>
-        <w:t>• MAE (Mean Absolute Error)</w:t>
-      </w:r>
-      <w:r>
-        <w:rPr>
-          <w:rFonts w:ascii="Times New Roman" w:hAnsi="Times New Roman" w:cs="Times New Roman"/>
-          <w:sz w:val="24"/>
-          <w:szCs w:val="24"/>
-        </w:rPr>
-        <w:br/>
-        <w:t>• RMSE (Root Mean Squared Error)</w:t>
-      </w:r>
-      <w:r>
-        <w:rPr>
-          <w:rFonts w:ascii="Times New Roman" w:hAnsi="Times New Roman" w:cs="Times New Roman"/>
-          <w:sz w:val="24"/>
-          <w:szCs w:val="24"/>
-        </w:rPr>
-        <w:br/>
-        <w:t>• R² Score</w:t>
-      </w:r>
-      <w:r>
-        <w:rPr>
-          <w:rFonts w:ascii="Times New Roman" w:hAnsi="Times New Roman" w:cs="Times New Roman"/>
-          <w:sz w:val="24"/>
-          <w:szCs w:val="24"/>
-        </w:rPr>
-        <w:br/>
-      </w:r>
-      <w:r>
-        <w:rPr>
-          <w:rFonts w:ascii="Times New Roman" w:hAnsi="Times New Roman" w:cs="Times New Roman"/>
-          <w:sz w:val="24"/>
-          <w:szCs w:val="24"/>
-        </w:rPr>
-        <w:br/>
-        <w:t>MAE measures average prediction error, RMSE penalizes larger prediction errors, and R² evaluates how well the mod</w:t>
-      </w:r>
-      <w:r>
-        <w:rPr>
-          <w:rFonts w:ascii="Times New Roman" w:hAnsi="Times New Roman" w:cs="Times New Roman"/>
-          <w:sz w:val="24"/>
-          <w:szCs w:val="24"/>
-        </w:rPr>
-        <w:t xml:space="preserve">el explains demand variability. </w:t>
-      </w:r>
-      <w:r>
-        <w:rPr>
-          <w:rFonts w:ascii="Times New Roman" w:hAnsi="Times New Roman" w:cs="Times New Roman"/>
-          <w:sz w:val="24"/>
-          <w:szCs w:val="24"/>
-        </w:rPr>
-        <w:t>After successful training, artifacts including trained models, feature schemas, and evaluation metrics are stored for reproducibility and deployment.</w:t>
-      </w:r>
-      <w:r>
-        <w:rPr>
-          <w:rFonts w:ascii="Times New Roman" w:hAnsi="Times New Roman" w:cs="Times New Roman"/>
-          <w:sz w:val="24"/>
-          <w:szCs w:val="24"/>
-        </w:rPr>
-        <w:br/>
-      </w:r>
-      <w:r>
-        <w:rPr>
-          <w:rFonts w:ascii="Times New Roman" w:hAnsi="Times New Roman" w:cs="Times New Roman"/>
-          <w:sz w:val="24"/>
-          <w:szCs w:val="24"/>
-        </w:rPr>
-        <w:br/>
-      </w:r>
-      <w:r>
-        <w:rPr>
-          <w:rFonts w:ascii="Times New Roman" w:hAnsi="Times New Roman" w:cs="Times New Roman"/>
-          <w:sz w:val="24"/>
-          <w:szCs w:val="24"/>
-        </w:rPr>
-        <w:t>Structured artifact storage was implemented to organize trained models, metrics, drift reports, and monitoring outputs.</w:t>
-      </w:r>
-    </w:p>
-    <w:p>
-      <w:pPr>
-        <w:rPr>
-          <w:rFonts w:ascii="Times New Roman" w:hAnsi="Times New Roman" w:cs="Times New Roman"/>
-          <w:b/>
-          <w:sz w:val="24"/>
-          <w:szCs w:val="24"/>
-        </w:rPr>
-      </w:pPr>
-      <w:r>
         <w:rPr>
           <w:rFonts w:ascii="Times New Roman" w:hAnsi="Times New Roman" w:cs="Times New Roman"/>
           <w:b/>
           <w:sz w:val="32"/>
           <w:szCs w:val="32"/>
         </w:rPr>
+      </w:pPr>
+      <w:r>
+        <w:rPr>
+          <w:rFonts w:ascii="Times New Roman" w:hAnsi="Times New Roman" w:cs="Times New Roman"/>
+          <w:sz w:val="32"/>
+          <w:szCs w:val="32"/>
+        </w:rPr>
+        <w:br/>
+      </w:r>
+      <w:r>
+        <w:rPr>
+          <w:rFonts w:ascii="Times New Roman" w:hAnsi="Times New Roman" w:cs="Times New Roman"/>
+          <w:b/>
+          <w:sz w:val="32"/>
+          <w:szCs w:val="32"/>
+        </w:rPr>
         <w:t>4. Evaluation, Monitoring, and Versioning Strategy</w:t>
       </w:r>
     </w:p>
@@ -1824,8 +2632,8 @@
         <w:rPr>
           <w:rFonts w:ascii="Times New Roman" w:hAnsi="Times New Roman" w:cs="Times New Roman"/>
           <w:b/>
-          <w:sz w:val="28"/>
-          <w:szCs w:val="28"/>
+          <w:sz w:val="32"/>
+          <w:szCs w:val="32"/>
         </w:rPr>
         <w:t>4.1 Evaluation</w:t>
       </w:r>
@@ -1873,19 +2681,11 @@
       </w:r>
       <w:r>
         <w:rPr>
-          <w:rFonts w:ascii="Times New Roman" w:eastAsia="Times New Roman" w:hAnsi="Symbol" w:cs="Times New Roman"/>
-          <w:sz w:val="24"/>
-          <w:szCs w:val="24"/>
-        </w:rPr>
-        <w:t></w:t>
-      </w:r>
-      <w:r>
-        <w:rPr>
           <w:rFonts w:ascii="Times New Roman" w:eastAsia="Times New Roman" w:hAnsi="Times New Roman" w:cs="Times New Roman"/>
           <w:sz w:val="24"/>
           <w:szCs w:val="24"/>
         </w:rPr>
-        <w:t xml:space="preserve">  MAE ≈ 253 </w:t>
+        <w:t xml:space="preserve">  MAE ≈ 253 </w:t>
       </w:r>
     </w:p>
     <w:p>
@@ -1899,19 +2699,11 @@
       <w:proofErr w:type="gramStart"/>
       <w:r>
         <w:rPr>
-          <w:rFonts w:ascii="Times New Roman" w:eastAsia="Times New Roman" w:hAnsi="Symbol" w:cs="Times New Roman"/>
-          <w:sz w:val="24"/>
-          <w:szCs w:val="24"/>
-        </w:rPr>
-        <w:t></w:t>
-      </w:r>
-      <w:r>
-        <w:rPr>
           <w:rFonts w:ascii="Times New Roman" w:eastAsia="Times New Roman" w:hAnsi="Times New Roman" w:cs="Times New Roman"/>
           <w:sz w:val="24"/>
           <w:szCs w:val="24"/>
         </w:rPr>
-        <w:t xml:space="preserve">  RMSE</w:t>
+        <w:t>  RMSE</w:t>
       </w:r>
       <w:proofErr w:type="gramEnd"/>
       <w:r>
@@ -1934,19 +2726,11 @@
       <w:proofErr w:type="gramStart"/>
       <w:r>
         <w:rPr>
-          <w:rFonts w:ascii="Times New Roman" w:eastAsia="Times New Roman" w:hAnsi="Symbol" w:cs="Times New Roman"/>
-          <w:sz w:val="24"/>
-          <w:szCs w:val="24"/>
-        </w:rPr>
-        <w:t></w:t>
-      </w:r>
-      <w:r>
-        <w:rPr>
           <w:rFonts w:ascii="Times New Roman" w:eastAsia="Times New Roman" w:hAnsi="Times New Roman" w:cs="Times New Roman"/>
           <w:sz w:val="24"/>
           <w:szCs w:val="24"/>
         </w:rPr>
-        <w:t xml:space="preserve">  R</w:t>
+        <w:t>  R</w:t>
       </w:r>
       <w:proofErr w:type="gramEnd"/>
       <w:r>
@@ -2075,13 +2859,15 @@
         <w:br/>
       </w:r>
       <w:r>
-        <w:rPr>
-          <w:rFonts w:ascii="Times New Roman" w:hAnsi="Times New Roman" w:cs="Times New Roman"/>
-          <w:sz w:val="24"/>
-          <w:szCs w:val="24"/>
-        </w:rPr>
-        <w:br/>
-        <w:t>Using multiple evaluation metrics improves model assessment compared to rel</w:t>
+        <w:t>Using multiple metrics provides a better understanding of model performance</w:t>
+      </w:r>
+      <w:r>
+        <w:rPr>
+          <w:rFonts w:ascii="Times New Roman" w:hAnsi="Times New Roman" w:cs="Times New Roman"/>
+          <w:sz w:val="24"/>
+          <w:szCs w:val="24"/>
+        </w:rPr>
+        <w:t xml:space="preserve"> compared to rel</w:t>
       </w:r>
       <w:r>
         <w:rPr>
@@ -2112,8 +2898,8 @@
         <w:rPr>
           <w:rFonts w:ascii="Times New Roman" w:hAnsi="Times New Roman" w:cs="Times New Roman"/>
           <w:b/>
-          <w:sz w:val="28"/>
-          <w:szCs w:val="28"/>
+          <w:sz w:val="32"/>
+          <w:szCs w:val="32"/>
         </w:rPr>
         <w:t>4.2 Monitoring</w:t>
       </w:r>
@@ -2200,17 +2986,11 @@
           <w:sz w:val="24"/>
           <w:szCs w:val="24"/>
         </w:rPr>
-        <w:t>In real-world retail environments, customer purchasing behavior, product demand, inventory levels, and seasonal patterns continuously change. As a result, the statistical distribution of incoming operational data may gradually differ from the historical training data used by the machine learning model. This problem is commonly referred to as data drift.</w:t>
-      </w:r>
-    </w:p>
-    <w:p>
-      <w:pPr>
-        <w:rPr>
-          <w:rFonts w:ascii="Times New Roman" w:hAnsi="Times New Roman" w:cs="Times New Roman"/>
-          <w:sz w:val="24"/>
-          <w:szCs w:val="24"/>
-        </w:rPr>
-      </w:pPr>
+        <w:t>Retail conditions may change over time due to seasonal demand, customer behavior, or inventory fluctuations. Because of these changes, the incoming operational data may gradually differ from the historical training data used by the model. This issue is known as data drift.</w:t>
+      </w:r>
+      <w:r>
+        <w:t xml:space="preserve"> </w:t>
+      </w:r>
       <w:r>
         <w:rPr>
           <w:rFonts w:ascii="Times New Roman" w:hAnsi="Times New Roman" w:cs="Times New Roman"/>
@@ -2218,6 +2998,30 @@
           <w:szCs w:val="24"/>
         </w:rPr>
         <w:t>To address this issue, the system performs numerical feature drift detection using relative mean shift analysis.</w:t>
+      </w:r>
+      <w:r>
+        <w:rPr>
+          <w:rFonts w:ascii="Times New Roman" w:hAnsi="Times New Roman" w:cs="Times New Roman"/>
+          <w:sz w:val="24"/>
+          <w:szCs w:val="24"/>
+        </w:rPr>
+        <w:t xml:space="preserve"> A lightweight relative mean-shift approach was selected to provide computationally </w:t>
+      </w:r>
+      <w:r>
+        <w:rPr>
+          <w:rFonts w:ascii="Times New Roman" w:hAnsi="Times New Roman" w:cs="Times New Roman"/>
+          <w:sz w:val="24"/>
+          <w:szCs w:val="24"/>
+        </w:rPr>
+        <w:t xml:space="preserve">efficient </w:t>
+      </w:r>
+      <w:r>
+        <w:rPr>
+          <w:rFonts w:ascii="Times New Roman" w:hAnsi="Times New Roman" w:cs="Times New Roman"/>
+          <w:sz w:val="24"/>
+          <w:szCs w:val="24"/>
+        </w:rPr>
+        <w:t>a lightweight relative mean-shift approach was used for drift monitoring within the pipeline.</w:t>
       </w:r>
     </w:p>
     <w:p>
@@ -2366,8 +3170,32 @@
           <w:sz w:val="24"/>
           <w:szCs w:val="24"/>
         </w:rPr>
+        <w:t>For each monitored feature, the system calculates the relative difference between historical mean values and recent incoming mean values. If the drift score exce</w:t>
+      </w:r>
+      <w:r>
+        <w:rPr>
+          <w:rFonts w:ascii="Times New Roman" w:hAnsi="Times New Roman" w:cs="Times New Roman"/>
+          <w:sz w:val="24"/>
+          <w:szCs w:val="24"/>
+        </w:rPr>
+        <w:t xml:space="preserve">eds a </w:t>
+      </w:r>
+      <w:r>
+        <w:rPr>
+          <w:rFonts w:ascii="Times New Roman" w:hAnsi="Times New Roman" w:cs="Times New Roman"/>
+          <w:sz w:val="24"/>
+          <w:szCs w:val="24"/>
+        </w:rPr>
         <w:lastRenderedPageBreak/>
-        <w:t>For each monitored feature, the system calculates the relative difference between historical mean values and recent incoming mean values. If the drift score exceeds a predefined threshold (0.20), the system identifies the feature as drifted and generates a drift report.</w:t>
+        <w:t>predefined threshold (0.15</w:t>
+      </w:r>
+      <w:r>
+        <w:rPr>
+          <w:rFonts w:ascii="Times New Roman" w:hAnsi="Times New Roman" w:cs="Times New Roman"/>
+          <w:sz w:val="24"/>
+          <w:szCs w:val="24"/>
+        </w:rPr>
+        <w:t>), the system identifies the feature as drifted and generates a drift report.</w:t>
       </w:r>
     </w:p>
     <w:p>
@@ -2518,6 +3346,7 @@
       <w:r>
         <w:rPr>
           <w:rFonts w:ascii="Times New Roman" w:hAnsi="Times New Roman" w:cs="Times New Roman"/>
+          <w:noProof/>
           <w:sz w:val="24"/>
           <w:szCs w:val="24"/>
         </w:rPr>
@@ -2564,16 +3393,16 @@
         <w:rPr>
           <w:rFonts w:ascii="Times New Roman" w:hAnsi="Times New Roman" w:cs="Times New Roman"/>
           <w:b/>
-          <w:sz w:val="28"/>
-          <w:szCs w:val="28"/>
+          <w:sz w:val="24"/>
+          <w:szCs w:val="24"/>
         </w:rPr>
       </w:pPr>
       <w:r>
         <w:rPr>
           <w:rFonts w:ascii="Times New Roman" w:hAnsi="Times New Roman" w:cs="Times New Roman"/>
           <w:b/>
-          <w:sz w:val="28"/>
-          <w:szCs w:val="28"/>
+          <w:sz w:val="24"/>
+          <w:szCs w:val="24"/>
         </w:rPr>
         <w:t>Figure 3</w:t>
       </w:r>
@@ -2581,8 +3410,8 @@
         <w:rPr>
           <w:rFonts w:ascii="Times New Roman" w:hAnsi="Times New Roman" w:cs="Times New Roman"/>
           <w:b/>
-          <w:sz w:val="28"/>
-          <w:szCs w:val="28"/>
+          <w:sz w:val="24"/>
+          <w:szCs w:val="24"/>
         </w:rPr>
         <w:t xml:space="preserve">: </w:t>
       </w:r>
@@ -2590,8 +3419,8 @@
         <w:rPr>
           <w:rFonts w:ascii="Times New Roman" w:hAnsi="Times New Roman" w:cs="Times New Roman"/>
           <w:b/>
-          <w:sz w:val="28"/>
-          <w:szCs w:val="28"/>
+          <w:sz w:val="24"/>
+          <w:szCs w:val="24"/>
         </w:rPr>
         <w:t>Drift monitoring output showing operational distribution changes across monitored retail features.</w:t>
       </w:r>
@@ -2611,7 +3440,7 @@
           <w:sz w:val="24"/>
           <w:szCs w:val="24"/>
         </w:rPr>
-        <w:t>The monitoring workflow calculates drift scores by comparing historical and current feature distributions. If any monitored feature exceeds the threshold, the system flags operational drift and can trigger automatic retraining.</w:t>
+        <w:t>The auto_retrain.py workflow automatically checks whether operational drift exceeds the configured threshold. If significant drift is detected, preprocessing and model retraining are executed automatically. Otherwise, retraining is skipped to avoid unnecessary computational overhead.</w:t>
       </w:r>
     </w:p>
     <w:p>
@@ -2626,28 +3455,11 @@
       <w:r>
         <w:rPr>
           <w:rFonts w:ascii="Times New Roman" w:hAnsi="Times New Roman" w:cs="Times New Roman"/>
+          <w:noProof/>
           <w:sz w:val="24"/>
           <w:szCs w:val="24"/>
         </w:rPr>
         <w:lastRenderedPageBreak/>
-        <w:t>The auto_retrain.py workflow automatically checks whether operational drift exceeds the configured threshold. If significant drift is detected, preprocessing and model retraining are executed automatically. Otherwise, retraining is skipped to avoid unnecessary computational overhead.</w:t>
-      </w:r>
-    </w:p>
-    <w:p>
-      <w:pPr>
-        <w:jc w:val="both"/>
-        <w:rPr>
-          <w:rFonts w:ascii="Times New Roman" w:hAnsi="Times New Roman" w:cs="Times New Roman"/>
-          <w:sz w:val="24"/>
-          <w:szCs w:val="24"/>
-        </w:rPr>
-      </w:pPr>
-      <w:r>
-        <w:rPr>
-          <w:rFonts w:ascii="Times New Roman" w:hAnsi="Times New Roman" w:cs="Times New Roman"/>
-          <w:sz w:val="24"/>
-          <w:szCs w:val="24"/>
-        </w:rPr>
         <w:drawing>
           <wp:inline distT="0" distB="0" distL="0" distR="0" wp14:anchorId="2D97387D" wp14:editId="0AAE6DF7">
             <wp:extent cx="5486400" cy="2882900"/>
@@ -2691,16 +3503,16 @@
         <w:rPr>
           <w:rFonts w:ascii="Times New Roman" w:hAnsi="Times New Roman" w:cs="Times New Roman"/>
           <w:b/>
-          <w:sz w:val="28"/>
-          <w:szCs w:val="28"/>
+          <w:sz w:val="24"/>
+          <w:szCs w:val="24"/>
         </w:rPr>
       </w:pPr>
       <w:r>
         <w:rPr>
           <w:rFonts w:ascii="Times New Roman" w:hAnsi="Times New Roman" w:cs="Times New Roman"/>
           <w:b/>
-          <w:sz w:val="28"/>
-          <w:szCs w:val="28"/>
+          <w:sz w:val="24"/>
+          <w:szCs w:val="24"/>
         </w:rPr>
         <w:t>Figure 4</w:t>
       </w:r>
@@ -2708,8 +3520,8 @@
         <w:rPr>
           <w:rFonts w:ascii="Times New Roman" w:hAnsi="Times New Roman" w:cs="Times New Roman"/>
           <w:b/>
-          <w:sz w:val="28"/>
-          <w:szCs w:val="28"/>
+          <w:sz w:val="24"/>
+          <w:szCs w:val="24"/>
         </w:rPr>
         <w:t>: Automatic retraining workflow based on drift monitoring results.</w:t>
       </w:r>
@@ -2745,8 +3557,8 @@
         <w:rPr>
           <w:rFonts w:ascii="Times New Roman" w:hAnsi="Times New Roman" w:cs="Times New Roman"/>
           <w:b/>
-          <w:sz w:val="28"/>
-          <w:szCs w:val="28"/>
+          <w:sz w:val="32"/>
+          <w:szCs w:val="32"/>
         </w:rPr>
         <w:t>4.3 Versioning</w:t>
       </w:r>
@@ -2851,14 +3663,6 @@
           <w:szCs w:val="24"/>
         </w:rPr>
         <w:br/>
-      </w:r>
-      <w:r>
-        <w:rPr>
-          <w:rFonts w:ascii="Times New Roman" w:hAnsi="Times New Roman" w:cs="Times New Roman"/>
-          <w:sz w:val="24"/>
-          <w:szCs w:val="24"/>
-        </w:rPr>
-        <w:lastRenderedPageBreak/>
         <w:t>A lightweight model registry table was also implemented inside SQLite to track model versions, timestamps, and performance metrics.</w:t>
       </w:r>
       <w:r>
@@ -2896,6 +3700,7 @@
           <w:sz w:val="32"/>
           <w:szCs w:val="32"/>
         </w:rPr>
+        <w:lastRenderedPageBreak/>
         <w:t>5. Artifact Collection and Storage</w:t>
       </w:r>
     </w:p>
@@ -2908,12 +3713,15 @@
         </w:rPr>
       </w:pPr>
       <w:r>
-        <w:rPr>
-          <w:rFonts w:ascii="Times New Roman" w:hAnsi="Times New Roman" w:cs="Times New Roman"/>
-          <w:sz w:val="24"/>
-          <w:szCs w:val="24"/>
-        </w:rPr>
-        <w:t>Artifact management improves reproducibility, auditability, and operational reliability within machine learning systems.</w:t>
+        <w:t>The project stores models, logs, and processed data separately so that previous experiments and outputs can be tracked more easily</w:t>
+      </w:r>
+      <w:r>
+        <w:rPr>
+          <w:rFonts w:ascii="Times New Roman" w:hAnsi="Times New Roman" w:cs="Times New Roman"/>
+          <w:sz w:val="24"/>
+          <w:szCs w:val="24"/>
+        </w:rPr>
+        <w:t>.</w:t>
       </w:r>
       <w:r>
         <w:rPr>
@@ -3036,7 +3844,23 @@
           <w:szCs w:val="24"/>
         </w:rPr>
         <w:br/>
-        <w:t>This storage strategy supports reproducibility by making it possible to recreate previous experiments and compare model performance across different pipeline executions.</w:t>
+        <w:t xml:space="preserve">This storage strategy supports reproducibility by making it possible to recreate previous </w:t>
+      </w:r>
+      <w:r>
+        <w:rPr>
+          <w:rFonts w:ascii="Times New Roman" w:hAnsi="Times New Roman" w:cs="Times New Roman"/>
+          <w:sz w:val="24"/>
+          <w:szCs w:val="24"/>
+        </w:rPr>
+        <w:t>experiments and compare model performance across different pipeline executions.</w:t>
+      </w:r>
+      <w:r>
+        <w:rPr>
+          <w:rFonts w:ascii="Times New Roman" w:hAnsi="Times New Roman" w:cs="Times New Roman"/>
+          <w:sz w:val="24"/>
+          <w:szCs w:val="24"/>
+        </w:rPr>
+        <w:t xml:space="preserve"> Structured artifact storage improves experiment reproducibility, rollback capability, debugging, and auditability.</w:t>
       </w:r>
       <w:r>
         <w:rPr>
@@ -3573,7 +4397,6 @@
           <w:sz w:val="32"/>
           <w:szCs w:val="32"/>
         </w:rPr>
-        <w:lastRenderedPageBreak/>
         <w:t>6. Deployment Setup</w:t>
       </w:r>
     </w:p>
@@ -3589,8 +4412,8 @@
         <w:rPr>
           <w:rFonts w:ascii="Times New Roman" w:hAnsi="Times New Roman" w:cs="Times New Roman"/>
           <w:b/>
-          <w:sz w:val="28"/>
-          <w:szCs w:val="28"/>
+          <w:sz w:val="32"/>
+          <w:szCs w:val="32"/>
         </w:rPr>
         <w:t>6.1 API Deployment</w:t>
       </w:r>
@@ -3609,6 +4432,13 @@
           <w:szCs w:val="24"/>
         </w:rPr>
         <w:br/>
+      </w:r>
+      <w:r>
+        <w:rPr>
+          <w:rFonts w:ascii="Times New Roman" w:hAnsi="Times New Roman" w:cs="Times New Roman"/>
+          <w:sz w:val="24"/>
+          <w:szCs w:val="24"/>
+        </w:rPr>
         <w:t>The trained mo</w:t>
       </w:r>
       <w:r>
@@ -3625,15 +4455,24 @@
           <w:sz w:val="24"/>
           <w:szCs w:val="24"/>
         </w:rPr>
-        <w:t>FastAPI was selected because it is lightweight, high-performance, and suitable for serving machine lea</w:t>
-      </w:r>
-      <w:r>
-        <w:rPr>
-          <w:rFonts w:ascii="Times New Roman" w:hAnsi="Times New Roman" w:cs="Times New Roman"/>
-          <w:sz w:val="24"/>
-          <w:szCs w:val="24"/>
-        </w:rPr>
-        <w:t>rning models through REST APIs. The FastAPI backend exposes production-style REST API endpoints for ingestion, prediction, monitoring, drift detection, retraining, and pipeline execution. Swagger documentation was automatically generated to support endpoint testing and API inspection.</w:t>
+        <w:t xml:space="preserve">FastAPI was used to deploy the trained model because it supports efficient API development for Python-based machine learning </w:t>
+      </w:r>
+      <w:r>
+        <w:rPr>
+          <w:rFonts w:ascii="Times New Roman" w:hAnsi="Times New Roman" w:cs="Times New Roman"/>
+          <w:sz w:val="24"/>
+          <w:szCs w:val="24"/>
+        </w:rPr>
+        <w:lastRenderedPageBreak/>
+        <w:t>applications.</w:t>
+      </w:r>
+      <w:r>
+        <w:rPr>
+          <w:rFonts w:ascii="Times New Roman" w:hAnsi="Times New Roman" w:cs="Times New Roman"/>
+          <w:sz w:val="24"/>
+          <w:szCs w:val="24"/>
+        </w:rPr>
+        <w:t xml:space="preserve"> The FastAPI backend exposes production-style REST API endpoints for ingestion, prediction, monitoring, drift detection, retraining, and pipeline execution. Swagger documentation was automatically generated to support endpoint testing and API inspection.</w:t>
       </w:r>
       <w:r>
         <w:rPr>
@@ -3753,6 +4592,7 @@
       <w:r>
         <w:rPr>
           <w:rFonts w:ascii="Times New Roman" w:hAnsi="Times New Roman" w:cs="Times New Roman"/>
+          <w:noProof/>
           <w:sz w:val="24"/>
           <w:szCs w:val="24"/>
         </w:rPr>
@@ -3799,16 +4639,16 @@
         <w:rPr>
           <w:rFonts w:ascii="Times New Roman" w:hAnsi="Times New Roman" w:cs="Times New Roman"/>
           <w:b/>
-          <w:sz w:val="28"/>
-          <w:szCs w:val="28"/>
+          <w:sz w:val="24"/>
+          <w:szCs w:val="24"/>
         </w:rPr>
       </w:pPr>
       <w:r>
         <w:rPr>
           <w:rFonts w:ascii="Times New Roman" w:hAnsi="Times New Roman" w:cs="Times New Roman"/>
           <w:b/>
-          <w:sz w:val="28"/>
-          <w:szCs w:val="28"/>
+          <w:sz w:val="24"/>
+          <w:szCs w:val="24"/>
         </w:rPr>
         <w:t>Figure 5</w:t>
       </w:r>
@@ -3816,8 +4656,8 @@
         <w:rPr>
           <w:rFonts w:ascii="Times New Roman" w:hAnsi="Times New Roman" w:cs="Times New Roman"/>
           <w:b/>
-          <w:sz w:val="28"/>
-          <w:szCs w:val="28"/>
+          <w:sz w:val="24"/>
+          <w:szCs w:val="24"/>
         </w:rPr>
         <w:t>: FastAPI Swagger documentation showing deployed API endpoints.</w:t>
       </w:r>
@@ -3853,17 +4693,108 @@
           <w:sz w:val="24"/>
           <w:szCs w:val="24"/>
         </w:rPr>
+        <w:br/>
+      </w:r>
+      <w:r>
+        <w:rPr>
+          <w:rFonts w:ascii="Times New Roman" w:hAnsi="Times New Roman" w:cs="Times New Roman"/>
+          <w:b/>
+          <w:sz w:val="32"/>
+          <w:szCs w:val="32"/>
+        </w:rPr>
+        <w:t>6.2 Docker Deployment</w:t>
+      </w:r>
+      <w:r>
+        <w:rPr>
+          <w:rFonts w:ascii="Times New Roman" w:hAnsi="Times New Roman" w:cs="Times New Roman"/>
+          <w:sz w:val="24"/>
+          <w:szCs w:val="24"/>
+        </w:rPr>
+        <w:br/>
+        <w:t>The application supports Docker-based deployment to improve portability and deployment consistency across environments</w:t>
+      </w:r>
+      <w:r>
+        <w:rPr>
+          <w:rFonts w:ascii="Times New Roman" w:hAnsi="Times New Roman" w:cs="Times New Roman"/>
+          <w:sz w:val="24"/>
+          <w:szCs w:val="24"/>
+        </w:rPr>
+        <w:t xml:space="preserve">. </w:t>
+      </w:r>
+      <w:r>
+        <w:rPr>
+          <w:rFonts w:ascii="Times New Roman" w:hAnsi="Times New Roman" w:cs="Times New Roman"/>
+          <w:sz w:val="24"/>
+          <w:szCs w:val="24"/>
+        </w:rPr>
+        <w:t xml:space="preserve">Docker packages the application code, dependencies, and runtime configuration into a </w:t>
+      </w:r>
+      <w:r>
+        <w:rPr>
+          <w:rFonts w:ascii="Times New Roman" w:hAnsi="Times New Roman" w:cs="Times New Roman"/>
+          <w:sz w:val="24"/>
+          <w:szCs w:val="24"/>
+        </w:rPr>
+        <w:t>single container image.</w:t>
+      </w:r>
+      <w:r>
+        <w:rPr>
+          <w:rFonts w:ascii="Times New Roman" w:hAnsi="Times New Roman" w:cs="Times New Roman"/>
+          <w:sz w:val="24"/>
+          <w:szCs w:val="24"/>
+        </w:rPr>
+        <w:br/>
+      </w:r>
+      <w:r>
+        <w:rPr>
+          <w:rFonts w:ascii="Times New Roman" w:hAnsi="Times New Roman" w:cs="Times New Roman"/>
+          <w:sz w:val="24"/>
+          <w:szCs w:val="24"/>
+        </w:rPr>
+        <w:t>This reduces environment-related deployment issues and improves reproducibility.</w:t>
+      </w:r>
+      <w:r>
+        <w:rPr>
+          <w:rFonts w:ascii="Times New Roman" w:hAnsi="Times New Roman" w:cs="Times New Roman"/>
+          <w:sz w:val="24"/>
+          <w:szCs w:val="24"/>
+        </w:rPr>
+        <w:t xml:space="preserve"> </w:t>
+      </w:r>
+      <w:r>
+        <w:rPr>
+          <w:rFonts w:ascii="Times New Roman" w:hAnsi="Times New Roman" w:cs="Times New Roman"/>
+          <w:sz w:val="24"/>
+          <w:szCs w:val="24"/>
+        </w:rPr>
         <w:lastRenderedPageBreak/>
+        <w:t>Docker containerization ensures dependency isolation, environment consistency, and portability across different deployment environments.</w:t>
+      </w:r>
+    </w:p>
+    <w:p>
+      <w:pPr>
+        <w:rPr>
+          <w:rFonts w:ascii="Times New Roman" w:hAnsi="Times New Roman" w:cs="Times New Roman"/>
+          <w:sz w:val="24"/>
+          <w:szCs w:val="24"/>
+        </w:rPr>
+      </w:pPr>
+      <w:r>
+        <w:rPr>
+          <w:rFonts w:ascii="Times New Roman" w:hAnsi="Times New Roman" w:cs="Times New Roman"/>
+          <w:sz w:val="24"/>
+          <w:szCs w:val="24"/>
+        </w:rPr>
         <w:br/>
       </w:r>
       <w:r>
         <w:rPr>
           <w:rFonts w:ascii="Times New Roman" w:hAnsi="Times New Roman" w:cs="Times New Roman"/>
           <w:b/>
-          <w:sz w:val="28"/>
-          <w:szCs w:val="28"/>
-        </w:rPr>
-        <w:t>6.2 Docker Deployment</w:t>
+          <w:sz w:val="32"/>
+          <w:szCs w:val="32"/>
+        </w:rPr>
+        <w:t>6.3 Execution Mode</w:t>
       </w:r>
       <w:r>
         <w:rPr>
@@ -3872,6 +4803,15 @@
           <w:szCs w:val="24"/>
         </w:rPr>
         <w:br/>
+        <w:t>The system sup</w:t>
+      </w:r>
+      <w:r>
+        <w:rPr>
+          <w:rFonts w:ascii="Times New Roman" w:hAnsi="Times New Roman" w:cs="Times New Roman"/>
+          <w:sz w:val="24"/>
+          <w:szCs w:val="24"/>
+        </w:rPr>
+        <w:t>ports multiple execution modes.</w:t>
       </w:r>
       <w:r>
         <w:rPr>
@@ -3880,7 +4820,15 @@
           <w:szCs w:val="24"/>
         </w:rPr>
         <w:br/>
-        <w:t>The application supports Docker-based deployment to improve portability and deployment consistency across environments.</w:t>
+        <w:t>First, real-time demand prediction is availab</w:t>
+      </w:r>
+      <w:r>
+        <w:rPr>
+          <w:rFonts w:ascii="Times New Roman" w:hAnsi="Times New Roman" w:cs="Times New Roman"/>
+          <w:sz w:val="24"/>
+          <w:szCs w:val="24"/>
+        </w:rPr>
+        <w:t>le through the FastAPI backend.</w:t>
       </w:r>
       <w:r>
         <w:rPr>
@@ -3889,6 +4837,15 @@
           <w:szCs w:val="24"/>
         </w:rPr>
         <w:br/>
+        <w:t>Second, the Streamlit dashboard allows interac</w:t>
+      </w:r>
+      <w:r>
+        <w:rPr>
+          <w:rFonts w:ascii="Times New Roman" w:hAnsi="Times New Roman" w:cs="Times New Roman"/>
+          <w:sz w:val="24"/>
+          <w:szCs w:val="24"/>
+        </w:rPr>
+        <w:t>tive prediction and monitoring.</w:t>
       </w:r>
       <w:r>
         <w:rPr>
@@ -3897,7 +4854,15 @@
           <w:szCs w:val="24"/>
         </w:rPr>
         <w:br/>
-        <w:t>Docker packages the application code, dependencies, and runtime configuration into a single container image.</w:t>
+        <w:t>Third, automated retraining workflows can be triggered usin</w:t>
+      </w:r>
+      <w:r>
+        <w:rPr>
+          <w:rFonts w:ascii="Times New Roman" w:hAnsi="Times New Roman" w:cs="Times New Roman"/>
+          <w:sz w:val="24"/>
+          <w:szCs w:val="24"/>
+        </w:rPr>
+        <w:t>g updated incoming retail data.</w:t>
       </w:r>
       <w:r>
         <w:rPr>
@@ -3906,126 +4871,35 @@
           <w:szCs w:val="24"/>
         </w:rPr>
         <w:br/>
-      </w:r>
-      <w:r>
-        <w:rPr>
-          <w:rFonts w:ascii="Times New Roman" w:hAnsi="Times New Roman" w:cs="Times New Roman"/>
-          <w:sz w:val="24"/>
-          <w:szCs w:val="24"/>
-        </w:rPr>
-        <w:br/>
-        <w:t>This reduces environment-related deployment issues and improves reproducibility.</w:t>
-      </w:r>
-      <w:r>
-        <w:rPr>
-          <w:rFonts w:ascii="Times New Roman" w:hAnsi="Times New Roman" w:cs="Times New Roman"/>
-          <w:sz w:val="24"/>
-          <w:szCs w:val="24"/>
-        </w:rPr>
-        <w:br/>
-      </w:r>
-      <w:r>
-        <w:rPr>
-          <w:rFonts w:ascii="Times New Roman" w:hAnsi="Times New Roman" w:cs="Times New Roman"/>
-          <w:sz w:val="24"/>
-          <w:szCs w:val="24"/>
-        </w:rPr>
-        <w:br/>
-      </w:r>
-      <w:r>
-        <w:rPr>
-          <w:rFonts w:ascii="Times New Roman" w:hAnsi="Times New Roman" w:cs="Times New Roman"/>
-          <w:b/>
-          <w:sz w:val="28"/>
-          <w:szCs w:val="28"/>
-        </w:rPr>
-        <w:t>6.3 Execution Mode</w:t>
-      </w:r>
-      <w:r>
-        <w:rPr>
-          <w:rFonts w:ascii="Times New Roman" w:hAnsi="Times New Roman" w:cs="Times New Roman"/>
-          <w:sz w:val="24"/>
-          <w:szCs w:val="24"/>
-        </w:rPr>
-        <w:br/>
-      </w:r>
-      <w:r>
-        <w:rPr>
-          <w:rFonts w:ascii="Times New Roman" w:hAnsi="Times New Roman" w:cs="Times New Roman"/>
-          <w:sz w:val="24"/>
-          <w:szCs w:val="24"/>
-        </w:rPr>
-        <w:br/>
-        <w:t>The system supports multiple execution modes.</w:t>
-      </w:r>
-      <w:r>
-        <w:rPr>
-          <w:rFonts w:ascii="Times New Roman" w:hAnsi="Times New Roman" w:cs="Times New Roman"/>
-          <w:sz w:val="24"/>
-          <w:szCs w:val="24"/>
-        </w:rPr>
-        <w:br/>
-      </w:r>
-      <w:r>
-        <w:rPr>
-          <w:rFonts w:ascii="Times New Roman" w:hAnsi="Times New Roman" w:cs="Times New Roman"/>
-          <w:sz w:val="24"/>
-          <w:szCs w:val="24"/>
-        </w:rPr>
-        <w:br/>
-        <w:t>First, real-time demand prediction is available through the FastAPI backend.</w:t>
-      </w:r>
-      <w:r>
-        <w:rPr>
-          <w:rFonts w:ascii="Times New Roman" w:hAnsi="Times New Roman" w:cs="Times New Roman"/>
-          <w:sz w:val="24"/>
-          <w:szCs w:val="24"/>
-        </w:rPr>
-        <w:br/>
-      </w:r>
-      <w:r>
-        <w:rPr>
-          <w:rFonts w:ascii="Times New Roman" w:hAnsi="Times New Roman" w:cs="Times New Roman"/>
-          <w:sz w:val="24"/>
-          <w:szCs w:val="24"/>
-        </w:rPr>
-        <w:br/>
-        <w:t>Second, the Streamlit dashboard allows interactive prediction and monitoring.</w:t>
-      </w:r>
-      <w:r>
-        <w:rPr>
-          <w:rFonts w:ascii="Times New Roman" w:hAnsi="Times New Roman" w:cs="Times New Roman"/>
-          <w:sz w:val="24"/>
-          <w:szCs w:val="24"/>
-        </w:rPr>
-        <w:br/>
-      </w:r>
-      <w:r>
-        <w:rPr>
-          <w:rFonts w:ascii="Times New Roman" w:hAnsi="Times New Roman" w:cs="Times New Roman"/>
-          <w:sz w:val="24"/>
-          <w:szCs w:val="24"/>
-        </w:rPr>
-        <w:br/>
-        <w:t>Third, automated retraining workflows can be triggered using updated incoming retail data.</w:t>
-      </w:r>
-      <w:r>
-        <w:rPr>
-          <w:rFonts w:ascii="Times New Roman" w:hAnsi="Times New Roman" w:cs="Times New Roman"/>
-          <w:sz w:val="24"/>
-          <w:szCs w:val="24"/>
-        </w:rPr>
-        <w:br/>
-      </w:r>
-      <w:r>
-        <w:rPr>
-          <w:rFonts w:ascii="Times New Roman" w:hAnsi="Times New Roman" w:cs="Times New Roman"/>
-          <w:sz w:val="24"/>
-          <w:szCs w:val="24"/>
-        </w:rPr>
-        <w:br/>
-        <w:t>This combination creates a realistic production-oriented MLOps workflow.</w:t>
-      </w:r>
+        <w:t xml:space="preserve">This combination creates a realistic production-oriented </w:t>
+      </w:r>
+      <w:proofErr w:type="spellStart"/>
+      <w:r>
+        <w:rPr>
+          <w:rFonts w:ascii="Times New Roman" w:hAnsi="Times New Roman" w:cs="Times New Roman"/>
+          <w:sz w:val="24"/>
+          <w:szCs w:val="24"/>
+        </w:rPr>
+        <w:t>MLOps</w:t>
+      </w:r>
+      <w:proofErr w:type="spellEnd"/>
+      <w:r>
+        <w:rPr>
+          <w:rFonts w:ascii="Times New Roman" w:hAnsi="Times New Roman" w:cs="Times New Roman"/>
+          <w:sz w:val="24"/>
+          <w:szCs w:val="24"/>
+        </w:rPr>
+        <w:t xml:space="preserve"> workflow.</w:t>
+      </w:r>
+    </w:p>
+    <w:p>
+      <w:pPr>
+        <w:rPr>
+          <w:rFonts w:ascii="Times New Roman" w:hAnsi="Times New Roman" w:cs="Times New Roman"/>
+          <w:sz w:val="24"/>
+          <w:szCs w:val="24"/>
+        </w:rPr>
+      </w:pPr>
     </w:p>
     <w:p>
       <w:pPr>
@@ -4184,14 +5058,6 @@
           <w:szCs w:val="24"/>
         </w:rPr>
         <w:br/>
-      </w:r>
-      <w:r>
-        <w:rPr>
-          <w:rFonts w:ascii="Times New Roman" w:hAnsi="Times New Roman" w:cs="Times New Roman"/>
-          <w:sz w:val="24"/>
-          <w:szCs w:val="24"/>
-        </w:rPr>
-        <w:lastRenderedPageBreak/>
         <w:t>• predicted demand</w:t>
       </w:r>
       <w:r>
@@ -4253,7 +5119,24 @@
           <w:sz w:val="24"/>
           <w:szCs w:val="24"/>
         </w:rPr>
-        <w:t>The Streamlit dashboard provides a user-friendly interface for interacting with the deployed machine learning system. Users can enter product and inventory information, request demand predictions, view waste risk levels, and receive inventory recommendations without directly interacting with the backend code.</w:t>
+        <w:t xml:space="preserve">The Streamlit dashboard provides a user-friendly interface for interacting with the deployed machine learning system. Users can enter product and inventory information, request demand predictions, view waste risk levels, and receive inventory </w:t>
+      </w:r>
+      <w:r>
+        <w:rPr>
+          <w:rFonts w:ascii="Times New Roman" w:hAnsi="Times New Roman" w:cs="Times New Roman"/>
+          <w:sz w:val="24"/>
+          <w:szCs w:val="24"/>
+        </w:rPr>
+        <w:lastRenderedPageBreak/>
+        <w:t>recommendations without directly interacting with the backend code.</w:t>
+      </w:r>
+      <w:r>
+        <w:rPr>
+          <w:rFonts w:ascii="Times New Roman" w:hAnsi="Times New Roman" w:cs="Times New Roman"/>
+          <w:sz w:val="24"/>
+          <w:szCs w:val="24"/>
+        </w:rPr>
+        <w:t xml:space="preserve"> The Streamlit frontend communicates with the FastAPI backend through REST API calls using HTTP requests.</w:t>
       </w:r>
     </w:p>
     <w:p>
@@ -4267,6 +5150,7 @@
       <w:r>
         <w:rPr>
           <w:rFonts w:ascii="Times New Roman" w:hAnsi="Times New Roman" w:cs="Times New Roman"/>
+          <w:noProof/>
           <w:sz w:val="24"/>
           <w:szCs w:val="24"/>
         </w:rPr>
@@ -4318,6 +5202,7 @@
       <w:r>
         <w:rPr>
           <w:rFonts w:ascii="Times New Roman" w:hAnsi="Times New Roman" w:cs="Times New Roman"/>
+          <w:noProof/>
           <w:sz w:val="24"/>
           <w:szCs w:val="24"/>
         </w:rPr>
@@ -4364,16 +5249,16 @@
         <w:rPr>
           <w:rFonts w:ascii="Times New Roman" w:hAnsi="Times New Roman" w:cs="Times New Roman"/>
           <w:b/>
-          <w:sz w:val="28"/>
-          <w:szCs w:val="28"/>
+          <w:sz w:val="24"/>
+          <w:szCs w:val="24"/>
         </w:rPr>
       </w:pPr>
       <w:r>
         <w:rPr>
           <w:rFonts w:ascii="Times New Roman" w:hAnsi="Times New Roman" w:cs="Times New Roman"/>
           <w:b/>
-          <w:sz w:val="28"/>
-          <w:szCs w:val="28"/>
+          <w:sz w:val="24"/>
+          <w:szCs w:val="24"/>
         </w:rPr>
         <w:t>Figure 6: Streamlit dashboard showing demand prediction, waste risk level, and inventory recommendation.</w:t>
       </w:r>
@@ -4393,7 +5278,6 @@
           <w:sz w:val="24"/>
           <w:szCs w:val="24"/>
         </w:rPr>
-        <w:lastRenderedPageBreak/>
         <w:t>The prediction interface demonstrates how machine learning outputs can support inventory optimization decisions in retail environments. By estimating future demand and identifying high waste-risk inventory situations, the system can help reduce unnecessary overstocking and improve stock planning efficiency. This type of operational forecasting may contribute to reducing avoidable food waste and improving resource utilization within retail supply chains.</w:t>
       </w:r>
     </w:p>
@@ -4424,6 +5308,50 @@
           <w:szCs w:val="24"/>
         </w:rPr>
       </w:pPr>
+      <w:r>
+        <w:rPr>
+          <w:rFonts w:ascii="Times New Roman" w:hAnsi="Times New Roman" w:cs="Times New Roman"/>
+          <w:noProof/>
+          <w:sz w:val="24"/>
+          <w:szCs w:val="24"/>
+        </w:rPr>
+        <w:lastRenderedPageBreak/>
+        <w:drawing>
+          <wp:inline distT="0" distB="0" distL="0" distR="0" wp14:anchorId="736F0A63" wp14:editId="70855DF8">
+            <wp:extent cx="5486323" cy="3938257"/>
+            <wp:effectExtent l="0" t="0" r="635" b="5715"/>
+            <wp:docPr id="8" name="Picture 8"/>
+            <wp:cNvGraphicFramePr>
+              <a:graphicFrameLocks xmlns:a="http://schemas.openxmlformats.org/drawingml/2006/main" noChangeAspect="1"/>
+            </wp:cNvGraphicFramePr>
+            <a:graphic xmlns:a="http://schemas.openxmlformats.org/drawingml/2006/main">
+              <a:graphicData uri="http://schemas.openxmlformats.org/drawingml/2006/picture">
+                <pic:pic xmlns:pic="http://schemas.openxmlformats.org/drawingml/2006/picture">
+                  <pic:nvPicPr>
+                    <pic:cNvPr id="1" name=""/>
+                    <pic:cNvPicPr/>
+                  </pic:nvPicPr>
+                  <pic:blipFill>
+                    <a:blip r:embed="rId13"/>
+                    <a:stretch>
+                      <a:fillRect/>
+                    </a:stretch>
+                  </pic:blipFill>
+                  <pic:spPr>
+                    <a:xfrm>
+                      <a:off x="0" y="0"/>
+                      <a:ext cx="5514822" cy="3958714"/>
+                    </a:xfrm>
+                    <a:prstGeom prst="rect">
+                      <a:avLst/>
+                    </a:prstGeom>
+                  </pic:spPr>
+                </pic:pic>
+              </a:graphicData>
+            </a:graphic>
+          </wp:inline>
+        </w:drawing>
+      </w:r>
     </w:p>
     <w:p>
       <w:pPr>
@@ -4448,7 +5376,6 @@
     <w:p>
       <w:pPr>
         <w:pStyle w:val="Heading2"/>
-        <w:jc w:val="both"/>
         <w:rPr>
           <w:rFonts w:ascii="Times New Roman" w:hAnsi="Times New Roman" w:cs="Times New Roman"/>
           <w:color w:val="auto"/>
@@ -4463,31 +5390,41 @@
           <w:sz w:val="32"/>
           <w:szCs w:val="32"/>
         </w:rPr>
-        <w:t>8. Conclusion</w:t>
+        <w:t>8. Limitations</w:t>
       </w:r>
     </w:p>
     <w:p>
       <w:pPr>
-        <w:pStyle w:val="isselectedend"/>
-      </w:pPr>
-      <w:r>
-        <w:t xml:space="preserve">This project demonstrated a production-oriented </w:t>
-      </w:r>
-      <w:proofErr w:type="spellStart"/>
-      <w:r>
-        <w:t>MLOps</w:t>
-      </w:r>
-      <w:proofErr w:type="spellEnd"/>
-      <w:r>
-        <w:t xml:space="preserve"> pipeline for retail demand forecasting and smart inventory optimization. The implementation combined API-based ingestion, preprocessing, feature engineering, machine learning-based demand forecasting, monitoring, drift detection, retraining, deployment, and dashboard visualization within a unified workflow.</w:t>
+        <w:pStyle w:val="NormalWeb"/>
+      </w:pPr>
+      <w:r>
+        <w:t xml:space="preserve">The project uses synthetically generated inventory expiry and waste-related variables because such attributes were not available in the original Walmart dataset. In addition, the system uses lightweight statistical drift monitoring rather than enterprise-scale monitoring frameworks. Therefore, the results should be interpreted as a </w:t>
+      </w:r>
+      <w:r>
+        <w:t>practical</w:t>
+      </w:r>
+      <w:r>
+        <w:t xml:space="preserve"> simulation rather than a fully deployed commercial retail system.</w:t>
       </w:r>
     </w:p>
     <w:p>
       <w:pPr>
-        <w:pStyle w:val="isselectedend"/>
-      </w:pPr>
-      <w:r>
-        <w:t>Unlike notebook-only machine learning experiments, the system simulated a realistic operational environment where retail inventory events continuously flow through ingestion, prediction, monitoring, and retraining pipelines.</w:t>
+        <w:pStyle w:val="Heading2"/>
+        <w:rPr>
+          <w:rFonts w:ascii="Times New Roman" w:hAnsi="Times New Roman" w:cs="Times New Roman"/>
+          <w:color w:val="auto"/>
+          <w:sz w:val="32"/>
+          <w:szCs w:val="32"/>
+        </w:rPr>
+      </w:pPr>
+      <w:r>
+        <w:rPr>
+          <w:rFonts w:ascii="Times New Roman" w:hAnsi="Times New Roman" w:cs="Times New Roman"/>
+          <w:color w:val="auto"/>
+          <w:sz w:val="32"/>
+          <w:szCs w:val="32"/>
+        </w:rPr>
+        <w:t>9. Future Work</w:t>
       </w:r>
     </w:p>
     <w:p>
@@ -4495,57 +5432,157 @@
         <w:pStyle w:val="NormalWeb"/>
       </w:pPr>
       <w:r>
-        <w:t xml:space="preserve">The implementation also demonstrated how demand forecasting and inventory optimization can support better stock planning and help reduce potential overstock-related food waste. By identifying high waste-risk inventory situations and generating inventory recommendations, the system illustrated how </w:t>
+        <w:t xml:space="preserve">Future improvements may include Kafka-based streaming ingestion, cloud deployment, Kubernetes orchestration, advanced concept drift detection, </w:t>
       </w:r>
       <w:proofErr w:type="spellStart"/>
       <w:r>
-        <w:t>MLOp</w:t>
-      </w:r>
-      <w:bookmarkStart w:id="0" w:name="_GoBack"/>
-      <w:bookmarkEnd w:id="0"/>
-      <w:r>
-        <w:t>s</w:t>
+        <w:t>MLflow</w:t>
       </w:r>
       <w:proofErr w:type="spellEnd"/>
       <w:r>
-        <w:t xml:space="preserve"> practices may contribute to operational efficiency and societal well-being within retail supply chains.</w:t>
+        <w:t>-based experiment tracking, and integration with real retail inventory systems containing actual expiry and waste data.</w:t>
       </w:r>
     </w:p>
     <w:p>
       <w:pPr>
-        <w:rPr>
-          <w:rFonts w:ascii="Times New Roman" w:eastAsiaTheme="majorEastAsia" w:hAnsi="Times New Roman" w:cs="Times New Roman"/>
-          <w:b/>
-          <w:bCs/>
-          <w:sz w:val="24"/>
-          <w:szCs w:val="24"/>
-        </w:rPr>
-      </w:pPr>
-      <w:r>
-        <w:rPr>
-          <w:rFonts w:ascii="Times New Roman" w:hAnsi="Times New Roman" w:cs="Times New Roman"/>
-          <w:sz w:val="24"/>
-          <w:szCs w:val="24"/>
-        </w:rPr>
-        <w:br w:type="page"/>
+        <w:pStyle w:val="Heading2"/>
+        <w:jc w:val="both"/>
+        <w:rPr>
+          <w:rFonts w:ascii="Times New Roman" w:hAnsi="Times New Roman" w:cs="Times New Roman"/>
+          <w:color w:val="auto"/>
+          <w:sz w:val="32"/>
+          <w:szCs w:val="32"/>
+        </w:rPr>
+      </w:pPr>
+      <w:r>
+        <w:rPr>
+          <w:rFonts w:ascii="Times New Roman" w:hAnsi="Times New Roman" w:cs="Times New Roman"/>
+          <w:color w:val="auto"/>
+          <w:sz w:val="32"/>
+          <w:szCs w:val="32"/>
+        </w:rPr>
+        <w:lastRenderedPageBreak/>
+        <w:t>10</w:t>
+      </w:r>
+      <w:r>
+        <w:rPr>
+          <w:rFonts w:ascii="Times New Roman" w:hAnsi="Times New Roman" w:cs="Times New Roman"/>
+          <w:color w:val="auto"/>
+          <w:sz w:val="32"/>
+          <w:szCs w:val="32"/>
+        </w:rPr>
+        <w:t>. Conclusion</w:t>
       </w:r>
     </w:p>
     <w:p>
       <w:pPr>
-        <w:pStyle w:val="Heading2"/>
-        <w:rPr>
-          <w:rFonts w:ascii="Times New Roman" w:hAnsi="Times New Roman" w:cs="Times New Roman"/>
-          <w:color w:val="auto"/>
-          <w:sz w:val="24"/>
-          <w:szCs w:val="24"/>
-        </w:rPr>
-      </w:pPr>
-      <w:r>
-        <w:rPr>
-          <w:rFonts w:ascii="Times New Roman" w:hAnsi="Times New Roman" w:cs="Times New Roman"/>
-          <w:color w:val="auto"/>
-          <w:sz w:val="24"/>
-          <w:szCs w:val="24"/>
+        <w:spacing w:before="100" w:beforeAutospacing="1" w:after="100" w:afterAutospacing="1" w:line="240" w:lineRule="auto"/>
+        <w:rPr>
+          <w:rFonts w:ascii="Times New Roman" w:eastAsia="Times New Roman" w:hAnsi="Times New Roman" w:cs="Times New Roman"/>
+          <w:sz w:val="24"/>
+          <w:szCs w:val="24"/>
+        </w:rPr>
+      </w:pPr>
+      <w:r>
+        <w:rPr>
+          <w:rFonts w:ascii="Times New Roman" w:eastAsia="Times New Roman" w:hAnsi="Times New Roman" w:cs="Times New Roman"/>
+          <w:sz w:val="24"/>
+          <w:szCs w:val="24"/>
+        </w:rPr>
+        <w:t xml:space="preserve">This project presented a practical </w:t>
+      </w:r>
+      <w:proofErr w:type="spellStart"/>
+      <w:r>
+        <w:rPr>
+          <w:rFonts w:ascii="Times New Roman" w:eastAsia="Times New Roman" w:hAnsi="Times New Roman" w:cs="Times New Roman"/>
+          <w:sz w:val="24"/>
+          <w:szCs w:val="24"/>
+        </w:rPr>
+        <w:t>MLOps</w:t>
+      </w:r>
+      <w:proofErr w:type="spellEnd"/>
+      <w:r>
+        <w:rPr>
+          <w:rFonts w:ascii="Times New Roman" w:eastAsia="Times New Roman" w:hAnsi="Times New Roman" w:cs="Times New Roman"/>
+          <w:sz w:val="24"/>
+          <w:szCs w:val="24"/>
+        </w:rPr>
+        <w:t xml:space="preserve"> pipeline for retail demand forecasting and inventory optimization. The system combined data ingestion, preprocessing, feature engineering, machine learning prediction, monitoring, drift detection, retraining, deployment, and dashboard visualization within a single workflow.</w:t>
+      </w:r>
+    </w:p>
+    <w:p>
+      <w:pPr>
+        <w:spacing w:before="100" w:beforeAutospacing="1" w:after="100" w:afterAutospacing="1" w:line="240" w:lineRule="auto"/>
+        <w:rPr>
+          <w:rFonts w:ascii="Times New Roman" w:eastAsia="Times New Roman" w:hAnsi="Times New Roman" w:cs="Times New Roman"/>
+          <w:sz w:val="24"/>
+          <w:szCs w:val="24"/>
+        </w:rPr>
+      </w:pPr>
+      <w:r>
+        <w:rPr>
+          <w:rFonts w:ascii="Times New Roman" w:eastAsia="Times New Roman" w:hAnsi="Times New Roman" w:cs="Times New Roman"/>
+          <w:sz w:val="24"/>
+          <w:szCs w:val="24"/>
+        </w:rPr>
+        <w:t>The project simulated how retail inventory data can continuously move through prediction and monitoring pipelines in a production-like environment. In addition, the implementation demonstrated how forecasting and inventory analysis may help reduce unnecessary overstock situations and support better stock planning decisions.</w:t>
+      </w:r>
+    </w:p>
+    <w:p>
+      <w:pPr>
+        <w:rPr>
+          <w:rFonts w:ascii="Times New Roman" w:eastAsia="Times New Roman" w:hAnsi="Times New Roman" w:cs="Times New Roman"/>
+          <w:b/>
+          <w:sz w:val="24"/>
+          <w:szCs w:val="24"/>
+        </w:rPr>
+      </w:pPr>
+      <w:r>
+        <w:rPr>
+          <w:rFonts w:ascii="Times New Roman" w:hAnsi="Times New Roman" w:cs="Times New Roman"/>
+          <w:sz w:val="24"/>
+          <w:szCs w:val="24"/>
+        </w:rPr>
+        <w:t xml:space="preserve">Overall, the project illustrates how </w:t>
+      </w:r>
+      <w:proofErr w:type="spellStart"/>
+      <w:r>
+        <w:rPr>
+          <w:rFonts w:ascii="Times New Roman" w:hAnsi="Times New Roman" w:cs="Times New Roman"/>
+          <w:sz w:val="24"/>
+          <w:szCs w:val="24"/>
+        </w:rPr>
+        <w:t>MLOps</w:t>
+      </w:r>
+      <w:proofErr w:type="spellEnd"/>
+      <w:r>
+        <w:rPr>
+          <w:rFonts w:ascii="Times New Roman" w:hAnsi="Times New Roman" w:cs="Times New Roman"/>
+          <w:sz w:val="24"/>
+          <w:szCs w:val="24"/>
+        </w:rPr>
+        <w:t xml:space="preserve"> techniques can be used to improve retail forecasting and inventory management in a practical environment.</w:t>
+      </w:r>
+      <w:r>
+        <w:rPr>
+          <w:rFonts w:ascii="Times New Roman" w:hAnsi="Times New Roman" w:cs="Times New Roman"/>
+          <w:b/>
+          <w:sz w:val="24"/>
+          <w:szCs w:val="24"/>
+        </w:rPr>
+        <w:br w:type="page"/>
+      </w:r>
+    </w:p>
+    <w:p>
+      <w:pPr>
+        <w:pStyle w:val="NormalWeb"/>
+        <w:rPr>
+          <w:b/>
+        </w:rPr>
+      </w:pPr>
+      <w:r>
+        <w:rPr>
+          <w:b/>
         </w:rPr>
         <w:lastRenderedPageBreak/>
         <w:t>References</w:t>
@@ -4559,13 +5596,23 @@
           <w:szCs w:val="24"/>
         </w:rPr>
       </w:pPr>
-      <w:r>
-        <w:rPr>
-          <w:rFonts w:ascii="Times New Roman" w:hAnsi="Times New Roman" w:cs="Times New Roman"/>
-          <w:sz w:val="24"/>
-          <w:szCs w:val="24"/>
-        </w:rPr>
-        <w:t>Kreuzberger, D., Kühl, N., &amp; Hirschl, S. (2023). Machine Learning Operations (MLOps): Overview, Definition, and Architecture. IEEE Access, 11, 31866–31879.</w:t>
+      <w:proofErr w:type="spellStart"/>
+      <w:r>
+        <w:rPr>
+          <w:rFonts w:ascii="Times New Roman" w:hAnsi="Times New Roman" w:cs="Times New Roman"/>
+          <w:sz w:val="24"/>
+          <w:szCs w:val="24"/>
+        </w:rPr>
+        <w:t>Kreuzberger</w:t>
+      </w:r>
+      <w:proofErr w:type="spellEnd"/>
+      <w:r>
+        <w:rPr>
+          <w:rFonts w:ascii="Times New Roman" w:hAnsi="Times New Roman" w:cs="Times New Roman"/>
+          <w:sz w:val="24"/>
+          <w:szCs w:val="24"/>
+        </w:rPr>
+        <w:t>, D., Kühl, N., &amp; Hirschl, S. (2023). Machine Learning Operations (MLOps): Overview, Definition, and Architecture. IEEE Access, 11, 31866–31879.</w:t>
       </w:r>
     </w:p>
     <w:p>
@@ -4593,13 +5640,59 @@
           <w:szCs w:val="24"/>
         </w:rPr>
       </w:pPr>
-      <w:r>
-        <w:rPr>
-          <w:rFonts w:ascii="Times New Roman" w:hAnsi="Times New Roman" w:cs="Times New Roman"/>
-          <w:sz w:val="24"/>
-          <w:szCs w:val="24"/>
-        </w:rPr>
-        <w:t>Zha, D., Bhat, Z. P., Lai, K.-H., et al. (2025). Data-centric Artificial Intelligence: A Survey. ACM Computing Surveys, 57(5), Article 129.</w:t>
+      <w:proofErr w:type="spellStart"/>
+      <w:r>
+        <w:rPr>
+          <w:rFonts w:ascii="Times New Roman" w:hAnsi="Times New Roman" w:cs="Times New Roman"/>
+          <w:sz w:val="24"/>
+          <w:szCs w:val="24"/>
+        </w:rPr>
+        <w:t>Zha</w:t>
+      </w:r>
+      <w:proofErr w:type="spellEnd"/>
+      <w:r>
+        <w:rPr>
+          <w:rFonts w:ascii="Times New Roman" w:hAnsi="Times New Roman" w:cs="Times New Roman"/>
+          <w:sz w:val="24"/>
+          <w:szCs w:val="24"/>
+        </w:rPr>
+        <w:t>, D., Bhat, Z. P., Lai, K.-H., et al. (2025). Data-centric Artificial Intelligence: A Survey. ACM Computing Surveys, 57(5), Article 129.</w:t>
+      </w:r>
+    </w:p>
+    <w:p>
+      <w:pPr>
+        <w:spacing w:after="0" w:line="240" w:lineRule="auto"/>
+        <w:rPr>
+          <w:rFonts w:ascii="Times New Roman" w:eastAsia="Times New Roman" w:hAnsi="Times New Roman" w:cs="Times New Roman"/>
+          <w:sz w:val="24"/>
+          <w:szCs w:val="24"/>
+        </w:rPr>
+      </w:pPr>
+      <w:r>
+        <w:rPr>
+          <w:rFonts w:ascii="Times New Roman" w:eastAsia="Times New Roman" w:hAnsi="Times New Roman" w:cs="Times New Roman"/>
+          <w:sz w:val="24"/>
+          <w:szCs w:val="24"/>
+        </w:rPr>
+        <w:t xml:space="preserve">Walmart Recruiting. (2014). Walmart Store Sales Forecasting Dataset. </w:t>
+      </w:r>
+      <w:proofErr w:type="spellStart"/>
+      <w:r>
+        <w:rPr>
+          <w:rFonts w:ascii="Times New Roman" w:eastAsia="Times New Roman" w:hAnsi="Times New Roman" w:cs="Times New Roman"/>
+          <w:sz w:val="24"/>
+          <w:szCs w:val="24"/>
+        </w:rPr>
+        <w:t>Kaggle</w:t>
+      </w:r>
+      <w:proofErr w:type="spellEnd"/>
+      <w:r>
+        <w:rPr>
+          <w:rFonts w:ascii="Times New Roman" w:eastAsia="Times New Roman" w:hAnsi="Times New Roman" w:cs="Times New Roman"/>
+          <w:sz w:val="24"/>
+          <w:szCs w:val="24"/>
+        </w:rPr>
+        <w:t>. https://www.kaggle.com/competitions/walmart-recruiting-store-sales-forecasting</w:t>
       </w:r>
     </w:p>
     <w:sectPr>
@@ -4786,6 +5879,155 @@
     </w:lvl>
   </w:abstractNum>
   <w:abstractNum w:abstractNumId="9" w15:restartNumberingAfterBreak="0">
+    <w:nsid w:val="0368682B"/>
+    <w:multiLevelType w:val="multilevel"/>
+    <w:tmpl w:val="0D3AD5FE"/>
+    <w:lvl w:ilvl="0">
+      <w:start w:val="1"/>
+      <w:numFmt w:val="bullet"/>
+      <w:lvlText w:val=""/>
+      <w:lvlJc w:val="left"/>
+      <w:pPr>
+        <w:tabs>
+          <w:tab w:val="num" w:pos="720"/>
+        </w:tabs>
+        <w:ind w:left="720" w:hanging="360"/>
+      </w:pPr>
+      <w:rPr>
+        <w:rFonts w:ascii="Symbol" w:hAnsi="Symbol" w:hint="default"/>
+        <w:sz w:val="20"/>
+      </w:rPr>
+    </w:lvl>
+    <w:lvl w:ilvl="1" w:tentative="1">
+      <w:start w:val="1"/>
+      <w:numFmt w:val="bullet"/>
+      <w:lvlText w:val="o"/>
+      <w:lvlJc w:val="left"/>
+      <w:pPr>
+        <w:tabs>
+          <w:tab w:val="num" w:pos="1440"/>
+        </w:tabs>
+        <w:ind w:left="1440" w:hanging="360"/>
+      </w:pPr>
+      <w:rPr>
+        <w:rFonts w:ascii="Courier New" w:hAnsi="Courier New" w:hint="default"/>
+        <w:sz w:val="20"/>
+      </w:rPr>
+    </w:lvl>
+    <w:lvl w:ilvl="2" w:tentative="1">
+      <w:start w:val="1"/>
+      <w:numFmt w:val="bullet"/>
+      <w:lvlText w:val=""/>
+      <w:lvlJc w:val="left"/>
+      <w:pPr>
+        <w:tabs>
+          <w:tab w:val="num" w:pos="2160"/>
+        </w:tabs>
+        <w:ind w:left="2160" w:hanging="360"/>
+      </w:pPr>
+      <w:rPr>
+        <w:rFonts w:ascii="Wingdings" w:hAnsi="Wingdings" w:hint="default"/>
+        <w:sz w:val="20"/>
+      </w:rPr>
+    </w:lvl>
+    <w:lvl w:ilvl="3" w:tentative="1">
+      <w:start w:val="1"/>
+      <w:numFmt w:val="bullet"/>
+      <w:lvlText w:val=""/>
+      <w:lvlJc w:val="left"/>
+      <w:pPr>
+        <w:tabs>
+          <w:tab w:val="num" w:pos="2880"/>
+        </w:tabs>
+        <w:ind w:left="2880" w:hanging="360"/>
+      </w:pPr>
+      <w:rPr>
+        <w:rFonts w:ascii="Wingdings" w:hAnsi="Wingdings" w:hint="default"/>
+        <w:sz w:val="20"/>
+      </w:rPr>
+    </w:lvl>
+    <w:lvl w:ilvl="4" w:tentative="1">
+      <w:start w:val="1"/>
+      <w:numFmt w:val="bullet"/>
+      <w:lvlText w:val=""/>
+      <w:lvlJc w:val="left"/>
+      <w:pPr>
+        <w:tabs>
+          <w:tab w:val="num" w:pos="3600"/>
+        </w:tabs>
+        <w:ind w:left="3600" w:hanging="360"/>
+      </w:pPr>
+      <w:rPr>
+        <w:rFonts w:ascii="Wingdings" w:hAnsi="Wingdings" w:hint="default"/>
+        <w:sz w:val="20"/>
+      </w:rPr>
+    </w:lvl>
+    <w:lvl w:ilvl="5" w:tentative="1">
+      <w:start w:val="1"/>
+      <w:numFmt w:val="bullet"/>
+      <w:lvlText w:val=""/>
+      <w:lvlJc w:val="left"/>
+      <w:pPr>
+        <w:tabs>
+          <w:tab w:val="num" w:pos="4320"/>
+        </w:tabs>
+        <w:ind w:left="4320" w:hanging="360"/>
+      </w:pPr>
+      <w:rPr>
+        <w:rFonts w:ascii="Wingdings" w:hAnsi="Wingdings" w:hint="default"/>
+        <w:sz w:val="20"/>
+      </w:rPr>
+    </w:lvl>
+    <w:lvl w:ilvl="6" w:tentative="1">
+      <w:start w:val="1"/>
+      <w:numFmt w:val="bullet"/>
+      <w:lvlText w:val=""/>
+      <w:lvlJc w:val="left"/>
+      <w:pPr>
+        <w:tabs>
+          <w:tab w:val="num" w:pos="5040"/>
+        </w:tabs>
+        <w:ind w:left="5040" w:hanging="360"/>
+      </w:pPr>
+      <w:rPr>
+        <w:rFonts w:ascii="Wingdings" w:hAnsi="Wingdings" w:hint="default"/>
+        <w:sz w:val="20"/>
+      </w:rPr>
+    </w:lvl>
+    <w:lvl w:ilvl="7" w:tentative="1">
+      <w:start w:val="1"/>
+      <w:numFmt w:val="bullet"/>
+      <w:lvlText w:val=""/>
+      <w:lvlJc w:val="left"/>
+      <w:pPr>
+        <w:tabs>
+          <w:tab w:val="num" w:pos="5760"/>
+        </w:tabs>
+        <w:ind w:left="5760" w:hanging="360"/>
+      </w:pPr>
+      <w:rPr>
+        <w:rFonts w:ascii="Wingdings" w:hAnsi="Wingdings" w:hint="default"/>
+        <w:sz w:val="20"/>
+      </w:rPr>
+    </w:lvl>
+    <w:lvl w:ilvl="8" w:tentative="1">
+      <w:start w:val="1"/>
+      <w:numFmt w:val="bullet"/>
+      <w:lvlText w:val=""/>
+      <w:lvlJc w:val="left"/>
+      <w:pPr>
+        <w:tabs>
+          <w:tab w:val="num" w:pos="6480"/>
+        </w:tabs>
+        <w:ind w:left="6480" w:hanging="360"/>
+      </w:pPr>
+      <w:rPr>
+        <w:rFonts w:ascii="Wingdings" w:hAnsi="Wingdings" w:hint="default"/>
+        <w:sz w:val="20"/>
+      </w:rPr>
+    </w:lvl>
+  </w:abstractNum>
+  <w:abstractNum w:abstractNumId="10" w15:restartNumberingAfterBreak="0">
     <w:nsid w:val="26EC5F13"/>
     <w:multiLevelType w:val="multilevel"/>
     <w:tmpl w:val="65D059BE"/>
@@ -4926,6 +6168,9 @@
     <w:abstractNumId w:val="0"/>
   </w:num>
   <w:num w:numId="10">
+    <w:abstractNumId w:val="10"/>
+  </w:num>
+  <w:num w:numId="11">
     <w:abstractNumId w:val="9"/>
   </w:num>
 </w:numbering>
@@ -16675,7 +17920,7 @@
 </file>
 
 <file path=customXml/itemProps1.xml><?xml version="1.0" encoding="utf-8"?>
-<ds:datastoreItem xmlns:ds="http://schemas.openxmlformats.org/officeDocument/2006/customXml" ds:itemID="{DA5E6EF2-D23D-4E52-BB5F-F694AC50F0F8}">
+<ds:datastoreItem xmlns:ds="http://schemas.openxmlformats.org/officeDocument/2006/customXml" ds:itemID="{497B45D8-AD92-4807-B60D-0D741B7064F1}">
   <ds:schemaRefs>
     <ds:schemaRef ds:uri="http://schemas.openxmlformats.org/officeDocument/2006/bibliography"/>
   </ds:schemaRefs>

</xml_diff>